<commit_message>
docx: 진척 관리 update #6
</commit_message>
<xml_diff>
--- a/진척 관리.docx
+++ b/진척 관리.docx
@@ -333,25 +333,21 @@
               <w:autoSpaceDE/>
               <w:autoSpaceDN/>
               <w:rPr>
-                <w:sz w:val="20"/>
-                <w:szCs w:val="20"/>
-              </w:rPr>
-            </w:pPr>
-            <w:r>
-              <w:rPr>
-                <w:rFonts w:hint="eastAsia"/>
-                <w:sz w:val="20"/>
-                <w:szCs w:val="20"/>
-              </w:rPr>
-              <w:t>Player Class</w:t>
-            </w:r>
-            <w:r>
-              <w:rPr>
-                <w:rFonts w:hint="eastAsia"/>
-                <w:sz w:val="20"/>
-                <w:szCs w:val="20"/>
-              </w:rPr>
-              <w:t xml:space="preserve"> 생성</w:t>
+                <w:b/>
+                <w:bCs/>
+                <w:sz w:val="20"/>
+                <w:szCs w:val="20"/>
+              </w:rPr>
+            </w:pPr>
+            <w:r>
+              <w:rPr>
+                <w:rFonts w:hint="eastAsia"/>
+                <w:b/>
+                <w:bCs/>
+                <w:sz w:val="20"/>
+                <w:szCs w:val="20"/>
+              </w:rPr>
+              <w:t>Player Class 생성</w:t>
             </w:r>
           </w:p>
         </w:tc>
@@ -451,6 +447,8 @@
               <w:autoSpaceDE/>
               <w:autoSpaceDN/>
               <w:rPr>
+                <w:b/>
+                <w:bCs/>
                 <w:sz w:val="20"/>
                 <w:szCs w:val="20"/>
               </w:rPr>
@@ -459,6 +457,8 @@
             <w:r>
               <w:rPr>
                 <w:rFonts w:hint="eastAsia"/>
+                <w:b/>
+                <w:bCs/>
                 <w:sz w:val="20"/>
                 <w:szCs w:val="20"/>
               </w:rPr>
@@ -3696,6 +3696,8 @@
               <w:autoSpaceDE/>
               <w:autoSpaceDN/>
               <w:rPr>
+                <w:b/>
+                <w:bCs/>
                 <w:sz w:val="16"/>
                 <w:szCs w:val="16"/>
               </w:rPr>
@@ -3704,6 +3706,8 @@
             <w:r>
               <w:rPr>
                 <w:rFonts w:hint="eastAsia"/>
+                <w:b/>
+                <w:bCs/>
                 <w:sz w:val="16"/>
                 <w:szCs w:val="16"/>
               </w:rPr>
@@ -3713,6 +3717,8 @@
             <w:r>
               <w:rPr>
                 <w:rFonts w:hint="eastAsia"/>
+                <w:b/>
+                <w:bCs/>
                 <w:sz w:val="16"/>
                 <w:szCs w:val="16"/>
               </w:rPr>
@@ -3726,13 +3732,17 @@
               <w:autoSpaceDE/>
               <w:autoSpaceDN/>
               <w:rPr>
-                <w:sz w:val="16"/>
-                <w:szCs w:val="16"/>
-              </w:rPr>
-            </w:pPr>
-            <w:r>
-              <w:rPr>
-                <w:rFonts w:hint="eastAsia"/>
+                <w:b/>
+                <w:bCs/>
+                <w:sz w:val="16"/>
+                <w:szCs w:val="16"/>
+              </w:rPr>
+            </w:pPr>
+            <w:r>
+              <w:rPr>
+                <w:rFonts w:hint="eastAsia"/>
+                <w:b/>
+                <w:bCs/>
                 <w:sz w:val="16"/>
                 <w:szCs w:val="16"/>
               </w:rPr>
@@ -3742,6 +3752,8 @@
             <w:r>
               <w:rPr>
                 <w:rFonts w:hint="eastAsia"/>
+                <w:b/>
+                <w:bCs/>
                 <w:sz w:val="16"/>
                 <w:szCs w:val="16"/>
               </w:rPr>
@@ -3751,6 +3763,61 @@
             <w:r>
               <w:rPr>
                 <w:rFonts w:hint="eastAsia"/>
+                <w:b/>
+                <w:bCs/>
+                <w:sz w:val="16"/>
+                <w:szCs w:val="16"/>
+              </w:rPr>
+              <w:t>)</w:t>
+            </w:r>
+          </w:p>
+          <w:p>
+            <w:pPr>
+              <w:widowControl/>
+              <w:wordWrap/>
+              <w:autoSpaceDE/>
+              <w:autoSpaceDN/>
+              <w:rPr>
+                <w:sz w:val="16"/>
+                <w:szCs w:val="16"/>
+              </w:rPr>
+            </w:pPr>
+            <w:r>
+              <w:rPr>
+                <w:b/>
+                <w:bCs/>
+                <w:sz w:val="16"/>
+                <w:szCs w:val="16"/>
+              </w:rPr>
+              <w:t>S</w:t>
+            </w:r>
+            <w:r>
+              <w:rPr>
+                <w:rFonts w:hint="eastAsia"/>
+                <w:b/>
+                <w:bCs/>
+                <w:sz w:val="16"/>
+                <w:szCs w:val="16"/>
+              </w:rPr>
+              <w:t xml:space="preserve">erver </w:t>
+            </w:r>
+            <w:proofErr w:type="gramStart"/>
+            <w:r>
+              <w:rPr>
+                <w:rFonts w:hint="eastAsia"/>
+                <w:b/>
+                <w:bCs/>
+                <w:sz w:val="16"/>
+                <w:szCs w:val="16"/>
+              </w:rPr>
+              <w:t>main(</w:t>
+            </w:r>
+            <w:proofErr w:type="gramEnd"/>
+            <w:r>
+              <w:rPr>
+                <w:rFonts w:hint="eastAsia"/>
+                <w:b/>
+                <w:bCs/>
                 <w:sz w:val="16"/>
                 <w:szCs w:val="16"/>
               </w:rPr>
@@ -4015,39 +4082,6 @@
                 <w:szCs w:val="16"/>
               </w:rPr>
             </w:pPr>
-            <w:r>
-              <w:rPr>
-                <w:sz w:val="16"/>
-                <w:szCs w:val="16"/>
-              </w:rPr>
-              <w:t>S</w:t>
-            </w:r>
-            <w:r>
-              <w:rPr>
-                <w:rFonts w:hint="eastAsia"/>
-                <w:sz w:val="16"/>
-                <w:szCs w:val="16"/>
-              </w:rPr>
-              <w:t xml:space="preserve">erver </w:t>
-            </w:r>
-            <w:proofErr w:type="gramStart"/>
-            <w:r>
-              <w:rPr>
-                <w:rFonts w:hint="eastAsia"/>
-                <w:sz w:val="16"/>
-                <w:szCs w:val="16"/>
-              </w:rPr>
-              <w:t>main(</w:t>
-            </w:r>
-            <w:proofErr w:type="gramEnd"/>
-            <w:r>
-              <w:rPr>
-                <w:rFonts w:hint="eastAsia"/>
-                <w:sz w:val="16"/>
-                <w:szCs w:val="16"/>
-              </w:rPr>
-              <w:t>)</w:t>
-            </w:r>
           </w:p>
         </w:tc>
         <w:tc>

</xml_diff>

<commit_message>
docx : update 진척 관리.docx
</commit_message>
<xml_diff>
--- a/진척 관리.docx
+++ b/진척 관리.docx
@@ -1,6 +1,6 @@
 
 <file path=word/document.xml><?xml version="1.0" encoding="utf-8"?>
-<w:document xmlns:wpc="http://schemas.microsoft.com/office/word/2010/wordprocessingCanvas" xmlns:cx="http://schemas.microsoft.com/office/drawing/2014/chartex" xmlns:cx1="http://schemas.microsoft.com/office/drawing/2015/9/8/chartex" xmlns:cx2="http://schemas.microsoft.com/office/drawing/2015/10/21/chartex" xmlns:cx3="http://schemas.microsoft.com/office/drawing/2016/5/9/chartex" xmlns:cx4="http://schemas.microsoft.com/office/drawing/2016/5/10/chartex" xmlns:cx5="http://schemas.microsoft.com/office/drawing/2016/5/11/chartex" xmlns:cx6="http://schemas.microsoft.com/office/drawing/2016/5/12/chartex" xmlns:cx7="http://schemas.microsoft.com/office/drawing/2016/5/13/chartex" xmlns:cx8="http://schemas.microsoft.com/office/drawing/2016/5/14/chartex" xmlns:mc="http://schemas.openxmlformats.org/markup-compatibility/2006" xmlns:aink="http://schemas.microsoft.com/office/drawing/2016/ink" xmlns:am3d="http://schemas.microsoft.com/office/drawing/2017/model3d" xmlns:o="urn:schemas-microsoft-com:office:office" xmlns:oel="http://schemas.microsoft.com/office/2019/extlst" xmlns:r="http://schemas.openxmlformats.org/officeDocument/2006/relationships" xmlns:m="http://schemas.openxmlformats.org/officeDocument/2006/math" xmlns:v="urn:schemas-microsoft-com:vml" xmlns:wp14="http://schemas.microsoft.com/office/word/2010/wordprocessingDrawing" xmlns:wp="http://schemas.openxmlformats.org/drawingml/2006/wordprocessingDrawing" xmlns:w10="urn:schemas-microsoft-com:office:word" xmlns:w="http://schemas.openxmlformats.org/wordprocessingml/2006/main" xmlns:w14="http://schemas.microsoft.com/office/word/2010/wordml" xmlns:w15="http://schemas.microsoft.com/office/word/2012/wordml" xmlns:w16cex="http://schemas.microsoft.com/office/word/2018/wordml/cex" xmlns:w16cid="http://schemas.microsoft.com/office/word/2016/wordml/cid" xmlns:w16="http://schemas.microsoft.com/office/word/2018/wordml" xmlns:w16du="http://schemas.microsoft.com/office/word/2023/wordml/word16du" xmlns:w16sdtdh="http://schemas.microsoft.com/office/word/2020/wordml/sdtdatahash" xmlns:w16sdtfl="http://schemas.microsoft.com/office/word/2024/wordml/sdtformatlock" xmlns:w16se="http://schemas.microsoft.com/office/word/2015/wordml/symex" xmlns:wpg="http://schemas.microsoft.com/office/word/2010/wordprocessingGroup" xmlns:wpi="http://schemas.microsoft.com/office/word/2010/wordprocessingInk" xmlns:wne="http://schemas.microsoft.com/office/word/2006/wordml" xmlns:wps="http://schemas.microsoft.com/office/word/2010/wordprocessingShape" mc:Ignorable="w14 w15 w16se w16cid w16 w16cex w16sdtdh w16sdtfl w16du wp14">
+<w:document xmlns:wpc="http://schemas.microsoft.com/office/word/2010/wordprocessingCanvas" xmlns:cx="http://schemas.microsoft.com/office/drawing/2014/chartex" xmlns:cx1="http://schemas.microsoft.com/office/drawing/2015/9/8/chartex" xmlns:cx2="http://schemas.microsoft.com/office/drawing/2015/10/21/chartex" xmlns:cx3="http://schemas.microsoft.com/office/drawing/2016/5/9/chartex" xmlns:cx4="http://schemas.microsoft.com/office/drawing/2016/5/10/chartex" xmlns:cx5="http://schemas.microsoft.com/office/drawing/2016/5/11/chartex" xmlns:cx6="http://schemas.microsoft.com/office/drawing/2016/5/12/chartex" xmlns:cx7="http://schemas.microsoft.com/office/drawing/2016/5/13/chartex" xmlns:cx8="http://schemas.microsoft.com/office/drawing/2016/5/14/chartex" xmlns:mc="http://schemas.openxmlformats.org/markup-compatibility/2006" xmlns:aink="http://schemas.microsoft.com/office/drawing/2016/ink" xmlns:am3d="http://schemas.microsoft.com/office/drawing/2017/model3d" xmlns:o="urn:schemas-microsoft-com:office:office" xmlns:oel="http://schemas.microsoft.com/office/2019/extlst" xmlns:r="http://schemas.openxmlformats.org/officeDocument/2006/relationships" xmlns:m="http://schemas.openxmlformats.org/officeDocument/2006/math" xmlns:v="urn:schemas-microsoft-com:vml" xmlns:wp14="http://schemas.microsoft.com/office/word/2010/wordprocessingDrawing" xmlns:wp="http://schemas.openxmlformats.org/drawingml/2006/wordprocessingDrawing" xmlns:w10="urn:schemas-microsoft-com:office:word" xmlns:w="http://schemas.openxmlformats.org/wordprocessingml/2006/main" xmlns:w14="http://schemas.microsoft.com/office/word/2010/wordml" xmlns:w15="http://schemas.microsoft.com/office/word/2012/wordml" xmlns:w16cex="http://schemas.microsoft.com/office/word/2018/wordml/cex" xmlns:w16cid="http://schemas.microsoft.com/office/word/2016/wordml/cid" xmlns:w16="http://schemas.microsoft.com/office/word/2018/wordml" xmlns:w16sdtdh="http://schemas.microsoft.com/office/word/2020/wordml/sdtdatahash" xmlns:w16se="http://schemas.microsoft.com/office/word/2015/wordml/symex" xmlns:wpg="http://schemas.microsoft.com/office/word/2010/wordprocessingGroup" xmlns:wpi="http://schemas.microsoft.com/office/word/2010/wordprocessingInk" xmlns:wne="http://schemas.microsoft.com/office/word/2006/wordml" xmlns:wps="http://schemas.microsoft.com/office/word/2010/wordprocessingShape" mc:Ignorable="w14 w15 w16se w16cid w16 w16cex w16sdtdh wp14">
   <w:body>
     <w:p>
       <w:pPr>
@@ -565,15 +565,7 @@
                 <w:sz w:val="20"/>
                 <w:szCs w:val="20"/>
               </w:rPr>
-              <w:t>recv_</w:t>
-            </w:r>
-            <w:proofErr w:type="gramStart"/>
-            <w:r>
-              <w:rPr>
-                <w:sz w:val="20"/>
-                <w:szCs w:val="20"/>
-              </w:rPr>
-              <w:t>packet</w:t>
+              <w:t>recv_packet</w:t>
             </w:r>
             <w:proofErr w:type="spellEnd"/>
             <w:r>
@@ -581,15 +573,7 @@
                 <w:sz w:val="20"/>
                 <w:szCs w:val="20"/>
               </w:rPr>
-              <w:t>(</w:t>
-            </w:r>
-            <w:proofErr w:type="gramEnd"/>
-            <w:r>
-              <w:rPr>
-                <w:sz w:val="20"/>
-                <w:szCs w:val="20"/>
-              </w:rPr>
-              <w:t>);</w:t>
+              <w:t>();</w:t>
             </w:r>
           </w:p>
         </w:tc>
@@ -699,15 +683,7 @@
                 <w:sz w:val="20"/>
                 <w:szCs w:val="20"/>
               </w:rPr>
-              <w:t>_</w:t>
-            </w:r>
-            <w:proofErr w:type="gramStart"/>
-            <w:r>
-              <w:rPr>
-                <w:sz w:val="20"/>
-                <w:szCs w:val="20"/>
-              </w:rPr>
-              <w:t>packet</w:t>
+              <w:t>_packet</w:t>
             </w:r>
             <w:proofErr w:type="spellEnd"/>
             <w:r>
@@ -715,15 +691,7 @@
                 <w:sz w:val="20"/>
                 <w:szCs w:val="20"/>
               </w:rPr>
-              <w:t>(</w:t>
-            </w:r>
-            <w:proofErr w:type="gramEnd"/>
-            <w:r>
-              <w:rPr>
-                <w:sz w:val="20"/>
-                <w:szCs w:val="20"/>
-              </w:rPr>
-              <w:t>);</w:t>
+              <w:t>();</w:t>
             </w:r>
           </w:p>
         </w:tc>
@@ -846,9 +814,17 @@
                 <w:sz w:val="20"/>
                 <w:szCs w:val="20"/>
               </w:rPr>
-              <w:t>();</w:t>
+              <w:t>(</w:t>
             </w:r>
             <w:proofErr w:type="gramEnd"/>
+            <w:r>
+              <w:rPr>
+                <w:rFonts w:eastAsiaTheme="minorHAnsi"/>
+                <w:sz w:val="20"/>
+                <w:szCs w:val="20"/>
+              </w:rPr>
+              <w:t>);</w:t>
+            </w:r>
           </w:p>
           <w:p>
             <w:pPr>
@@ -1048,7 +1024,6 @@
               <w:t>target_id</w:t>
             </w:r>
             <w:proofErr w:type="spellEnd"/>
-            <w:proofErr w:type="gramStart"/>
             <w:r>
               <w:rPr>
                 <w:rFonts w:eastAsiaTheme="minorHAnsi"/>
@@ -1057,7 +1032,6 @@
               </w:rPr>
               <w:t>);</w:t>
             </w:r>
-            <w:proofErr w:type="gramEnd"/>
           </w:p>
           <w:p>
             <w:pPr>
@@ -2632,7 +2606,7 @@
                 <w:sz w:val="20"/>
                 <w:szCs w:val="20"/>
               </w:rPr>
-              <w:t>::Init(</w:t>
+              <w:t>::</w:t>
             </w:r>
             <w:proofErr w:type="gramEnd"/>
             <w:r>
@@ -2640,7 +2614,7 @@
                 <w:sz w:val="20"/>
                 <w:szCs w:val="20"/>
               </w:rPr>
-              <w:t>)</w:t>
+              <w:t>Init()</w:t>
             </w:r>
           </w:p>
           <w:p>
@@ -2672,6 +2646,7 @@
               <w:t>::</w:t>
             </w:r>
             <w:proofErr w:type="spellStart"/>
+            <w:proofErr w:type="gramEnd"/>
             <w:r>
               <w:rPr>
                 <w:sz w:val="20"/>
@@ -2685,15 +2660,7 @@
                 <w:sz w:val="20"/>
                 <w:szCs w:val="20"/>
               </w:rPr>
-              <w:t>(</w:t>
-            </w:r>
-            <w:proofErr w:type="gramEnd"/>
-            <w:r>
-              <w:rPr>
-                <w:sz w:val="20"/>
-                <w:szCs w:val="20"/>
-              </w:rPr>
-              <w:t>)</w:t>
+              <w:t>()</w:t>
             </w:r>
           </w:p>
         </w:tc>
@@ -3811,30 +3778,21 @@
               <w:autoSpaceDE/>
               <w:autoSpaceDN/>
               <w:rPr>
-                <w:sz w:val="16"/>
-                <w:szCs w:val="16"/>
-              </w:rPr>
-            </w:pPr>
-            <w:r>
-              <w:rPr>
                 <w:b/>
                 <w:bCs/>
                 <w:sz w:val="16"/>
                 <w:szCs w:val="16"/>
               </w:rPr>
-              <w:t>S</w:t>
-            </w:r>
-            <w:r>
-              <w:rPr>
-                <w:rFonts w:hint="eastAsia"/>
+            </w:pPr>
+            <w:r>
+              <w:rPr>
                 <w:b/>
                 <w:bCs/>
                 <w:sz w:val="16"/>
                 <w:szCs w:val="16"/>
               </w:rPr>
-              <w:t xml:space="preserve">erver </w:t>
-            </w:r>
-            <w:proofErr w:type="gramStart"/>
+              <w:t>S</w:t>
+            </w:r>
             <w:r>
               <w:rPr>
                 <w:rFonts w:hint="eastAsia"/>
@@ -3843,9 +3801,9 @@
                 <w:sz w:val="16"/>
                 <w:szCs w:val="16"/>
               </w:rPr>
-              <w:t>main(</w:t>
-            </w:r>
-            <w:proofErr w:type="gramEnd"/>
+              <w:t xml:space="preserve">erver </w:t>
+            </w:r>
+            <w:proofErr w:type="gramStart"/>
             <w:r>
               <w:rPr>
                 <w:rFonts w:hint="eastAsia"/>
@@ -3854,7 +3812,52 @@
                 <w:sz w:val="16"/>
                 <w:szCs w:val="16"/>
               </w:rPr>
+              <w:t>main(</w:t>
+            </w:r>
+            <w:proofErr w:type="gramEnd"/>
+            <w:r>
+              <w:rPr>
+                <w:rFonts w:hint="eastAsia"/>
+                <w:b/>
+                <w:bCs/>
+                <w:sz w:val="16"/>
+                <w:szCs w:val="16"/>
+              </w:rPr>
               <w:t>)</w:t>
+            </w:r>
+          </w:p>
+          <w:p>
+            <w:pPr>
+              <w:widowControl/>
+              <w:wordWrap/>
+              <w:autoSpaceDE/>
+              <w:autoSpaceDN/>
+              <w:rPr>
+                <w:rFonts w:hint="eastAsia"/>
+                <w:b/>
+                <w:bCs/>
+                <w:sz w:val="16"/>
+                <w:szCs w:val="16"/>
+              </w:rPr>
+            </w:pPr>
+            <w:r>
+              <w:rPr>
+                <w:b/>
+                <w:bCs/>
+                <w:sz w:val="16"/>
+                <w:szCs w:val="16"/>
+              </w:rPr>
+              <w:t>C</w:t>
+            </w:r>
+            <w:r>
+              <w:rPr>
+                <w:rFonts w:hint="eastAsia"/>
+                <w:b/>
+                <w:bCs/>
+                <w:sz w:val="16"/>
+                <w:szCs w:val="16"/>
+              </w:rPr>
+              <w:t>lient thread 생성 로직</w:t>
             </w:r>
           </w:p>
         </w:tc>
@@ -3963,6 +3966,8 @@
             <w:r>
               <w:rPr>
                 <w:rFonts w:hint="eastAsia"/>
+                <w:b/>
+                <w:bCs/>
                 <w:color w:val="8E0000"/>
                 <w:sz w:val="16"/>
                 <w:szCs w:val="16"/>
@@ -4022,15 +4027,7 @@
                 <w:sz w:val="16"/>
                 <w:szCs w:val="16"/>
               </w:rPr>
-              <w:t>recv_</w:t>
-            </w:r>
-            <w:proofErr w:type="gramStart"/>
-            <w:r>
-              <w:rPr>
-                <w:sz w:val="16"/>
-                <w:szCs w:val="16"/>
-              </w:rPr>
-              <w:t>packet</w:t>
+              <w:t>recv_packet</w:t>
             </w:r>
             <w:proofErr w:type="spellEnd"/>
             <w:r>
@@ -4040,7 +4037,6 @@
               </w:rPr>
               <w:t>();</w:t>
             </w:r>
-            <w:proofErr w:type="gramEnd"/>
           </w:p>
           <w:p>
             <w:pPr>
@@ -4077,15 +4073,7 @@
                 <w:sz w:val="16"/>
                 <w:szCs w:val="16"/>
               </w:rPr>
-              <w:t>_</w:t>
-            </w:r>
-            <w:proofErr w:type="gramStart"/>
-            <w:r>
-              <w:rPr>
-                <w:sz w:val="16"/>
-                <w:szCs w:val="16"/>
-              </w:rPr>
-              <w:t>packet</w:t>
+              <w:t>_packet</w:t>
             </w:r>
             <w:proofErr w:type="spellEnd"/>
             <w:r>
@@ -4093,15 +4081,7 @@
                 <w:sz w:val="16"/>
                 <w:szCs w:val="16"/>
               </w:rPr>
-              <w:t>(</w:t>
-            </w:r>
-            <w:proofErr w:type="gramEnd"/>
-            <w:r>
-              <w:rPr>
-                <w:sz w:val="16"/>
-                <w:szCs w:val="16"/>
-              </w:rPr>
-              <w:t>);</w:t>
+              <w:t>();</w:t>
             </w:r>
           </w:p>
         </w:tc>
@@ -4236,33 +4216,6 @@
                 <w:szCs w:val="16"/>
               </w:rPr>
               <w:t>6</w:t>
-            </w:r>
-          </w:p>
-          <w:p>
-            <w:pPr>
-              <w:widowControl/>
-              <w:wordWrap/>
-              <w:autoSpaceDE/>
-              <w:autoSpaceDN/>
-              <w:rPr>
-                <w:sz w:val="16"/>
-                <w:szCs w:val="16"/>
-              </w:rPr>
-            </w:pPr>
-            <w:r>
-              <w:rPr>
-                <w:sz w:val="16"/>
-                <w:szCs w:val="16"/>
-              </w:rPr>
-              <w:t>C</w:t>
-            </w:r>
-            <w:r>
-              <w:rPr>
-                <w:rFonts w:hint="eastAsia"/>
-                <w:sz w:val="16"/>
-                <w:szCs w:val="16"/>
-              </w:rPr>
-              <w:t>lient thread 생성 로직</w:t>
             </w:r>
           </w:p>
           <w:p>
@@ -4537,7 +4490,6 @@
               <w:t>target_id</w:t>
             </w:r>
             <w:proofErr w:type="spellEnd"/>
-            <w:proofErr w:type="gramStart"/>
             <w:r>
               <w:rPr>
                 <w:rFonts w:eastAsiaTheme="minorHAnsi"/>
@@ -4546,7 +4498,6 @@
               </w:rPr>
               <w:t>);</w:t>
             </w:r>
-            <w:proofErr w:type="gramEnd"/>
           </w:p>
           <w:p>
             <w:pPr>
@@ -6220,13 +6171,13 @@
         <w:tblLook w:val="04A0" w:firstRow="1" w:lastRow="0" w:firstColumn="1" w:lastColumn="0" w:noHBand="0" w:noVBand="1"/>
       </w:tblPr>
       <w:tblGrid>
-        <w:gridCol w:w="1703"/>
-        <w:gridCol w:w="1759"/>
-        <w:gridCol w:w="1703"/>
-        <w:gridCol w:w="1703"/>
-        <w:gridCol w:w="1800"/>
-        <w:gridCol w:w="1703"/>
-        <w:gridCol w:w="545"/>
+        <w:gridCol w:w="1706"/>
+        <w:gridCol w:w="1739"/>
+        <w:gridCol w:w="1707"/>
+        <w:gridCol w:w="1707"/>
+        <w:gridCol w:w="1804"/>
+        <w:gridCol w:w="1707"/>
+        <w:gridCol w:w="546"/>
       </w:tblGrid>
       <w:tr>
         <w:trPr>
@@ -9429,6 +9380,7 @@
               <w:t>::</w:t>
             </w:r>
             <w:proofErr w:type="spellStart"/>
+            <w:proofErr w:type="gramEnd"/>
             <w:r>
               <w:rPr>
                 <w:rFonts w:hint="eastAsia"/>
@@ -9448,9 +9400,8 @@
                 <w:sz w:val="16"/>
                 <w:szCs w:val="16"/>
               </w:rPr>
-              <w:t>(</w:t>
-            </w:r>
-            <w:proofErr w:type="gramEnd"/>
+              <w:t>()</w:t>
+            </w:r>
             <w:r>
               <w:rPr>
                 <w:rFonts w:hint="eastAsia"/>
@@ -9459,32 +9410,45 @@
                 <w:sz w:val="16"/>
                 <w:szCs w:val="16"/>
               </w:rPr>
-              <w:t>)</w:t>
-            </w:r>
-            <w:r>
-              <w:rPr>
-                <w:rFonts w:hint="eastAsia"/>
+              <w:t>,</w:t>
+            </w:r>
+          </w:p>
+          <w:p>
+            <w:pPr>
+              <w:widowControl/>
+              <w:wordWrap/>
+              <w:autoSpaceDE/>
+              <w:rPr>
                 <w:b/>
                 <w:bCs/>
                 <w:sz w:val="16"/>
                 <w:szCs w:val="16"/>
               </w:rPr>
-              <w:t>,</w:t>
-            </w:r>
-          </w:p>
-          <w:p>
-            <w:pPr>
-              <w:widowControl/>
-              <w:wordWrap/>
-              <w:autoSpaceDE/>
-              <w:rPr>
+            </w:pPr>
+            <w:proofErr w:type="spellStart"/>
+            <w:r>
+              <w:rPr>
+                <w:rFonts w:hint="eastAsia"/>
                 <w:b/>
                 <w:bCs/>
                 <w:sz w:val="16"/>
                 <w:szCs w:val="16"/>
               </w:rPr>
-            </w:pPr>
-            <w:proofErr w:type="spellStart"/>
+              <w:t>NetworkMgr</w:t>
+            </w:r>
+            <w:proofErr w:type="spellEnd"/>
+          </w:p>
+          <w:p>
+            <w:pPr>
+              <w:widowControl/>
+              <w:wordWrap/>
+              <w:autoSpaceDE/>
+              <w:rPr>
+                <w:sz w:val="16"/>
+                <w:szCs w:val="16"/>
+              </w:rPr>
+            </w:pPr>
+            <w:proofErr w:type="gramStart"/>
             <w:r>
               <w:rPr>
                 <w:rFonts w:hint="eastAsia"/>
@@ -9493,21 +9457,9 @@
                 <w:sz w:val="16"/>
                 <w:szCs w:val="16"/>
               </w:rPr>
-              <w:t>NetworkMgr</w:t>
-            </w:r>
-            <w:proofErr w:type="spellEnd"/>
-          </w:p>
-          <w:p>
-            <w:pPr>
-              <w:widowControl/>
-              <w:wordWrap/>
-              <w:autoSpaceDE/>
-              <w:rPr>
-                <w:sz w:val="16"/>
-                <w:szCs w:val="16"/>
-              </w:rPr>
-            </w:pPr>
-            <w:proofErr w:type="gramStart"/>
+              <w:t>::</w:t>
+            </w:r>
+            <w:proofErr w:type="gramEnd"/>
             <w:r>
               <w:rPr>
                 <w:rFonts w:hint="eastAsia"/>
@@ -9516,18 +9468,7 @@
                 <w:sz w:val="16"/>
                 <w:szCs w:val="16"/>
               </w:rPr>
-              <w:t>::Init(</w:t>
-            </w:r>
-            <w:proofErr w:type="gramEnd"/>
-            <w:r>
-              <w:rPr>
-                <w:rFonts w:hint="eastAsia"/>
-                <w:b/>
-                <w:bCs/>
-                <w:sz w:val="16"/>
-                <w:szCs w:val="16"/>
-              </w:rPr>
-              <w:t>)</w:t>
+              <w:t>Init()</w:t>
             </w:r>
           </w:p>
         </w:tc>
@@ -9671,7 +9612,6 @@
               <w:wordWrap/>
               <w:autoSpaceDE/>
               <w:rPr>
-                <w:rFonts w:hint="eastAsia"/>
                 <w:b/>
                 <w:bCs/>
                 <w:sz w:val="16"/>
@@ -9727,7 +9667,6 @@
               <w:wordWrap/>
               <w:autoSpaceDE/>
               <w:rPr>
-                <w:rFonts w:hint="eastAsia"/>
                 <w:b/>
                 <w:bCs/>
                 <w:sz w:val="16"/>
@@ -11719,9 +11658,17 @@
                 <w:sz w:val="16"/>
                 <w:szCs w:val="16"/>
               </w:rPr>
-              <w:t>();</w:t>
+              <w:t>(</w:t>
             </w:r>
             <w:proofErr w:type="gramEnd"/>
+            <w:r>
+              <w:rPr>
+                <w:rFonts w:hint="eastAsia"/>
+                <w:sz w:val="16"/>
+                <w:szCs w:val="16"/>
+              </w:rPr>
+              <w:t>);</w:t>
+            </w:r>
           </w:p>
           <w:p>
             <w:pPr>
@@ -12543,7 +12490,7 @@
 </file>
 
 <file path=word/endnotes.xml><?xml version="1.0" encoding="utf-8"?>
-<w:endnotes xmlns:wpc="http://schemas.microsoft.com/office/word/2010/wordprocessingCanvas" xmlns:cx="http://schemas.microsoft.com/office/drawing/2014/chartex" xmlns:cx1="http://schemas.microsoft.com/office/drawing/2015/9/8/chartex" xmlns:cx2="http://schemas.microsoft.com/office/drawing/2015/10/21/chartex" xmlns:cx3="http://schemas.microsoft.com/office/drawing/2016/5/9/chartex" xmlns:cx4="http://schemas.microsoft.com/office/drawing/2016/5/10/chartex" xmlns:cx5="http://schemas.microsoft.com/office/drawing/2016/5/11/chartex" xmlns:cx6="http://schemas.microsoft.com/office/drawing/2016/5/12/chartex" xmlns:cx7="http://schemas.microsoft.com/office/drawing/2016/5/13/chartex" xmlns:cx8="http://schemas.microsoft.com/office/drawing/2016/5/14/chartex" xmlns:mc="http://schemas.openxmlformats.org/markup-compatibility/2006" xmlns:aink="http://schemas.microsoft.com/office/drawing/2016/ink" xmlns:am3d="http://schemas.microsoft.com/office/drawing/2017/model3d" xmlns:o="urn:schemas-microsoft-com:office:office" xmlns:oel="http://schemas.microsoft.com/office/2019/extlst" xmlns:r="http://schemas.openxmlformats.org/officeDocument/2006/relationships" xmlns:m="http://schemas.openxmlformats.org/officeDocument/2006/math" xmlns:v="urn:schemas-microsoft-com:vml" xmlns:wp14="http://schemas.microsoft.com/office/word/2010/wordprocessingDrawing" xmlns:wp="http://schemas.openxmlformats.org/drawingml/2006/wordprocessingDrawing" xmlns:w10="urn:schemas-microsoft-com:office:word" xmlns:w="http://schemas.openxmlformats.org/wordprocessingml/2006/main" xmlns:w14="http://schemas.microsoft.com/office/word/2010/wordml" xmlns:w15="http://schemas.microsoft.com/office/word/2012/wordml" xmlns:w16cex="http://schemas.microsoft.com/office/word/2018/wordml/cex" xmlns:w16cid="http://schemas.microsoft.com/office/word/2016/wordml/cid" xmlns:w16="http://schemas.microsoft.com/office/word/2018/wordml" xmlns:w16du="http://schemas.microsoft.com/office/word/2023/wordml/word16du" xmlns:w16sdtdh="http://schemas.microsoft.com/office/word/2020/wordml/sdtdatahash" xmlns:w16sdtfl="http://schemas.microsoft.com/office/word/2024/wordml/sdtformatlock" xmlns:w16se="http://schemas.microsoft.com/office/word/2015/wordml/symex" xmlns:wpg="http://schemas.microsoft.com/office/word/2010/wordprocessingGroup" xmlns:wpi="http://schemas.microsoft.com/office/word/2010/wordprocessingInk" xmlns:wne="http://schemas.microsoft.com/office/word/2006/wordml" xmlns:wps="http://schemas.microsoft.com/office/word/2010/wordprocessingShape" mc:Ignorable="w14 w15 w16se w16cid w16 w16cex w16sdtdh w16sdtfl w16du wp14">
+<w:endnotes xmlns:wpc="http://schemas.microsoft.com/office/word/2010/wordprocessingCanvas" xmlns:cx="http://schemas.microsoft.com/office/drawing/2014/chartex" xmlns:cx1="http://schemas.microsoft.com/office/drawing/2015/9/8/chartex" xmlns:cx2="http://schemas.microsoft.com/office/drawing/2015/10/21/chartex" xmlns:cx3="http://schemas.microsoft.com/office/drawing/2016/5/9/chartex" xmlns:cx4="http://schemas.microsoft.com/office/drawing/2016/5/10/chartex" xmlns:cx5="http://schemas.microsoft.com/office/drawing/2016/5/11/chartex" xmlns:cx6="http://schemas.microsoft.com/office/drawing/2016/5/12/chartex" xmlns:cx7="http://schemas.microsoft.com/office/drawing/2016/5/13/chartex" xmlns:cx8="http://schemas.microsoft.com/office/drawing/2016/5/14/chartex" xmlns:mc="http://schemas.openxmlformats.org/markup-compatibility/2006" xmlns:aink="http://schemas.microsoft.com/office/drawing/2016/ink" xmlns:am3d="http://schemas.microsoft.com/office/drawing/2017/model3d" xmlns:o="urn:schemas-microsoft-com:office:office" xmlns:oel="http://schemas.microsoft.com/office/2019/extlst" xmlns:r="http://schemas.openxmlformats.org/officeDocument/2006/relationships" xmlns:m="http://schemas.openxmlformats.org/officeDocument/2006/math" xmlns:v="urn:schemas-microsoft-com:vml" xmlns:wp14="http://schemas.microsoft.com/office/word/2010/wordprocessingDrawing" xmlns:wp="http://schemas.openxmlformats.org/drawingml/2006/wordprocessingDrawing" xmlns:w10="urn:schemas-microsoft-com:office:word" xmlns:w="http://schemas.openxmlformats.org/wordprocessingml/2006/main" xmlns:w14="http://schemas.microsoft.com/office/word/2010/wordml" xmlns:w15="http://schemas.microsoft.com/office/word/2012/wordml" xmlns:w16cex="http://schemas.microsoft.com/office/word/2018/wordml/cex" xmlns:w16cid="http://schemas.microsoft.com/office/word/2016/wordml/cid" xmlns:w16="http://schemas.microsoft.com/office/word/2018/wordml" xmlns:w16sdtdh="http://schemas.microsoft.com/office/word/2020/wordml/sdtdatahash" xmlns:w16se="http://schemas.microsoft.com/office/word/2015/wordml/symex" xmlns:wpg="http://schemas.microsoft.com/office/word/2010/wordprocessingGroup" xmlns:wpi="http://schemas.microsoft.com/office/word/2010/wordprocessingInk" xmlns:wne="http://schemas.microsoft.com/office/word/2006/wordml" xmlns:wps="http://schemas.microsoft.com/office/word/2010/wordprocessingShape" mc:Ignorable="w14 w15 w16se w16cid w16 w16cex w16sdtdh wp14">
   <w:endnote w:type="separator" w:id="-1">
     <w:p>
       <w:pPr>
@@ -12568,7 +12515,7 @@
 </file>
 
 <file path=word/footer1.xml><?xml version="1.0" encoding="utf-8"?>
-<w:ftr xmlns:wpc="http://schemas.microsoft.com/office/word/2010/wordprocessingCanvas" xmlns:cx="http://schemas.microsoft.com/office/drawing/2014/chartex" xmlns:cx1="http://schemas.microsoft.com/office/drawing/2015/9/8/chartex" xmlns:cx2="http://schemas.microsoft.com/office/drawing/2015/10/21/chartex" xmlns:cx3="http://schemas.microsoft.com/office/drawing/2016/5/9/chartex" xmlns:cx4="http://schemas.microsoft.com/office/drawing/2016/5/10/chartex" xmlns:cx5="http://schemas.microsoft.com/office/drawing/2016/5/11/chartex" xmlns:cx6="http://schemas.microsoft.com/office/drawing/2016/5/12/chartex" xmlns:cx7="http://schemas.microsoft.com/office/drawing/2016/5/13/chartex" xmlns:cx8="http://schemas.microsoft.com/office/drawing/2016/5/14/chartex" xmlns:mc="http://schemas.openxmlformats.org/markup-compatibility/2006" xmlns:aink="http://schemas.microsoft.com/office/drawing/2016/ink" xmlns:am3d="http://schemas.microsoft.com/office/drawing/2017/model3d" xmlns:o="urn:schemas-microsoft-com:office:office" xmlns:oel="http://schemas.microsoft.com/office/2019/extlst" xmlns:r="http://schemas.openxmlformats.org/officeDocument/2006/relationships" xmlns:m="http://schemas.openxmlformats.org/officeDocument/2006/math" xmlns:v="urn:schemas-microsoft-com:vml" xmlns:wp14="http://schemas.microsoft.com/office/word/2010/wordprocessingDrawing" xmlns:wp="http://schemas.openxmlformats.org/drawingml/2006/wordprocessingDrawing" xmlns:w10="urn:schemas-microsoft-com:office:word" xmlns:w="http://schemas.openxmlformats.org/wordprocessingml/2006/main" xmlns:w14="http://schemas.microsoft.com/office/word/2010/wordml" xmlns:w15="http://schemas.microsoft.com/office/word/2012/wordml" xmlns:w16cex="http://schemas.microsoft.com/office/word/2018/wordml/cex" xmlns:w16cid="http://schemas.microsoft.com/office/word/2016/wordml/cid" xmlns:w16="http://schemas.microsoft.com/office/word/2018/wordml" xmlns:w16du="http://schemas.microsoft.com/office/word/2023/wordml/word16du" xmlns:w16sdtdh="http://schemas.microsoft.com/office/word/2020/wordml/sdtdatahash" xmlns:w16sdtfl="http://schemas.microsoft.com/office/word/2024/wordml/sdtformatlock" xmlns:w16se="http://schemas.microsoft.com/office/word/2015/wordml/symex" xmlns:wpg="http://schemas.microsoft.com/office/word/2010/wordprocessingGroup" xmlns:wpi="http://schemas.microsoft.com/office/word/2010/wordprocessingInk" xmlns:wne="http://schemas.microsoft.com/office/word/2006/wordml" xmlns:wps="http://schemas.microsoft.com/office/word/2010/wordprocessingShape" mc:Ignorable="w14 w15 w16se w16cid w16 w16cex w16sdtdh w16sdtfl w16du wp14">
+<w:ftr xmlns:wpc="http://schemas.microsoft.com/office/word/2010/wordprocessingCanvas" xmlns:cx="http://schemas.microsoft.com/office/drawing/2014/chartex" xmlns:cx1="http://schemas.microsoft.com/office/drawing/2015/9/8/chartex" xmlns:cx2="http://schemas.microsoft.com/office/drawing/2015/10/21/chartex" xmlns:cx3="http://schemas.microsoft.com/office/drawing/2016/5/9/chartex" xmlns:cx4="http://schemas.microsoft.com/office/drawing/2016/5/10/chartex" xmlns:cx5="http://schemas.microsoft.com/office/drawing/2016/5/11/chartex" xmlns:cx6="http://schemas.microsoft.com/office/drawing/2016/5/12/chartex" xmlns:cx7="http://schemas.microsoft.com/office/drawing/2016/5/13/chartex" xmlns:cx8="http://schemas.microsoft.com/office/drawing/2016/5/14/chartex" xmlns:mc="http://schemas.openxmlformats.org/markup-compatibility/2006" xmlns:aink="http://schemas.microsoft.com/office/drawing/2016/ink" xmlns:am3d="http://schemas.microsoft.com/office/drawing/2017/model3d" xmlns:o="urn:schemas-microsoft-com:office:office" xmlns:oel="http://schemas.microsoft.com/office/2019/extlst" xmlns:r="http://schemas.openxmlformats.org/officeDocument/2006/relationships" xmlns:m="http://schemas.openxmlformats.org/officeDocument/2006/math" xmlns:v="urn:schemas-microsoft-com:vml" xmlns:wp14="http://schemas.microsoft.com/office/word/2010/wordprocessingDrawing" xmlns:wp="http://schemas.openxmlformats.org/drawingml/2006/wordprocessingDrawing" xmlns:w10="urn:schemas-microsoft-com:office:word" xmlns:w="http://schemas.openxmlformats.org/wordprocessingml/2006/main" xmlns:w14="http://schemas.microsoft.com/office/word/2010/wordml" xmlns:w15="http://schemas.microsoft.com/office/word/2012/wordml" xmlns:w16cex="http://schemas.microsoft.com/office/word/2018/wordml/cex" xmlns:w16cid="http://schemas.microsoft.com/office/word/2016/wordml/cid" xmlns:w16="http://schemas.microsoft.com/office/word/2018/wordml" xmlns:w16sdtdh="http://schemas.microsoft.com/office/word/2020/wordml/sdtdatahash" xmlns:w16se="http://schemas.microsoft.com/office/word/2015/wordml/symex" xmlns:wpg="http://schemas.microsoft.com/office/word/2010/wordprocessingGroup" xmlns:wpi="http://schemas.microsoft.com/office/word/2010/wordprocessingInk" xmlns:wne="http://schemas.microsoft.com/office/word/2006/wordml" xmlns:wps="http://schemas.microsoft.com/office/word/2010/wordprocessingShape" mc:Ignorable="w14 w15 w16se w16cid w16 w16cex w16sdtdh wp14">
   <w:sdt>
     <w:sdtPr>
       <w:id w:val="1471174885"/>
@@ -12613,7 +12560,7 @@
 </file>
 
 <file path=word/footnotes.xml><?xml version="1.0" encoding="utf-8"?>
-<w:footnotes xmlns:wpc="http://schemas.microsoft.com/office/word/2010/wordprocessingCanvas" xmlns:cx="http://schemas.microsoft.com/office/drawing/2014/chartex" xmlns:cx1="http://schemas.microsoft.com/office/drawing/2015/9/8/chartex" xmlns:cx2="http://schemas.microsoft.com/office/drawing/2015/10/21/chartex" xmlns:cx3="http://schemas.microsoft.com/office/drawing/2016/5/9/chartex" xmlns:cx4="http://schemas.microsoft.com/office/drawing/2016/5/10/chartex" xmlns:cx5="http://schemas.microsoft.com/office/drawing/2016/5/11/chartex" xmlns:cx6="http://schemas.microsoft.com/office/drawing/2016/5/12/chartex" xmlns:cx7="http://schemas.microsoft.com/office/drawing/2016/5/13/chartex" xmlns:cx8="http://schemas.microsoft.com/office/drawing/2016/5/14/chartex" xmlns:mc="http://schemas.openxmlformats.org/markup-compatibility/2006" xmlns:aink="http://schemas.microsoft.com/office/drawing/2016/ink" xmlns:am3d="http://schemas.microsoft.com/office/drawing/2017/model3d" xmlns:o="urn:schemas-microsoft-com:office:office" xmlns:oel="http://schemas.microsoft.com/office/2019/extlst" xmlns:r="http://schemas.openxmlformats.org/officeDocument/2006/relationships" xmlns:m="http://schemas.openxmlformats.org/officeDocument/2006/math" xmlns:v="urn:schemas-microsoft-com:vml" xmlns:wp14="http://schemas.microsoft.com/office/word/2010/wordprocessingDrawing" xmlns:wp="http://schemas.openxmlformats.org/drawingml/2006/wordprocessingDrawing" xmlns:w10="urn:schemas-microsoft-com:office:word" xmlns:w="http://schemas.openxmlformats.org/wordprocessingml/2006/main" xmlns:w14="http://schemas.microsoft.com/office/word/2010/wordml" xmlns:w15="http://schemas.microsoft.com/office/word/2012/wordml" xmlns:w16cex="http://schemas.microsoft.com/office/word/2018/wordml/cex" xmlns:w16cid="http://schemas.microsoft.com/office/word/2016/wordml/cid" xmlns:w16="http://schemas.microsoft.com/office/word/2018/wordml" xmlns:w16du="http://schemas.microsoft.com/office/word/2023/wordml/word16du" xmlns:w16sdtdh="http://schemas.microsoft.com/office/word/2020/wordml/sdtdatahash" xmlns:w16sdtfl="http://schemas.microsoft.com/office/word/2024/wordml/sdtformatlock" xmlns:w16se="http://schemas.microsoft.com/office/word/2015/wordml/symex" xmlns:wpg="http://schemas.microsoft.com/office/word/2010/wordprocessingGroup" xmlns:wpi="http://schemas.microsoft.com/office/word/2010/wordprocessingInk" xmlns:wne="http://schemas.microsoft.com/office/word/2006/wordml" xmlns:wps="http://schemas.microsoft.com/office/word/2010/wordprocessingShape" mc:Ignorable="w14 w15 w16se w16cid w16 w16cex w16sdtdh w16sdtfl w16du wp14">
+<w:footnotes xmlns:wpc="http://schemas.microsoft.com/office/word/2010/wordprocessingCanvas" xmlns:cx="http://schemas.microsoft.com/office/drawing/2014/chartex" xmlns:cx1="http://schemas.microsoft.com/office/drawing/2015/9/8/chartex" xmlns:cx2="http://schemas.microsoft.com/office/drawing/2015/10/21/chartex" xmlns:cx3="http://schemas.microsoft.com/office/drawing/2016/5/9/chartex" xmlns:cx4="http://schemas.microsoft.com/office/drawing/2016/5/10/chartex" xmlns:cx5="http://schemas.microsoft.com/office/drawing/2016/5/11/chartex" xmlns:cx6="http://schemas.microsoft.com/office/drawing/2016/5/12/chartex" xmlns:cx7="http://schemas.microsoft.com/office/drawing/2016/5/13/chartex" xmlns:cx8="http://schemas.microsoft.com/office/drawing/2016/5/14/chartex" xmlns:mc="http://schemas.openxmlformats.org/markup-compatibility/2006" xmlns:aink="http://schemas.microsoft.com/office/drawing/2016/ink" xmlns:am3d="http://schemas.microsoft.com/office/drawing/2017/model3d" xmlns:o="urn:schemas-microsoft-com:office:office" xmlns:oel="http://schemas.microsoft.com/office/2019/extlst" xmlns:r="http://schemas.openxmlformats.org/officeDocument/2006/relationships" xmlns:m="http://schemas.openxmlformats.org/officeDocument/2006/math" xmlns:v="urn:schemas-microsoft-com:vml" xmlns:wp14="http://schemas.microsoft.com/office/word/2010/wordprocessingDrawing" xmlns:wp="http://schemas.openxmlformats.org/drawingml/2006/wordprocessingDrawing" xmlns:w10="urn:schemas-microsoft-com:office:word" xmlns:w="http://schemas.openxmlformats.org/wordprocessingml/2006/main" xmlns:w14="http://schemas.microsoft.com/office/word/2010/wordml" xmlns:w15="http://schemas.microsoft.com/office/word/2012/wordml" xmlns:w16cex="http://schemas.microsoft.com/office/word/2018/wordml/cex" xmlns:w16cid="http://schemas.microsoft.com/office/word/2016/wordml/cid" xmlns:w16="http://schemas.microsoft.com/office/word/2018/wordml" xmlns:w16sdtdh="http://schemas.microsoft.com/office/word/2020/wordml/sdtdatahash" xmlns:w16se="http://schemas.microsoft.com/office/word/2015/wordml/symex" xmlns:wpg="http://schemas.microsoft.com/office/word/2010/wordprocessingGroup" xmlns:wpi="http://schemas.microsoft.com/office/word/2010/wordprocessingInk" xmlns:wne="http://schemas.microsoft.com/office/word/2006/wordml" xmlns:wps="http://schemas.microsoft.com/office/word/2010/wordprocessingShape" mc:Ignorable="w14 w15 w16se w16cid w16 w16cex w16sdtdh wp14">
   <w:footnote w:type="separator" w:id="-1">
     <w:p>
       <w:pPr>
@@ -12638,7 +12585,7 @@
 </file>
 
 <file path=word/numbering.xml><?xml version="1.0" encoding="utf-8"?>
-<w:numbering xmlns:wpc="http://schemas.microsoft.com/office/word/2010/wordprocessingCanvas" xmlns:cx="http://schemas.microsoft.com/office/drawing/2014/chartex" xmlns:cx1="http://schemas.microsoft.com/office/drawing/2015/9/8/chartex" xmlns:cx2="http://schemas.microsoft.com/office/drawing/2015/10/21/chartex" xmlns:cx3="http://schemas.microsoft.com/office/drawing/2016/5/9/chartex" xmlns:cx4="http://schemas.microsoft.com/office/drawing/2016/5/10/chartex" xmlns:cx5="http://schemas.microsoft.com/office/drawing/2016/5/11/chartex" xmlns:cx6="http://schemas.microsoft.com/office/drawing/2016/5/12/chartex" xmlns:cx7="http://schemas.microsoft.com/office/drawing/2016/5/13/chartex" xmlns:cx8="http://schemas.microsoft.com/office/drawing/2016/5/14/chartex" xmlns:mc="http://schemas.openxmlformats.org/markup-compatibility/2006" xmlns:aink="http://schemas.microsoft.com/office/drawing/2016/ink" xmlns:am3d="http://schemas.microsoft.com/office/drawing/2017/model3d" xmlns:o="urn:schemas-microsoft-com:office:office" xmlns:oel="http://schemas.microsoft.com/office/2019/extlst" xmlns:r="http://schemas.openxmlformats.org/officeDocument/2006/relationships" xmlns:m="http://schemas.openxmlformats.org/officeDocument/2006/math" xmlns:v="urn:schemas-microsoft-com:vml" xmlns:wp14="http://schemas.microsoft.com/office/word/2010/wordprocessingDrawing" xmlns:wp="http://schemas.openxmlformats.org/drawingml/2006/wordprocessingDrawing" xmlns:w10="urn:schemas-microsoft-com:office:word" xmlns:w="http://schemas.openxmlformats.org/wordprocessingml/2006/main" xmlns:w14="http://schemas.microsoft.com/office/word/2010/wordml" xmlns:w15="http://schemas.microsoft.com/office/word/2012/wordml" xmlns:w16cex="http://schemas.microsoft.com/office/word/2018/wordml/cex" xmlns:w16cid="http://schemas.microsoft.com/office/word/2016/wordml/cid" xmlns:w16="http://schemas.microsoft.com/office/word/2018/wordml" xmlns:w16du="http://schemas.microsoft.com/office/word/2023/wordml/word16du" xmlns:w16sdtdh="http://schemas.microsoft.com/office/word/2020/wordml/sdtdatahash" xmlns:w16sdtfl="http://schemas.microsoft.com/office/word/2024/wordml/sdtformatlock" xmlns:w16se="http://schemas.microsoft.com/office/word/2015/wordml/symex" xmlns:wpg="http://schemas.microsoft.com/office/word/2010/wordprocessingGroup" xmlns:wpi="http://schemas.microsoft.com/office/word/2010/wordprocessingInk" xmlns:wne="http://schemas.microsoft.com/office/word/2006/wordml" xmlns:wps="http://schemas.microsoft.com/office/word/2010/wordprocessingShape" mc:Ignorable="w14 w15 w16se w16cid w16 w16cex w16sdtdh w16sdtfl w16du wp14">
+<w:numbering xmlns:wpc="http://schemas.microsoft.com/office/word/2010/wordprocessingCanvas" xmlns:cx="http://schemas.microsoft.com/office/drawing/2014/chartex" xmlns:cx1="http://schemas.microsoft.com/office/drawing/2015/9/8/chartex" xmlns:cx2="http://schemas.microsoft.com/office/drawing/2015/10/21/chartex" xmlns:cx3="http://schemas.microsoft.com/office/drawing/2016/5/9/chartex" xmlns:cx4="http://schemas.microsoft.com/office/drawing/2016/5/10/chartex" xmlns:cx5="http://schemas.microsoft.com/office/drawing/2016/5/11/chartex" xmlns:cx6="http://schemas.microsoft.com/office/drawing/2016/5/12/chartex" xmlns:cx7="http://schemas.microsoft.com/office/drawing/2016/5/13/chartex" xmlns:cx8="http://schemas.microsoft.com/office/drawing/2016/5/14/chartex" xmlns:mc="http://schemas.openxmlformats.org/markup-compatibility/2006" xmlns:aink="http://schemas.microsoft.com/office/drawing/2016/ink" xmlns:am3d="http://schemas.microsoft.com/office/drawing/2017/model3d" xmlns:o="urn:schemas-microsoft-com:office:office" xmlns:oel="http://schemas.microsoft.com/office/2019/extlst" xmlns:r="http://schemas.openxmlformats.org/officeDocument/2006/relationships" xmlns:m="http://schemas.openxmlformats.org/officeDocument/2006/math" xmlns:v="urn:schemas-microsoft-com:vml" xmlns:wp14="http://schemas.microsoft.com/office/word/2010/wordprocessingDrawing" xmlns:wp="http://schemas.openxmlformats.org/drawingml/2006/wordprocessingDrawing" xmlns:w10="urn:schemas-microsoft-com:office:word" xmlns:w="http://schemas.openxmlformats.org/wordprocessingml/2006/main" xmlns:w14="http://schemas.microsoft.com/office/word/2010/wordml" xmlns:w15="http://schemas.microsoft.com/office/word/2012/wordml" xmlns:w16cex="http://schemas.microsoft.com/office/word/2018/wordml/cex" xmlns:w16cid="http://schemas.microsoft.com/office/word/2016/wordml/cid" xmlns:w16="http://schemas.microsoft.com/office/word/2018/wordml" xmlns:w16sdtdh="http://schemas.microsoft.com/office/word/2020/wordml/sdtdatahash" xmlns:w16se="http://schemas.microsoft.com/office/word/2015/wordml/symex" xmlns:wpg="http://schemas.microsoft.com/office/word/2010/wordprocessingGroup" xmlns:wpi="http://schemas.microsoft.com/office/word/2010/wordprocessingInk" xmlns:wne="http://schemas.microsoft.com/office/word/2006/wordml" xmlns:wps="http://schemas.microsoft.com/office/word/2010/wordprocessingShape" mc:Ignorable="w14 w15 w16se w16cid w16 w16cex w16sdtdh wp14">
   <w:abstractNum w:abstractNumId="0" w15:restartNumberingAfterBreak="0">
     <w:nsid w:val="05E96921"/>
     <w:multiLevelType w:val="hybridMultilevel"/>
@@ -14979,7 +14926,7 @@
 </file>
 
 <file path=word/styles.xml><?xml version="1.0" encoding="utf-8"?>
-<w:styles xmlns:mc="http://schemas.openxmlformats.org/markup-compatibility/2006" xmlns:r="http://schemas.openxmlformats.org/officeDocument/2006/relationships" xmlns:w="http://schemas.openxmlformats.org/wordprocessingml/2006/main" xmlns:w14="http://schemas.microsoft.com/office/word/2010/wordml" xmlns:w15="http://schemas.microsoft.com/office/word/2012/wordml" xmlns:w16cex="http://schemas.microsoft.com/office/word/2018/wordml/cex" xmlns:w16cid="http://schemas.microsoft.com/office/word/2016/wordml/cid" xmlns:w16="http://schemas.microsoft.com/office/word/2018/wordml" xmlns:w16du="http://schemas.microsoft.com/office/word/2023/wordml/word16du" xmlns:w16sdtdh="http://schemas.microsoft.com/office/word/2020/wordml/sdtdatahash" xmlns:w16sdtfl="http://schemas.microsoft.com/office/word/2024/wordml/sdtformatlock" xmlns:w16se="http://schemas.microsoft.com/office/word/2015/wordml/symex" mc:Ignorable="w14 w15 w16se w16cid w16 w16cex w16sdtdh w16sdtfl w16du">
+<w:styles xmlns:mc="http://schemas.openxmlformats.org/markup-compatibility/2006" xmlns:r="http://schemas.openxmlformats.org/officeDocument/2006/relationships" xmlns:w="http://schemas.openxmlformats.org/wordprocessingml/2006/main" xmlns:w14="http://schemas.microsoft.com/office/word/2010/wordml" xmlns:w15="http://schemas.microsoft.com/office/word/2012/wordml" xmlns:w16cex="http://schemas.microsoft.com/office/word/2018/wordml/cex" xmlns:w16cid="http://schemas.microsoft.com/office/word/2016/wordml/cid" xmlns:w16="http://schemas.microsoft.com/office/word/2018/wordml" xmlns:w16sdtdh="http://schemas.microsoft.com/office/word/2020/wordml/sdtdatahash" xmlns:w16se="http://schemas.microsoft.com/office/word/2015/wordml/symex" mc:Ignorable="w14 w15 w16se w16cid w16 w16cex w16sdtdh">
   <w:docDefaults>
     <w:rPrDefault>
       <w:rPr>
@@ -16075,7 +16022,7 @@
     <w:unhideWhenUsed/>
     <w:rsid w:val="002815C6"/>
     <w:rPr>
-      <w:rFonts w:ascii="굴림체" w:eastAsia="굴림체" w:hAnsi="굴림체" w:cs="굴림체"/>
+      <w:rFonts w:ascii="GulimChe" w:eastAsia="GulimChe" w:hAnsi="GulimChe" w:cs="GulimChe"/>
       <w:sz w:val="24"/>
       <w:szCs w:val="24"/>
     </w:rPr>

</xml_diff>

<commit_message>
docs: update 진척관리.docx #6
</commit_message>
<xml_diff>
--- a/진척 관리.docx
+++ b/진척 관리.docx
@@ -210,7 +210,6 @@
                 <w:szCs w:val="20"/>
               </w:rPr>
             </w:pPr>
-            <w:proofErr w:type="spellStart"/>
             <w:r>
               <w:rPr>
                 <w:b/>
@@ -228,18 +227,7 @@
                 <w:sz w:val="20"/>
                 <w:szCs w:val="20"/>
               </w:rPr>
-              <w:t>rotocol.h</w:t>
-            </w:r>
-            <w:proofErr w:type="spellEnd"/>
-            <w:r>
-              <w:rPr>
-                <w:rFonts w:hint="eastAsia"/>
-                <w:b/>
-                <w:bCs/>
-                <w:sz w:val="20"/>
-                <w:szCs w:val="20"/>
-              </w:rPr>
-              <w:t xml:space="preserve"> 파일 생성</w:t>
+              <w:t>rotocol.h 파일 생성</w:t>
             </w:r>
           </w:p>
         </w:tc>
@@ -414,25 +402,7 @@
                 <w:sz w:val="20"/>
                 <w:szCs w:val="20"/>
               </w:rPr>
-              <w:t xml:space="preserve">메인 함수 및 </w:t>
-            </w:r>
-            <w:proofErr w:type="spellStart"/>
-            <w:r>
-              <w:rPr>
-                <w:rFonts w:hint="eastAsia"/>
-                <w:sz w:val="20"/>
-                <w:szCs w:val="20"/>
-              </w:rPr>
-              <w:t>메인쓰레드</w:t>
-            </w:r>
-            <w:proofErr w:type="spellEnd"/>
-            <w:r>
-              <w:rPr>
-                <w:rFonts w:hint="eastAsia"/>
-                <w:sz w:val="20"/>
-                <w:szCs w:val="20"/>
-              </w:rPr>
-              <w:t xml:space="preserve"> 생성</w:t>
+              <w:t>메인 함수 및 메인쓰레드 생성</w:t>
             </w:r>
           </w:p>
         </w:tc>
@@ -453,7 +423,6 @@
                 <w:szCs w:val="20"/>
               </w:rPr>
             </w:pPr>
-            <w:proofErr w:type="spellStart"/>
             <w:r>
               <w:rPr>
                 <w:rFonts w:hint="eastAsia"/>
@@ -464,7 +433,6 @@
               </w:rPr>
               <w:t>ServerMain</w:t>
             </w:r>
-            <w:proofErr w:type="spellEnd"/>
           </w:p>
         </w:tc>
         <w:tc>
@@ -558,22 +526,13 @@
               </w:rPr>
               <w:t>Player::</w:t>
             </w:r>
-            <w:proofErr w:type="spellStart"/>
             <w:proofErr w:type="gramEnd"/>
             <w:r>
               <w:rPr>
                 <w:sz w:val="20"/>
                 <w:szCs w:val="20"/>
               </w:rPr>
-              <w:t>recv_packet</w:t>
-            </w:r>
-            <w:proofErr w:type="spellEnd"/>
-            <w:r>
-              <w:rPr>
-                <w:sz w:val="20"/>
-                <w:szCs w:val="20"/>
-              </w:rPr>
-              <w:t>();</w:t>
+              <w:t>recv_packet();</w:t>
             </w:r>
           </w:p>
         </w:tc>
@@ -668,7 +627,6 @@
               </w:rPr>
               <w:t>Player::</w:t>
             </w:r>
-            <w:proofErr w:type="spellStart"/>
             <w:proofErr w:type="gramEnd"/>
             <w:r>
               <w:rPr>
@@ -683,15 +641,7 @@
                 <w:sz w:val="20"/>
                 <w:szCs w:val="20"/>
               </w:rPr>
-              <w:t>_packet</w:t>
-            </w:r>
-            <w:proofErr w:type="spellEnd"/>
-            <w:r>
-              <w:rPr>
-                <w:sz w:val="20"/>
-                <w:szCs w:val="20"/>
-              </w:rPr>
-              <w:t>();</w:t>
+              <w:t>_packet();</w:t>
             </w:r>
           </w:p>
         </w:tc>
@@ -787,16 +737,46 @@
                 <w:sz w:val="20"/>
                 <w:szCs w:val="20"/>
               </w:rPr>
-              <w:t xml:space="preserve">void </w:t>
-            </w:r>
-            <w:proofErr w:type="spellStart"/>
+              <w:t>void send_playerInfo_</w:t>
+            </w:r>
+            <w:proofErr w:type="gramStart"/>
             <w:r>
               <w:rPr>
                 <w:rFonts w:eastAsiaTheme="minorHAnsi"/>
                 <w:sz w:val="20"/>
                 <w:szCs w:val="20"/>
               </w:rPr>
-              <w:t>send_playerInfo_</w:t>
+              <w:t>packet(</w:t>
+            </w:r>
+            <w:proofErr w:type="gramEnd"/>
+            <w:r>
+              <w:rPr>
+                <w:rFonts w:eastAsiaTheme="minorHAnsi"/>
+                <w:sz w:val="20"/>
+                <w:szCs w:val="20"/>
+              </w:rPr>
+              <w:t>);</w:t>
+            </w:r>
+          </w:p>
+          <w:p>
+            <w:pPr>
+              <w:widowControl/>
+              <w:wordWrap/>
+              <w:autoSpaceDE/>
+              <w:autoSpaceDN/>
+              <w:rPr>
+                <w:rFonts w:eastAsiaTheme="minorHAnsi"/>
+                <w:sz w:val="20"/>
+                <w:szCs w:val="20"/>
+              </w:rPr>
+            </w:pPr>
+            <w:r>
+              <w:rPr>
+                <w:rFonts w:eastAsiaTheme="minorHAnsi"/>
+                <w:sz w:val="20"/>
+                <w:szCs w:val="20"/>
+              </w:rPr>
+              <w:t>void send_login_fail_</w:t>
             </w:r>
             <w:proofErr w:type="gramStart"/>
             <w:r>
@@ -805,73 +785,7 @@
                 <w:sz w:val="20"/>
                 <w:szCs w:val="20"/>
               </w:rPr>
-              <w:t>packet</w:t>
-            </w:r>
-            <w:proofErr w:type="spellEnd"/>
-            <w:r>
-              <w:rPr>
-                <w:rFonts w:eastAsiaTheme="minorHAnsi"/>
-                <w:sz w:val="20"/>
-                <w:szCs w:val="20"/>
-              </w:rPr>
-              <w:t>(</w:t>
-            </w:r>
-            <w:proofErr w:type="gramEnd"/>
-            <w:r>
-              <w:rPr>
-                <w:rFonts w:eastAsiaTheme="minorHAnsi"/>
-                <w:sz w:val="20"/>
-                <w:szCs w:val="20"/>
-              </w:rPr>
-              <w:t>);</w:t>
-            </w:r>
-          </w:p>
-          <w:p>
-            <w:pPr>
-              <w:widowControl/>
-              <w:wordWrap/>
-              <w:autoSpaceDE/>
-              <w:autoSpaceDN/>
-              <w:rPr>
-                <w:rFonts w:eastAsiaTheme="minorHAnsi"/>
-                <w:sz w:val="20"/>
-                <w:szCs w:val="20"/>
-              </w:rPr>
-            </w:pPr>
-            <w:r>
-              <w:rPr>
-                <w:rFonts w:eastAsiaTheme="minorHAnsi"/>
-                <w:sz w:val="20"/>
-                <w:szCs w:val="20"/>
-              </w:rPr>
-              <w:t xml:space="preserve">void </w:t>
-            </w:r>
-            <w:proofErr w:type="spellStart"/>
-            <w:r>
-              <w:rPr>
-                <w:rFonts w:eastAsiaTheme="minorHAnsi"/>
-                <w:sz w:val="20"/>
-                <w:szCs w:val="20"/>
-              </w:rPr>
-              <w:t>send_login_fail_</w:t>
-            </w:r>
-            <w:proofErr w:type="gramStart"/>
-            <w:r>
-              <w:rPr>
-                <w:rFonts w:eastAsiaTheme="minorHAnsi"/>
-                <w:sz w:val="20"/>
-                <w:szCs w:val="20"/>
-              </w:rPr>
-              <w:t>packet</w:t>
-            </w:r>
-            <w:proofErr w:type="spellEnd"/>
-            <w:r>
-              <w:rPr>
-                <w:rFonts w:eastAsiaTheme="minorHAnsi"/>
-                <w:sz w:val="20"/>
-                <w:szCs w:val="20"/>
-              </w:rPr>
-              <w:t>(</w:t>
+              <w:t>packet(</w:t>
             </w:r>
             <w:proofErr w:type="gramEnd"/>
             <w:r>
@@ -976,118 +890,46 @@
                 <w:sz w:val="20"/>
                 <w:szCs w:val="20"/>
               </w:rPr>
-              <w:t xml:space="preserve">void </w:t>
-            </w:r>
-            <w:proofErr w:type="spellStart"/>
+              <w:t>void send_enter_room_</w:t>
+            </w:r>
+            <w:proofErr w:type="gramStart"/>
             <w:r>
               <w:rPr>
                 <w:rFonts w:eastAsiaTheme="minorHAnsi"/>
                 <w:sz w:val="20"/>
                 <w:szCs w:val="20"/>
               </w:rPr>
-              <w:t>send_enter_room_</w:t>
-            </w:r>
-            <w:proofErr w:type="gramStart"/>
+              <w:t>packet(</w:t>
+            </w:r>
+            <w:proofErr w:type="gramEnd"/>
             <w:r>
               <w:rPr>
                 <w:rFonts w:eastAsiaTheme="minorHAnsi"/>
                 <w:sz w:val="20"/>
                 <w:szCs w:val="20"/>
               </w:rPr>
-              <w:t>packet</w:t>
-            </w:r>
-            <w:proofErr w:type="spellEnd"/>
-            <w:r>
+              <w:t>int target_id);</w:t>
+            </w:r>
+          </w:p>
+          <w:p>
+            <w:pPr>
+              <w:widowControl/>
+              <w:wordWrap/>
+              <w:autoSpaceDE/>
+              <w:autoSpaceDN/>
               <w:rPr>
                 <w:rFonts w:eastAsiaTheme="minorHAnsi"/>
                 <w:sz w:val="20"/>
                 <w:szCs w:val="20"/>
               </w:rPr>
-              <w:t>(</w:t>
-            </w:r>
-            <w:proofErr w:type="gramEnd"/>
+            </w:pPr>
             <w:r>
               <w:rPr>
                 <w:rFonts w:eastAsiaTheme="minorHAnsi"/>
                 <w:sz w:val="20"/>
                 <w:szCs w:val="20"/>
               </w:rPr>
-              <w:t xml:space="preserve">int </w:t>
-            </w:r>
-            <w:proofErr w:type="spellStart"/>
-            <w:r>
-              <w:rPr>
-                <w:rFonts w:eastAsiaTheme="minorHAnsi"/>
-                <w:sz w:val="20"/>
-                <w:szCs w:val="20"/>
-              </w:rPr>
-              <w:t>target_id</w:t>
-            </w:r>
-            <w:proofErr w:type="spellEnd"/>
-            <w:r>
-              <w:rPr>
-                <w:rFonts w:eastAsiaTheme="minorHAnsi"/>
-                <w:sz w:val="20"/>
-                <w:szCs w:val="20"/>
-              </w:rPr>
-              <w:t>);</w:t>
-            </w:r>
-          </w:p>
-          <w:p>
-            <w:pPr>
-              <w:widowControl/>
-              <w:wordWrap/>
-              <w:autoSpaceDE/>
-              <w:autoSpaceDN/>
-              <w:rPr>
-                <w:rFonts w:eastAsiaTheme="minorHAnsi"/>
-                <w:sz w:val="20"/>
-                <w:szCs w:val="20"/>
-              </w:rPr>
-            </w:pPr>
-            <w:r>
-              <w:rPr>
-                <w:rFonts w:eastAsiaTheme="minorHAnsi"/>
-                <w:sz w:val="20"/>
-                <w:szCs w:val="20"/>
-              </w:rPr>
-              <w:t xml:space="preserve">void </w:t>
-            </w:r>
-            <w:proofErr w:type="spellStart"/>
-            <w:r>
-              <w:rPr>
-                <w:rFonts w:eastAsiaTheme="minorHAnsi"/>
-                <w:sz w:val="20"/>
-                <w:szCs w:val="20"/>
-              </w:rPr>
-              <w:t>send_ready_packet</w:t>
-            </w:r>
-            <w:proofErr w:type="spellEnd"/>
-            <w:r>
-              <w:rPr>
-                <w:rFonts w:eastAsiaTheme="minorHAnsi"/>
-                <w:sz w:val="20"/>
-                <w:szCs w:val="20"/>
-              </w:rPr>
-              <w:t>(</w:t>
-            </w:r>
-            <w:proofErr w:type="spellStart"/>
-            <w:r>
-              <w:rPr>
-                <w:rFonts w:eastAsiaTheme="minorHAnsi"/>
-                <w:sz w:val="20"/>
-                <w:szCs w:val="20"/>
-              </w:rPr>
-              <w:t>target_id</w:t>
-            </w:r>
-            <w:proofErr w:type="spellEnd"/>
-            <w:r>
-              <w:rPr>
-                <w:rFonts w:eastAsiaTheme="minorHAnsi"/>
-                <w:sz w:val="20"/>
-                <w:szCs w:val="20"/>
-              </w:rPr>
-              <w:t>);</w:t>
+              <w:t>void send_ready_packet(target_id);</w:t>
             </w:r>
           </w:p>
         </w:tc>
@@ -1180,43 +1022,7 @@
                 <w:sz w:val="20"/>
                 <w:szCs w:val="20"/>
               </w:rPr>
-              <w:t xml:space="preserve">void </w:t>
-            </w:r>
-            <w:proofErr w:type="spellStart"/>
-            <w:r>
-              <w:rPr>
-                <w:rFonts w:eastAsiaTheme="minorHAnsi"/>
-                <w:sz w:val="20"/>
-                <w:szCs w:val="20"/>
-              </w:rPr>
-              <w:t>send_booster_packet</w:t>
-            </w:r>
-            <w:proofErr w:type="spellEnd"/>
-            <w:r>
-              <w:rPr>
-                <w:rFonts w:eastAsiaTheme="minorHAnsi"/>
-                <w:sz w:val="20"/>
-                <w:szCs w:val="20"/>
-              </w:rPr>
-              <w:t>(</w:t>
-            </w:r>
-            <w:proofErr w:type="spellStart"/>
-            <w:r>
-              <w:rPr>
-                <w:rFonts w:eastAsiaTheme="minorHAnsi"/>
-                <w:sz w:val="20"/>
-                <w:szCs w:val="20"/>
-              </w:rPr>
-              <w:t>target_id</w:t>
-            </w:r>
-            <w:proofErr w:type="spellEnd"/>
-            <w:r>
-              <w:rPr>
-                <w:rFonts w:eastAsiaTheme="minorHAnsi"/>
-                <w:sz w:val="20"/>
-                <w:szCs w:val="20"/>
-              </w:rPr>
-              <w:t>);</w:t>
+              <w:t>void send_booster_packet(target_id);</w:t>
             </w:r>
           </w:p>
         </w:tc>
@@ -1308,61 +1114,25 @@
                 <w:sz w:val="20"/>
                 <w:szCs w:val="20"/>
               </w:rPr>
-              <w:t xml:space="preserve">void </w:t>
-            </w:r>
-            <w:proofErr w:type="spellStart"/>
+              <w:t>void send_rank_</w:t>
+            </w:r>
+            <w:proofErr w:type="gramStart"/>
             <w:r>
               <w:rPr>
                 <w:rFonts w:eastAsiaTheme="minorHAnsi"/>
                 <w:sz w:val="20"/>
                 <w:szCs w:val="20"/>
               </w:rPr>
-              <w:t>send_rank_</w:t>
-            </w:r>
-            <w:proofErr w:type="gramStart"/>
+              <w:t>packet(</w:t>
+            </w:r>
+            <w:proofErr w:type="gramEnd"/>
             <w:r>
               <w:rPr>
                 <w:rFonts w:eastAsiaTheme="minorHAnsi"/>
                 <w:sz w:val="20"/>
                 <w:szCs w:val="20"/>
               </w:rPr>
-              <w:t>packet</w:t>
-            </w:r>
-            <w:proofErr w:type="spellEnd"/>
-            <w:r>
-              <w:rPr>
-                <w:rFonts w:eastAsiaTheme="minorHAnsi"/>
-                <w:sz w:val="20"/>
-                <w:szCs w:val="20"/>
-              </w:rPr>
-              <w:t>(</w:t>
-            </w:r>
-            <w:proofErr w:type="gramEnd"/>
-            <w:r>
-              <w:rPr>
-                <w:rFonts w:eastAsiaTheme="minorHAnsi"/>
-                <w:sz w:val="20"/>
-                <w:szCs w:val="20"/>
-              </w:rPr>
-              <w:t xml:space="preserve">int </w:t>
-            </w:r>
-            <w:proofErr w:type="spellStart"/>
-            <w:r>
-              <w:rPr>
-                <w:rFonts w:eastAsiaTheme="minorHAnsi"/>
-                <w:sz w:val="20"/>
-                <w:szCs w:val="20"/>
-              </w:rPr>
-              <w:t>target_id</w:t>
-            </w:r>
-            <w:proofErr w:type="spellEnd"/>
-            <w:r>
-              <w:rPr>
-                <w:rFonts w:eastAsiaTheme="minorHAnsi"/>
-                <w:sz w:val="20"/>
-                <w:szCs w:val="20"/>
-              </w:rPr>
-              <w:t>);</w:t>
+              <w:t>int target_id);</w:t>
             </w:r>
           </w:p>
         </w:tc>
@@ -1481,151 +1251,79 @@
                 <w:sz w:val="20"/>
                 <w:szCs w:val="20"/>
               </w:rPr>
-              <w:t xml:space="preserve">oid </w:t>
-            </w:r>
-            <w:proofErr w:type="spellStart"/>
+              <w:t>oid send_Game_Start_</w:t>
+            </w:r>
+            <w:proofErr w:type="gramStart"/>
             <w:r>
               <w:rPr>
                 <w:rFonts w:eastAsiaTheme="minorHAnsi" w:hint="eastAsia"/>
                 <w:sz w:val="20"/>
                 <w:szCs w:val="20"/>
               </w:rPr>
-              <w:t>send_Game_Start_</w:t>
+              <w:t>Packet(</w:t>
+            </w:r>
+            <w:proofErr w:type="gramEnd"/>
+            <w:r>
+              <w:rPr>
+                <w:rFonts w:eastAsiaTheme="minorHAnsi" w:hint="eastAsia"/>
+                <w:sz w:val="20"/>
+                <w:szCs w:val="20"/>
+              </w:rPr>
+              <w:t>int target_id)</w:t>
+            </w:r>
+          </w:p>
+          <w:p>
+            <w:pPr>
+              <w:widowControl/>
+              <w:wordWrap/>
+              <w:autoSpaceDE/>
+              <w:autoSpaceDN/>
+              <w:rPr>
+                <w:sz w:val="20"/>
+                <w:szCs w:val="20"/>
+              </w:rPr>
+            </w:pPr>
+            <w:r>
+              <w:rPr>
+                <w:rFonts w:eastAsiaTheme="minorHAnsi"/>
+                <w:sz w:val="20"/>
+                <w:szCs w:val="20"/>
+              </w:rPr>
+              <w:t>void send_</w:t>
+            </w:r>
+            <w:r>
+              <w:rPr>
+                <w:rFonts w:eastAsiaTheme="minorHAnsi" w:hint="eastAsia"/>
+                <w:sz w:val="20"/>
+                <w:szCs w:val="20"/>
+              </w:rPr>
+              <w:t>Finish</w:t>
+            </w:r>
+            <w:r>
+              <w:rPr>
+                <w:rFonts w:eastAsiaTheme="minorHAnsi"/>
+                <w:sz w:val="20"/>
+                <w:szCs w:val="20"/>
+              </w:rPr>
+              <w:t>_</w:t>
             </w:r>
             <w:proofErr w:type="gramStart"/>
             <w:r>
               <w:rPr>
-                <w:rFonts w:eastAsiaTheme="minorHAnsi" w:hint="eastAsia"/>
-                <w:sz w:val="20"/>
-                <w:szCs w:val="20"/>
-              </w:rPr>
-              <w:t>Packet</w:t>
-            </w:r>
-            <w:proofErr w:type="spellEnd"/>
-            <w:r>
-              <w:rPr>
-                <w:rFonts w:eastAsiaTheme="minorHAnsi" w:hint="eastAsia"/>
-                <w:sz w:val="20"/>
-                <w:szCs w:val="20"/>
-              </w:rPr>
-              <w:t>(</w:t>
+                <w:rFonts w:eastAsiaTheme="minorHAnsi"/>
+                <w:sz w:val="20"/>
+                <w:szCs w:val="20"/>
+              </w:rPr>
+              <w:t>packet(</w:t>
             </w:r>
             <w:proofErr w:type="gramEnd"/>
             <w:r>
               <w:rPr>
-                <w:rFonts w:eastAsiaTheme="minorHAnsi" w:hint="eastAsia"/>
-                <w:sz w:val="20"/>
-                <w:szCs w:val="20"/>
-              </w:rPr>
-              <w:t xml:space="preserve">int </w:t>
-            </w:r>
-            <w:proofErr w:type="spellStart"/>
-            <w:r>
-              <w:rPr>
-                <w:rFonts w:eastAsiaTheme="minorHAnsi" w:hint="eastAsia"/>
-                <w:sz w:val="20"/>
-                <w:szCs w:val="20"/>
-              </w:rPr>
-              <w:t>target_id</w:t>
-            </w:r>
-            <w:proofErr w:type="spellEnd"/>
-            <w:r>
-              <w:rPr>
-                <w:rFonts w:eastAsiaTheme="minorHAnsi" w:hint="eastAsia"/>
-                <w:sz w:val="20"/>
-                <w:szCs w:val="20"/>
-              </w:rPr>
-              <w:t>)</w:t>
-            </w:r>
-          </w:p>
-          <w:p>
-            <w:pPr>
-              <w:widowControl/>
-              <w:wordWrap/>
-              <w:autoSpaceDE/>
-              <w:autoSpaceDN/>
-              <w:rPr>
-                <w:sz w:val="20"/>
-                <w:szCs w:val="20"/>
-              </w:rPr>
-            </w:pPr>
-            <w:r>
-              <w:rPr>
                 <w:rFonts w:eastAsiaTheme="minorHAnsi"/>
                 <w:sz w:val="20"/>
                 <w:szCs w:val="20"/>
               </w:rPr>
-              <w:t xml:space="preserve">void </w:t>
-            </w:r>
-            <w:proofErr w:type="spellStart"/>
-            <w:r>
-              <w:rPr>
-                <w:rFonts w:eastAsiaTheme="minorHAnsi"/>
-                <w:sz w:val="20"/>
-                <w:szCs w:val="20"/>
-              </w:rPr>
-              <w:t>send_</w:t>
-            </w:r>
-            <w:r>
-              <w:rPr>
-                <w:rFonts w:eastAsiaTheme="minorHAnsi" w:hint="eastAsia"/>
-                <w:sz w:val="20"/>
-                <w:szCs w:val="20"/>
-              </w:rPr>
-              <w:t>Finish</w:t>
-            </w:r>
-            <w:r>
-              <w:rPr>
-                <w:rFonts w:eastAsiaTheme="minorHAnsi"/>
-                <w:sz w:val="20"/>
-                <w:szCs w:val="20"/>
-              </w:rPr>
-              <w:t>_</w:t>
-            </w:r>
-            <w:proofErr w:type="gramStart"/>
-            <w:r>
-              <w:rPr>
-                <w:rFonts w:eastAsiaTheme="minorHAnsi"/>
-                <w:sz w:val="20"/>
-                <w:szCs w:val="20"/>
-              </w:rPr>
-              <w:t>packet</w:t>
-            </w:r>
-            <w:proofErr w:type="spellEnd"/>
-            <w:r>
-              <w:rPr>
-                <w:rFonts w:eastAsiaTheme="minorHAnsi"/>
-                <w:sz w:val="20"/>
-                <w:szCs w:val="20"/>
-              </w:rPr>
-              <w:t>(</w:t>
-            </w:r>
-            <w:proofErr w:type="gramEnd"/>
-            <w:r>
-              <w:rPr>
-                <w:rFonts w:eastAsiaTheme="minorHAnsi"/>
-                <w:sz w:val="20"/>
-                <w:szCs w:val="20"/>
-              </w:rPr>
-              <w:t xml:space="preserve">int </w:t>
-            </w:r>
-            <w:proofErr w:type="spellStart"/>
-            <w:r>
-              <w:rPr>
-                <w:rFonts w:eastAsiaTheme="minorHAnsi"/>
-                <w:sz w:val="20"/>
-                <w:szCs w:val="20"/>
-              </w:rPr>
-              <w:t>target_id</w:t>
-            </w:r>
-            <w:proofErr w:type="spellEnd"/>
-            <w:r>
-              <w:rPr>
-                <w:rFonts w:eastAsiaTheme="minorHAnsi"/>
-                <w:sz w:val="20"/>
-                <w:szCs w:val="20"/>
-              </w:rPr>
-              <w:t>);</w:t>
+              <w:t>int target_id);</w:t>
             </w:r>
           </w:p>
         </w:tc>
@@ -1712,23 +1410,13 @@
                 <w:szCs w:val="20"/>
               </w:rPr>
             </w:pPr>
-            <w:proofErr w:type="spellStart"/>
-            <w:r>
-              <w:rPr>
-                <w:rFonts w:hint="eastAsia"/>
-                <w:sz w:val="20"/>
-                <w:szCs w:val="20"/>
-              </w:rPr>
-              <w:t>UpdatePosition</w:t>
-            </w:r>
-            <w:proofErr w:type="spellEnd"/>
-            <w:r>
-              <w:rPr>
-                <w:rFonts w:hint="eastAsia"/>
-                <w:sz w:val="20"/>
-                <w:szCs w:val="20"/>
-              </w:rPr>
-              <w:t xml:space="preserve"> Thread</w:t>
+            <w:r>
+              <w:rPr>
+                <w:rFonts w:hint="eastAsia"/>
+                <w:sz w:val="20"/>
+                <w:szCs w:val="20"/>
+              </w:rPr>
+              <w:t>UpdatePosition Thread</w:t>
             </w:r>
             <w:r>
               <w:rPr>
@@ -1757,43 +1445,7 @@
                 <w:sz w:val="20"/>
                 <w:szCs w:val="20"/>
               </w:rPr>
-              <w:t xml:space="preserve">void </w:t>
-            </w:r>
-            <w:proofErr w:type="spellStart"/>
-            <w:r>
-              <w:rPr>
-                <w:rFonts w:eastAsiaTheme="minorHAnsi"/>
-                <w:sz w:val="20"/>
-                <w:szCs w:val="20"/>
-              </w:rPr>
-              <w:t>send_move_packet</w:t>
-            </w:r>
-            <w:proofErr w:type="spellEnd"/>
-            <w:r>
-              <w:rPr>
-                <w:rFonts w:eastAsiaTheme="minorHAnsi"/>
-                <w:sz w:val="20"/>
-                <w:szCs w:val="20"/>
-              </w:rPr>
-              <w:t>(</w:t>
-            </w:r>
-            <w:proofErr w:type="spellStart"/>
-            <w:r>
-              <w:rPr>
-                <w:rFonts w:eastAsiaTheme="minorHAnsi"/>
-                <w:sz w:val="20"/>
-                <w:szCs w:val="20"/>
-              </w:rPr>
-              <w:t>target_id</w:t>
-            </w:r>
-            <w:proofErr w:type="spellEnd"/>
-            <w:r>
-              <w:rPr>
-                <w:rFonts w:eastAsiaTheme="minorHAnsi"/>
-                <w:sz w:val="20"/>
-                <w:szCs w:val="20"/>
-              </w:rPr>
-              <w:t>);</w:t>
+              <w:t>void send_move_packet(target_id);</w:t>
             </w:r>
           </w:p>
         </w:tc>
@@ -1896,7 +1548,6 @@
               </w:rPr>
               <w:t xml:space="preserve">bool </w:t>
             </w:r>
-            <w:proofErr w:type="spellStart"/>
             <w:proofErr w:type="gramStart"/>
             <w:r>
               <w:rPr>
@@ -1904,16 +1555,46 @@
                 <w:sz w:val="20"/>
                 <w:szCs w:val="20"/>
               </w:rPr>
-              <w:t>CollisionCheck</w:t>
-            </w:r>
-            <w:proofErr w:type="spellEnd"/>
+              <w:t>CollisionCheck(</w:t>
+            </w:r>
+            <w:proofErr w:type="gramEnd"/>
             <w:r>
               <w:rPr>
                 <w:rFonts w:eastAsiaTheme="minorHAnsi"/>
                 <w:sz w:val="20"/>
                 <w:szCs w:val="20"/>
               </w:rPr>
-              <w:t>(</w:t>
+              <w:t>)</w:t>
+            </w:r>
+          </w:p>
+          <w:p>
+            <w:pPr>
+              <w:widowControl/>
+              <w:wordWrap/>
+              <w:autoSpaceDE/>
+              <w:autoSpaceDN/>
+              <w:rPr>
+                <w:rFonts w:eastAsiaTheme="minorHAnsi"/>
+                <w:sz w:val="20"/>
+                <w:szCs w:val="20"/>
+              </w:rPr>
+            </w:pPr>
+            <w:r>
+              <w:rPr>
+                <w:rFonts w:eastAsiaTheme="minorHAnsi"/>
+                <w:sz w:val="20"/>
+                <w:szCs w:val="20"/>
+              </w:rPr>
+              <w:t xml:space="preserve">void </w:t>
+            </w:r>
+            <w:proofErr w:type="gramStart"/>
+            <w:r>
+              <w:rPr>
+                <w:rFonts w:eastAsiaTheme="minorHAnsi"/>
+                <w:sz w:val="20"/>
+                <w:szCs w:val="20"/>
+              </w:rPr>
+              <w:t>PlayerCollisionCheck(</w:t>
             </w:r>
             <w:proofErr w:type="gramEnd"/>
             <w:r>
@@ -1925,55 +1606,6 @@
               <w:t>)</w:t>
             </w:r>
           </w:p>
-          <w:p>
-            <w:pPr>
-              <w:widowControl/>
-              <w:wordWrap/>
-              <w:autoSpaceDE/>
-              <w:autoSpaceDN/>
-              <w:rPr>
-                <w:rFonts w:eastAsiaTheme="minorHAnsi"/>
-                <w:sz w:val="20"/>
-                <w:szCs w:val="20"/>
-              </w:rPr>
-            </w:pPr>
-            <w:r>
-              <w:rPr>
-                <w:rFonts w:eastAsiaTheme="minorHAnsi"/>
-                <w:sz w:val="20"/>
-                <w:szCs w:val="20"/>
-              </w:rPr>
-              <w:t xml:space="preserve">void </w:t>
-            </w:r>
-            <w:proofErr w:type="spellStart"/>
-            <w:proofErr w:type="gramStart"/>
-            <w:r>
-              <w:rPr>
-                <w:rFonts w:eastAsiaTheme="minorHAnsi"/>
-                <w:sz w:val="20"/>
-                <w:szCs w:val="20"/>
-              </w:rPr>
-              <w:t>PlayerCollisionCheck</w:t>
-            </w:r>
-            <w:proofErr w:type="spellEnd"/>
-            <w:r>
-              <w:rPr>
-                <w:rFonts w:eastAsiaTheme="minorHAnsi"/>
-                <w:sz w:val="20"/>
-                <w:szCs w:val="20"/>
-              </w:rPr>
-              <w:t>(</w:t>
-            </w:r>
-            <w:proofErr w:type="gramEnd"/>
-            <w:r>
-              <w:rPr>
-                <w:rFonts w:eastAsiaTheme="minorHAnsi"/>
-                <w:sz w:val="20"/>
-                <w:szCs w:val="20"/>
-              </w:rPr>
-              <w:t>)</w:t>
-            </w:r>
-          </w:p>
         </w:tc>
         <w:tc>
           <w:tcPr>
@@ -1990,7 +1622,6 @@
                 <w:szCs w:val="20"/>
               </w:rPr>
             </w:pPr>
-            <w:proofErr w:type="spellStart"/>
             <w:r>
               <w:rPr>
                 <w:rFonts w:hint="eastAsia"/>
@@ -1999,7 +1630,6 @@
               </w:rPr>
               <w:t>유영빈</w:t>
             </w:r>
-            <w:proofErr w:type="spellEnd"/>
           </w:p>
         </w:tc>
       </w:tr>
@@ -2068,7 +1698,6 @@
               </w:rPr>
               <w:t xml:space="preserve">void </w:t>
             </w:r>
-            <w:proofErr w:type="spellStart"/>
             <w:proofErr w:type="gramStart"/>
             <w:r>
               <w:rPr>
@@ -2076,16 +1705,7 @@
                 <w:sz w:val="20"/>
                 <w:szCs w:val="20"/>
               </w:rPr>
-              <w:t>WallCollisionCheck</w:t>
-            </w:r>
-            <w:proofErr w:type="spellEnd"/>
-            <w:r>
-              <w:rPr>
-                <w:rFonts w:eastAsiaTheme="minorHAnsi"/>
-                <w:sz w:val="20"/>
-                <w:szCs w:val="20"/>
-              </w:rPr>
-              <w:t>(</w:t>
+              <w:t>WallCollisionCheck(</w:t>
             </w:r>
             <w:proofErr w:type="gramEnd"/>
             <w:r>
@@ -2120,7 +1740,6 @@
                 <w:szCs w:val="20"/>
               </w:rPr>
             </w:pPr>
-            <w:proofErr w:type="spellStart"/>
             <w:r>
               <w:rPr>
                 <w:rFonts w:hint="eastAsia"/>
@@ -2129,7 +1748,6 @@
               </w:rPr>
               <w:t>유영빈</w:t>
             </w:r>
-            <w:proofErr w:type="spellEnd"/>
           </w:p>
         </w:tc>
       </w:tr>
@@ -2164,23 +1782,13 @@
                 <w:szCs w:val="20"/>
               </w:rPr>
             </w:pPr>
-            <w:proofErr w:type="spellStart"/>
-            <w:r>
-              <w:rPr>
-                <w:rFonts w:hint="eastAsia"/>
-                <w:sz w:val="20"/>
-                <w:szCs w:val="20"/>
-              </w:rPr>
-              <w:t>클라에서</w:t>
-            </w:r>
-            <w:proofErr w:type="spellEnd"/>
-            <w:r>
-              <w:rPr>
-                <w:rFonts w:hint="eastAsia"/>
-                <w:sz w:val="20"/>
-                <w:szCs w:val="20"/>
-              </w:rPr>
-              <w:t xml:space="preserve"> 받은</w:t>
+            <w:r>
+              <w:rPr>
+                <w:rFonts w:hint="eastAsia"/>
+                <w:sz w:val="20"/>
+                <w:szCs w:val="20"/>
+              </w:rPr>
+              <w:t>클라에서 받은</w:t>
             </w:r>
             <w:r>
               <w:rPr>
@@ -2208,7 +1816,6 @@
                 <w:szCs w:val="20"/>
               </w:rPr>
             </w:pPr>
-            <w:proofErr w:type="spellStart"/>
             <w:r>
               <w:rPr>
                 <w:rFonts w:hint="eastAsia"/>
@@ -2217,7 +1824,6 @@
               </w:rPr>
               <w:t>ClientThread</w:t>
             </w:r>
-            <w:proofErr w:type="spellEnd"/>
           </w:p>
         </w:tc>
         <w:tc>
@@ -2303,7 +1909,6 @@
                 <w:szCs w:val="20"/>
               </w:rPr>
             </w:pPr>
-            <w:proofErr w:type="spellStart"/>
             <w:r>
               <w:rPr>
                 <w:rFonts w:eastAsiaTheme="minorHAnsi"/>
@@ -2320,7 +1925,6 @@
               </w:rPr>
               <w:t>rocess_packet</w:t>
             </w:r>
-            <w:proofErr w:type="spellEnd"/>
           </w:p>
         </w:tc>
         <w:tc>
@@ -2461,23 +2065,13 @@
                 <w:szCs w:val="20"/>
               </w:rPr>
             </w:pPr>
-            <w:proofErr w:type="spellStart"/>
-            <w:r>
-              <w:rPr>
-                <w:rFonts w:hint="eastAsia"/>
-                <w:sz w:val="20"/>
-                <w:szCs w:val="20"/>
-              </w:rPr>
-              <w:t>유영빈</w:t>
-            </w:r>
-            <w:proofErr w:type="spellEnd"/>
-            <w:r>
-              <w:rPr>
-                <w:rFonts w:hint="eastAsia"/>
-                <w:sz w:val="20"/>
-                <w:szCs w:val="20"/>
-              </w:rPr>
-              <w:t>, 양현서</w:t>
+            <w:r>
+              <w:rPr>
+                <w:rFonts w:hint="eastAsia"/>
+                <w:sz w:val="20"/>
+                <w:szCs w:val="20"/>
+              </w:rPr>
+              <w:t>유영빈, 양현서</w:t>
             </w:r>
           </w:p>
         </w:tc>
@@ -2554,7 +2148,6 @@
               </w:rPr>
               <w:t xml:space="preserve">lass </w:t>
             </w:r>
-            <w:proofErr w:type="spellStart"/>
             <w:r>
               <w:rPr>
                 <w:rFonts w:asciiTheme="majorEastAsia" w:eastAsiaTheme="majorEastAsia" w:hAnsiTheme="majorEastAsia" w:hint="eastAsia"/>
@@ -2563,7 +2156,6 @@
               </w:rPr>
               <w:t>NetworkMgr</w:t>
             </w:r>
-            <w:proofErr w:type="spellEnd"/>
             <w:r>
               <w:rPr>
                 <w:rFonts w:asciiTheme="majorEastAsia" w:eastAsiaTheme="majorEastAsia" w:hAnsiTheme="majorEastAsia" w:hint="eastAsia"/>
@@ -2591,22 +2183,13 @@
               </w:rPr>
               <w:t xml:space="preserve">bool </w:t>
             </w:r>
-            <w:proofErr w:type="spellStart"/>
             <w:proofErr w:type="gramStart"/>
             <w:r>
               <w:rPr>
                 <w:sz w:val="20"/>
                 <w:szCs w:val="20"/>
               </w:rPr>
-              <w:t>NetworkMgr</w:t>
-            </w:r>
-            <w:proofErr w:type="spellEnd"/>
-            <w:r>
-              <w:rPr>
-                <w:sz w:val="20"/>
-                <w:szCs w:val="20"/>
-              </w:rPr>
-              <w:t>::</w:t>
+              <w:t>NetworkMgr::</w:t>
             </w:r>
             <w:proofErr w:type="gramEnd"/>
             <w:r>
@@ -2628,39 +2211,21 @@
                 <w:szCs w:val="20"/>
               </w:rPr>
             </w:pPr>
-            <w:proofErr w:type="spellStart"/>
             <w:proofErr w:type="gramStart"/>
             <w:r>
               <w:rPr>
                 <w:sz w:val="20"/>
                 <w:szCs w:val="20"/>
               </w:rPr>
-              <w:t>NetworkMgr</w:t>
-            </w:r>
-            <w:proofErr w:type="spellEnd"/>
-            <w:r>
-              <w:rPr>
-                <w:sz w:val="20"/>
-                <w:szCs w:val="20"/>
-              </w:rPr>
-              <w:t>::</w:t>
-            </w:r>
-            <w:proofErr w:type="spellStart"/>
+              <w:t>NetworkMgr::</w:t>
+            </w:r>
             <w:proofErr w:type="gramEnd"/>
             <w:r>
               <w:rPr>
                 <w:sz w:val="20"/>
                 <w:szCs w:val="20"/>
               </w:rPr>
-              <w:t>SendPacket</w:t>
-            </w:r>
-            <w:proofErr w:type="spellEnd"/>
-            <w:r>
-              <w:rPr>
-                <w:sz w:val="20"/>
-                <w:szCs w:val="20"/>
-              </w:rPr>
-              <w:t>()</w:t>
+              <w:t>SendPacket()</w:t>
             </w:r>
           </w:p>
         </w:tc>
@@ -2791,7 +2356,6 @@
                 <w:szCs w:val="20"/>
               </w:rPr>
             </w:pPr>
-            <w:proofErr w:type="spellStart"/>
             <w:r>
               <w:rPr>
                 <w:rFonts w:hint="eastAsia"/>
@@ -2800,7 +2364,6 @@
               </w:rPr>
               <w:t>유영빈</w:t>
             </w:r>
-            <w:proofErr w:type="spellEnd"/>
           </w:p>
         </w:tc>
       </w:tr>
@@ -2885,7 +2448,6 @@
                 <w:szCs w:val="20"/>
               </w:rPr>
             </w:pPr>
-            <w:proofErr w:type="spellStart"/>
             <w:r>
               <w:rPr>
                 <w:rFonts w:hint="eastAsia"/>
@@ -2894,7 +2456,6 @@
               </w:rPr>
               <w:t>유영빈</w:t>
             </w:r>
-            <w:proofErr w:type="spellEnd"/>
           </w:p>
         </w:tc>
       </w:tr>
@@ -2963,7 +2524,6 @@
                 <w:szCs w:val="20"/>
               </w:rPr>
             </w:pPr>
-            <w:proofErr w:type="spellStart"/>
             <w:r>
               <w:rPr>
                 <w:rFonts w:asciiTheme="majorEastAsia" w:eastAsiaTheme="majorEastAsia" w:hAnsiTheme="majorEastAsia"/>
@@ -2972,7 +2532,6 @@
               </w:rPr>
               <w:t>RecvThread</w:t>
             </w:r>
-            <w:proofErr w:type="spellEnd"/>
           </w:p>
           <w:p>
             <w:pPr>
@@ -2986,7 +2545,6 @@
                 <w:szCs w:val="20"/>
               </w:rPr>
             </w:pPr>
-            <w:proofErr w:type="spellStart"/>
             <w:r>
               <w:rPr>
                 <w:rFonts w:asciiTheme="majorEastAsia" w:eastAsiaTheme="majorEastAsia" w:hAnsiTheme="majorEastAsia" w:hint="eastAsia"/>
@@ -2995,7 +2553,6 @@
               </w:rPr>
               <w:t>ProcessPacket</w:t>
             </w:r>
-            <w:proofErr w:type="spellEnd"/>
           </w:p>
         </w:tc>
         <w:tc>
@@ -3019,18 +2576,8 @@
                 <w:sz w:val="20"/>
                 <w:szCs w:val="20"/>
               </w:rPr>
-              <w:t xml:space="preserve">양현서, </w:t>
-            </w:r>
-            <w:proofErr w:type="spellStart"/>
-            <w:r>
-              <w:rPr>
-                <w:rFonts w:hint="eastAsia"/>
-                <w:sz w:val="20"/>
-                <w:szCs w:val="20"/>
-              </w:rPr>
-              <w:t>유영빈</w:t>
-            </w:r>
-            <w:proofErr w:type="spellEnd"/>
+              <w:t>양현서, 유영빈</w:t>
+            </w:r>
           </w:p>
         </w:tc>
       </w:tr>
@@ -3620,7 +3167,6 @@
                 <w:szCs w:val="16"/>
               </w:rPr>
             </w:pPr>
-            <w:proofErr w:type="spellStart"/>
             <w:r>
               <w:rPr>
                 <w:b/>
@@ -3638,71 +3184,71 @@
                 <w:sz w:val="16"/>
                 <w:szCs w:val="16"/>
               </w:rPr>
-              <w:t>rotocol.h</w:t>
-            </w:r>
-            <w:proofErr w:type="spellEnd"/>
-            <w:r>
-              <w:rPr>
-                <w:rFonts w:hint="eastAsia"/>
+              <w:t>rotocol.h 작성</w:t>
+            </w:r>
+          </w:p>
+          <w:p>
+            <w:pPr>
+              <w:widowControl/>
+              <w:wordWrap/>
+              <w:autoSpaceDE/>
+              <w:autoSpaceDN/>
+              <w:rPr>
+                <w:sz w:val="16"/>
+                <w:szCs w:val="16"/>
+              </w:rPr>
+            </w:pPr>
+          </w:p>
+        </w:tc>
+        <w:tc>
+          <w:tcPr>
+            <w:tcW w:w="1701" w:type="dxa"/>
+          </w:tcPr>
+          <w:p>
+            <w:pPr>
+              <w:widowControl/>
+              <w:wordWrap/>
+              <w:autoSpaceDE/>
+              <w:autoSpaceDN/>
+              <w:rPr>
+                <w:sz w:val="16"/>
+                <w:szCs w:val="16"/>
+              </w:rPr>
+            </w:pPr>
+            <w:r>
+              <w:rPr>
+                <w:rFonts w:hint="eastAsia"/>
+                <w:sz w:val="16"/>
+                <w:szCs w:val="16"/>
+              </w:rPr>
+              <w:t>31</w:t>
+            </w:r>
+          </w:p>
+          <w:p>
+            <w:pPr>
+              <w:widowControl/>
+              <w:wordWrap/>
+              <w:autoSpaceDE/>
+              <w:autoSpaceDN/>
+              <w:rPr>
                 <w:b/>
                 <w:bCs/>
                 <w:sz w:val="16"/>
                 <w:szCs w:val="16"/>
               </w:rPr>
-              <w:t xml:space="preserve"> 작성</w:t>
-            </w:r>
-          </w:p>
-          <w:p>
-            <w:pPr>
-              <w:widowControl/>
-              <w:wordWrap/>
-              <w:autoSpaceDE/>
-              <w:autoSpaceDN/>
-              <w:rPr>
-                <w:sz w:val="16"/>
-                <w:szCs w:val="16"/>
-              </w:rPr>
-            </w:pPr>
-          </w:p>
-        </w:tc>
-        <w:tc>
-          <w:tcPr>
-            <w:tcW w:w="1701" w:type="dxa"/>
-          </w:tcPr>
-          <w:p>
-            <w:pPr>
-              <w:widowControl/>
-              <w:wordWrap/>
-              <w:autoSpaceDE/>
-              <w:autoSpaceDN/>
-              <w:rPr>
-                <w:sz w:val="16"/>
-                <w:szCs w:val="16"/>
-              </w:rPr>
-            </w:pPr>
-            <w:r>
-              <w:rPr>
-                <w:rFonts w:hint="eastAsia"/>
-                <w:sz w:val="16"/>
-                <w:szCs w:val="16"/>
-              </w:rPr>
-              <w:t>31</w:t>
-            </w:r>
-          </w:p>
-          <w:p>
-            <w:pPr>
-              <w:widowControl/>
-              <w:wordWrap/>
-              <w:autoSpaceDE/>
-              <w:autoSpaceDN/>
-              <w:rPr>
+            </w:pPr>
+            <w:proofErr w:type="gramStart"/>
+            <w:r>
+              <w:rPr>
+                <w:rFonts w:hint="eastAsia"/>
                 <w:b/>
                 <w:bCs/>
                 <w:sz w:val="16"/>
                 <w:szCs w:val="16"/>
               </w:rPr>
-            </w:pPr>
-            <w:proofErr w:type="gramStart"/>
+              <w:t>Player(</w:t>
+            </w:r>
+            <w:proofErr w:type="gramEnd"/>
             <w:r>
               <w:rPr>
                 <w:rFonts w:hint="eastAsia"/>
@@ -3711,33 +3257,33 @@
                 <w:sz w:val="16"/>
                 <w:szCs w:val="16"/>
               </w:rPr>
-              <w:t>Player(</w:t>
-            </w:r>
-            <w:proofErr w:type="gramEnd"/>
-            <w:r>
-              <w:rPr>
-                <w:rFonts w:hint="eastAsia"/>
+              <w:t>)</w:t>
+            </w:r>
+          </w:p>
+          <w:p>
+            <w:pPr>
+              <w:widowControl/>
+              <w:wordWrap/>
+              <w:autoSpaceDE/>
+              <w:autoSpaceDN/>
+              <w:rPr>
                 <w:b/>
                 <w:bCs/>
                 <w:sz w:val="16"/>
                 <w:szCs w:val="16"/>
               </w:rPr>
-              <w:t>)</w:t>
-            </w:r>
-          </w:p>
-          <w:p>
-            <w:pPr>
-              <w:widowControl/>
-              <w:wordWrap/>
-              <w:autoSpaceDE/>
-              <w:autoSpaceDN/>
-              <w:rPr>
+            </w:pPr>
+            <w:r>
+              <w:rPr>
+                <w:rFonts w:hint="eastAsia"/>
                 <w:b/>
                 <w:bCs/>
                 <w:sz w:val="16"/>
                 <w:szCs w:val="16"/>
               </w:rPr>
-            </w:pPr>
+              <w:t>~</w:t>
+            </w:r>
+            <w:proofErr w:type="gramStart"/>
             <w:r>
               <w:rPr>
                 <w:rFonts w:hint="eastAsia"/>
@@ -3746,9 +3292,9 @@
                 <w:sz w:val="16"/>
                 <w:szCs w:val="16"/>
               </w:rPr>
-              <w:t>~</w:t>
-            </w:r>
-            <w:proofErr w:type="gramStart"/>
+              <w:t>Player(</w:t>
+            </w:r>
+            <w:proofErr w:type="gramEnd"/>
             <w:r>
               <w:rPr>
                 <w:rFonts w:hint="eastAsia"/>
@@ -3757,42 +3303,42 @@
                 <w:sz w:val="16"/>
                 <w:szCs w:val="16"/>
               </w:rPr>
-              <w:t>Player(</w:t>
-            </w:r>
-            <w:proofErr w:type="gramEnd"/>
-            <w:r>
-              <w:rPr>
-                <w:rFonts w:hint="eastAsia"/>
+              <w:t>)</w:t>
+            </w:r>
+          </w:p>
+          <w:p>
+            <w:pPr>
+              <w:widowControl/>
+              <w:wordWrap/>
+              <w:autoSpaceDE/>
+              <w:autoSpaceDN/>
+              <w:rPr>
                 <w:b/>
                 <w:bCs/>
                 <w:sz w:val="16"/>
                 <w:szCs w:val="16"/>
               </w:rPr>
-              <w:t>)</w:t>
-            </w:r>
-          </w:p>
-          <w:p>
-            <w:pPr>
-              <w:widowControl/>
-              <w:wordWrap/>
-              <w:autoSpaceDE/>
-              <w:autoSpaceDN/>
+            </w:pPr>
+            <w:r>
               <w:rPr>
                 <w:b/>
                 <w:bCs/>
                 <w:sz w:val="16"/>
                 <w:szCs w:val="16"/>
               </w:rPr>
-            </w:pPr>
-            <w:r>
-              <w:rPr>
+              <w:t>S</w:t>
+            </w:r>
+            <w:r>
+              <w:rPr>
+                <w:rFonts w:hint="eastAsia"/>
                 <w:b/>
                 <w:bCs/>
                 <w:sz w:val="16"/>
                 <w:szCs w:val="16"/>
               </w:rPr>
-              <w:t>S</w:t>
-            </w:r>
+              <w:t xml:space="preserve">erver </w:t>
+            </w:r>
+            <w:proofErr w:type="gramStart"/>
             <w:r>
               <w:rPr>
                 <w:rFonts w:hint="eastAsia"/>
@@ -3801,9 +3347,9 @@
                 <w:sz w:val="16"/>
                 <w:szCs w:val="16"/>
               </w:rPr>
-              <w:t xml:space="preserve">erver </w:t>
-            </w:r>
-            <w:proofErr w:type="gramStart"/>
+              <w:t>main(</w:t>
+            </w:r>
+            <w:proofErr w:type="gramEnd"/>
             <w:r>
               <w:rPr>
                 <w:rFonts w:hint="eastAsia"/>
@@ -3812,17 +3358,6 @@
                 <w:sz w:val="16"/>
                 <w:szCs w:val="16"/>
               </w:rPr>
-              <w:t>main(</w:t>
-            </w:r>
-            <w:proofErr w:type="gramEnd"/>
-            <w:r>
-              <w:rPr>
-                <w:rFonts w:hint="eastAsia"/>
-                <w:b/>
-                <w:bCs/>
-                <w:sz w:val="16"/>
-                <w:szCs w:val="16"/>
-              </w:rPr>
               <w:t>)</w:t>
             </w:r>
           </w:p>
@@ -3833,7 +3368,6 @@
               <w:autoSpaceDE/>
               <w:autoSpaceDN/>
               <w:rPr>
-                <w:rFonts w:hint="eastAsia"/>
                 <w:b/>
                 <w:bCs/>
                 <w:sz w:val="16"/>
@@ -4007,33 +3541,145 @@
               <w:autoSpaceDE/>
               <w:autoSpaceDN/>
               <w:rPr>
-                <w:sz w:val="16"/>
-                <w:szCs w:val="16"/>
+                <w:b/>
+                <w:bCs/>
+                <w:sz w:val="14"/>
+                <w:szCs w:val="14"/>
               </w:rPr>
             </w:pPr>
             <w:proofErr w:type="gramStart"/>
             <w:r>
               <w:rPr>
                 <w:rFonts w:hint="eastAsia"/>
-                <w:sz w:val="16"/>
-                <w:szCs w:val="16"/>
+                <w:b/>
+                <w:bCs/>
+                <w:sz w:val="14"/>
+                <w:szCs w:val="14"/>
               </w:rPr>
               <w:t>Player::</w:t>
             </w:r>
-            <w:proofErr w:type="spellStart"/>
             <w:proofErr w:type="gramEnd"/>
             <w:r>
               <w:rPr>
-                <w:sz w:val="16"/>
-                <w:szCs w:val="16"/>
-              </w:rPr>
-              <w:t>recv_packet</w:t>
-            </w:r>
-            <w:proofErr w:type="spellEnd"/>
-            <w:r>
-              <w:rPr>
-                <w:sz w:val="16"/>
-                <w:szCs w:val="16"/>
+                <w:b/>
+                <w:bCs/>
+                <w:sz w:val="14"/>
+                <w:szCs w:val="14"/>
+              </w:rPr>
+              <w:t>recv_packet();</w:t>
+            </w:r>
+          </w:p>
+          <w:p>
+            <w:pPr>
+              <w:widowControl/>
+              <w:wordWrap/>
+              <w:autoSpaceDE/>
+              <w:autoSpaceDN/>
+              <w:rPr>
+                <w:b/>
+                <w:bCs/>
+                <w:sz w:val="14"/>
+                <w:szCs w:val="14"/>
+              </w:rPr>
+            </w:pPr>
+            <w:proofErr w:type="gramStart"/>
+            <w:r>
+              <w:rPr>
+                <w:rFonts w:hint="eastAsia"/>
+                <w:b/>
+                <w:bCs/>
+                <w:sz w:val="14"/>
+                <w:szCs w:val="14"/>
+              </w:rPr>
+              <w:t>Player::</w:t>
+            </w:r>
+            <w:proofErr w:type="gramEnd"/>
+            <w:r>
+              <w:rPr>
+                <w:rFonts w:hint="eastAsia"/>
+                <w:b/>
+                <w:bCs/>
+                <w:sz w:val="14"/>
+                <w:szCs w:val="14"/>
+              </w:rPr>
+              <w:t>send</w:t>
+            </w:r>
+            <w:r>
+              <w:rPr>
+                <w:b/>
+                <w:bCs/>
+                <w:sz w:val="14"/>
+                <w:szCs w:val="14"/>
+              </w:rPr>
+              <w:t>_packet();</w:t>
+            </w:r>
+          </w:p>
+        </w:tc>
+        <w:tc>
+          <w:tcPr>
+            <w:tcW w:w="1701" w:type="dxa"/>
+          </w:tcPr>
+          <w:p>
+            <w:pPr>
+              <w:widowControl/>
+              <w:wordWrap/>
+              <w:autoSpaceDE/>
+              <w:autoSpaceDN/>
+              <w:rPr>
+                <w:sz w:val="16"/>
+                <w:szCs w:val="16"/>
+              </w:rPr>
+            </w:pPr>
+            <w:r>
+              <w:rPr>
+                <w:rFonts w:hint="eastAsia"/>
+                <w:sz w:val="16"/>
+                <w:szCs w:val="16"/>
+              </w:rPr>
+              <w:t>4</w:t>
+            </w:r>
+          </w:p>
+          <w:p>
+            <w:pPr>
+              <w:widowControl/>
+              <w:wordWrap/>
+              <w:autoSpaceDE/>
+              <w:autoSpaceDN/>
+              <w:rPr>
+                <w:b/>
+                <w:bCs/>
+                <w:sz w:val="14"/>
+                <w:szCs w:val="14"/>
+              </w:rPr>
+            </w:pPr>
+            <w:proofErr w:type="gramStart"/>
+            <w:r>
+              <w:rPr>
+                <w:rFonts w:hint="eastAsia"/>
+                <w:b/>
+                <w:bCs/>
+                <w:sz w:val="14"/>
+                <w:szCs w:val="14"/>
+              </w:rPr>
+              <w:t>Player::</w:t>
+            </w:r>
+            <w:proofErr w:type="gramEnd"/>
+            <w:r>
+              <w:rPr>
+                <w:rFonts w:hint="eastAsia"/>
+                <w:b/>
+                <w:bCs/>
+                <w:sz w:val="14"/>
+                <w:szCs w:val="14"/>
+              </w:rPr>
+              <w:t>disconnect</w:t>
+            </w:r>
+            <w:r>
+              <w:rPr>
+                <w:b/>
+                <w:bCs/>
+                <w:sz w:val="14"/>
+                <w:szCs w:val="14"/>
               </w:rPr>
               <w:t>();</w:t>
             </w:r>
@@ -4049,40 +3695,6 @@
                 <w:szCs w:val="16"/>
               </w:rPr>
             </w:pPr>
-            <w:proofErr w:type="gramStart"/>
-            <w:r>
-              <w:rPr>
-                <w:rFonts w:hint="eastAsia"/>
-                <w:sz w:val="16"/>
-                <w:szCs w:val="16"/>
-              </w:rPr>
-              <w:t>Player::</w:t>
-            </w:r>
-            <w:proofErr w:type="spellStart"/>
-            <w:proofErr w:type="gramEnd"/>
-            <w:r>
-              <w:rPr>
-                <w:rFonts w:hint="eastAsia"/>
-                <w:sz w:val="16"/>
-                <w:szCs w:val="16"/>
-              </w:rPr>
-              <w:t>send</w:t>
-            </w:r>
-            <w:r>
-              <w:rPr>
-                <w:sz w:val="16"/>
-                <w:szCs w:val="16"/>
-              </w:rPr>
-              <w:t>_packet</w:t>
-            </w:r>
-            <w:proofErr w:type="spellEnd"/>
-            <w:r>
-              <w:rPr>
-                <w:sz w:val="16"/>
-                <w:szCs w:val="16"/>
-              </w:rPr>
-              <w:t>();</w:t>
-            </w:r>
           </w:p>
         </w:tc>
         <w:tc>
@@ -4096,30 +3708,63 @@
               <w:autoSpaceDE/>
               <w:autoSpaceDN/>
               <w:rPr>
-                <w:sz w:val="16"/>
-                <w:szCs w:val="16"/>
-              </w:rPr>
-            </w:pPr>
-            <w:r>
-              <w:rPr>
-                <w:rFonts w:hint="eastAsia"/>
-                <w:sz w:val="16"/>
-                <w:szCs w:val="16"/>
-              </w:rPr>
-              <w:t>4</w:t>
-            </w:r>
-          </w:p>
-          <w:p>
-            <w:pPr>
-              <w:widowControl/>
-              <w:wordWrap/>
-              <w:autoSpaceDE/>
-              <w:autoSpaceDN/>
-              <w:rPr>
-                <w:sz w:val="16"/>
-                <w:szCs w:val="16"/>
-              </w:rPr>
-            </w:pPr>
+                <w:color w:val="960000"/>
+                <w:sz w:val="16"/>
+                <w:szCs w:val="16"/>
+              </w:rPr>
+            </w:pPr>
+            <w:r>
+              <w:rPr>
+                <w:rFonts w:hint="eastAsia"/>
+                <w:sz w:val="16"/>
+                <w:szCs w:val="16"/>
+              </w:rPr>
+              <w:t>5</w:t>
+            </w:r>
+          </w:p>
+          <w:p>
+            <w:pPr>
+              <w:widowControl/>
+              <w:wordWrap/>
+              <w:autoSpaceDE/>
+              <w:autoSpaceDN/>
+              <w:rPr>
+                <w:color w:val="960000"/>
+                <w:sz w:val="16"/>
+                <w:szCs w:val="16"/>
+              </w:rPr>
+            </w:pPr>
+            <w:r>
+              <w:rPr>
+                <w:rFonts w:hint="eastAsia"/>
+                <w:color w:val="960000"/>
+                <w:sz w:val="16"/>
+                <w:szCs w:val="16"/>
+              </w:rPr>
+              <w:t>패킷테스트</w:t>
+            </w:r>
+          </w:p>
+          <w:p>
+            <w:pPr>
+              <w:widowControl/>
+              <w:wordWrap/>
+              <w:autoSpaceDE/>
+              <w:autoSpaceDN/>
+              <w:rPr>
+                <w:color w:val="960000"/>
+                <w:sz w:val="16"/>
+                <w:szCs w:val="16"/>
+              </w:rPr>
+            </w:pPr>
+            <w:r>
+              <w:rPr>
+                <w:rFonts w:hint="eastAsia"/>
+                <w:color w:val="960000"/>
+                <w:sz w:val="16"/>
+                <w:szCs w:val="16"/>
+              </w:rPr>
+              <w:t>진행 보고</w:t>
+            </w:r>
           </w:p>
         </w:tc>
         <w:tc>
@@ -4133,78 +3778,6 @@
               <w:autoSpaceDE/>
               <w:autoSpaceDN/>
               <w:rPr>
-                <w:color w:val="960000"/>
-                <w:sz w:val="16"/>
-                <w:szCs w:val="16"/>
-              </w:rPr>
-            </w:pPr>
-            <w:r>
-              <w:rPr>
-                <w:rFonts w:hint="eastAsia"/>
-                <w:sz w:val="16"/>
-                <w:szCs w:val="16"/>
-              </w:rPr>
-              <w:t>5</w:t>
-            </w:r>
-          </w:p>
-          <w:p>
-            <w:pPr>
-              <w:widowControl/>
-              <w:wordWrap/>
-              <w:autoSpaceDE/>
-              <w:autoSpaceDN/>
-              <w:rPr>
-                <w:color w:val="960000"/>
-                <w:sz w:val="16"/>
-                <w:szCs w:val="16"/>
-              </w:rPr>
-            </w:pPr>
-            <w:proofErr w:type="spellStart"/>
-            <w:r>
-              <w:rPr>
-                <w:rFonts w:hint="eastAsia"/>
-                <w:color w:val="960000"/>
-                <w:sz w:val="16"/>
-                <w:szCs w:val="16"/>
-              </w:rPr>
-              <w:t>패킷테스트</w:t>
-            </w:r>
-            <w:proofErr w:type="spellEnd"/>
-          </w:p>
-          <w:p>
-            <w:pPr>
-              <w:widowControl/>
-              <w:wordWrap/>
-              <w:autoSpaceDE/>
-              <w:autoSpaceDN/>
-              <w:rPr>
-                <w:color w:val="960000"/>
-                <w:sz w:val="16"/>
-                <w:szCs w:val="16"/>
-              </w:rPr>
-            </w:pPr>
-            <w:r>
-              <w:rPr>
-                <w:rFonts w:hint="eastAsia"/>
-                <w:color w:val="960000"/>
-                <w:sz w:val="16"/>
-                <w:szCs w:val="16"/>
-              </w:rPr>
-              <w:t>진행 보고</w:t>
-            </w:r>
-          </w:p>
-        </w:tc>
-        <w:tc>
-          <w:tcPr>
-            <w:tcW w:w="1701" w:type="dxa"/>
-          </w:tcPr>
-          <w:p>
-            <w:pPr>
-              <w:widowControl/>
-              <w:wordWrap/>
-              <w:autoSpaceDE/>
-              <w:autoSpaceDN/>
-              <w:rPr>
                 <w:sz w:val="16"/>
                 <w:szCs w:val="16"/>
               </w:rPr>
@@ -4225,6 +3798,8 @@
               <w:autoSpaceDE/>
               <w:autoSpaceDN/>
               <w:rPr>
+                <w:b/>
+                <w:bCs/>
                 <w:sz w:val="16"/>
                 <w:szCs w:val="16"/>
               </w:rPr>
@@ -4232,6 +3807,8 @@
             <w:r>
               <w:rPr>
                 <w:rFonts w:eastAsiaTheme="minorHAnsi"/>
+                <w:b/>
+                <w:bCs/>
                 <w:sz w:val="16"/>
                 <w:szCs w:val="16"/>
               </w:rPr>
@@ -4240,15 +3817,18 @@
             <w:r>
               <w:rPr>
                 <w:rFonts w:eastAsiaTheme="minorHAnsi" w:hint="eastAsia"/>
+                <w:b/>
+                <w:bCs/>
                 <w:sz w:val="16"/>
                 <w:szCs w:val="16"/>
               </w:rPr>
               <w:t xml:space="preserve">erver </w:t>
             </w:r>
-            <w:proofErr w:type="spellStart"/>
             <w:r>
               <w:rPr>
                 <w:rFonts w:eastAsiaTheme="minorHAnsi"/>
+                <w:b/>
+                <w:bCs/>
                 <w:sz w:val="16"/>
                 <w:szCs w:val="16"/>
               </w:rPr>
@@ -4257,19 +3837,12 @@
             <w:r>
               <w:rPr>
                 <w:rFonts w:eastAsiaTheme="minorHAnsi" w:hint="eastAsia"/>
-                <w:sz w:val="16"/>
-                <w:szCs w:val="16"/>
-              </w:rPr>
-              <w:t>rocess_packet</w:t>
-            </w:r>
-            <w:proofErr w:type="spellEnd"/>
-            <w:r>
-              <w:rPr>
-                <w:rFonts w:eastAsiaTheme="minorHAnsi" w:hint="eastAsia"/>
-                <w:sz w:val="16"/>
-                <w:szCs w:val="16"/>
-              </w:rPr>
-              <w:t>() 생성</w:t>
+                <w:b/>
+                <w:bCs/>
+                <w:sz w:val="16"/>
+                <w:szCs w:val="16"/>
+              </w:rPr>
+              <w:t>rocess_packet() 생성</w:t>
             </w:r>
           </w:p>
         </w:tc>
@@ -4444,7 +4017,6 @@
                 <w:szCs w:val="16"/>
               </w:rPr>
             </w:pPr>
-            <w:proofErr w:type="spellStart"/>
             <w:r>
               <w:rPr>
                 <w:rFonts w:eastAsiaTheme="minorHAnsi"/>
@@ -4460,245 +4032,204 @@
                 <w:sz w:val="16"/>
                 <w:szCs w:val="16"/>
               </w:rPr>
-              <w:t>packet</w:t>
-            </w:r>
-            <w:proofErr w:type="spellEnd"/>
+              <w:t>packet(</w:t>
+            </w:r>
+            <w:proofErr w:type="gramEnd"/>
             <w:r>
               <w:rPr>
                 <w:rFonts w:eastAsiaTheme="minorHAnsi"/>
                 <w:sz w:val="16"/>
                 <w:szCs w:val="16"/>
               </w:rPr>
-              <w:t>(</w:t>
-            </w:r>
-            <w:proofErr w:type="gramEnd"/>
-            <w:r>
+              <w:t>int target_id);</w:t>
+            </w:r>
+          </w:p>
+          <w:p>
+            <w:pPr>
+              <w:widowControl/>
+              <w:wordWrap/>
+              <w:autoSpaceDE/>
+              <w:autoSpaceDN/>
+              <w:rPr>
+                <w:sz w:val="16"/>
+                <w:szCs w:val="16"/>
+              </w:rPr>
+            </w:pPr>
+          </w:p>
+        </w:tc>
+        <w:tc>
+          <w:tcPr>
+            <w:tcW w:w="1701" w:type="dxa"/>
+          </w:tcPr>
+          <w:p>
+            <w:pPr>
+              <w:widowControl/>
+              <w:wordWrap/>
+              <w:autoSpaceDE/>
+              <w:autoSpaceDN/>
+              <w:rPr>
+                <w:sz w:val="16"/>
+                <w:szCs w:val="16"/>
+              </w:rPr>
+            </w:pPr>
+            <w:r>
+              <w:rPr>
+                <w:rFonts w:hint="eastAsia"/>
+                <w:sz w:val="16"/>
+                <w:szCs w:val="16"/>
+              </w:rPr>
+              <w:t>11</w:t>
+            </w:r>
+          </w:p>
+        </w:tc>
+        <w:tc>
+          <w:tcPr>
+            <w:tcW w:w="1701" w:type="dxa"/>
+          </w:tcPr>
+          <w:p>
+            <w:pPr>
+              <w:widowControl/>
+              <w:wordWrap/>
+              <w:autoSpaceDE/>
+              <w:autoSpaceDN/>
+              <w:rPr>
+                <w:color w:val="960000"/>
+                <w:sz w:val="16"/>
+                <w:szCs w:val="16"/>
+              </w:rPr>
+            </w:pPr>
+            <w:r>
+              <w:rPr>
+                <w:rFonts w:hint="eastAsia"/>
+                <w:sz w:val="16"/>
+                <w:szCs w:val="16"/>
+              </w:rPr>
+              <w:t>12</w:t>
+            </w:r>
+          </w:p>
+          <w:p>
+            <w:pPr>
+              <w:widowControl/>
+              <w:wordWrap/>
+              <w:autoSpaceDE/>
+              <w:autoSpaceDN/>
+              <w:rPr>
+                <w:color w:val="960000"/>
+                <w:sz w:val="16"/>
+                <w:szCs w:val="16"/>
+              </w:rPr>
+            </w:pPr>
+            <w:r>
+              <w:rPr>
+                <w:rFonts w:hint="eastAsia"/>
+                <w:color w:val="960000"/>
+                <w:sz w:val="16"/>
+                <w:szCs w:val="16"/>
+              </w:rPr>
+              <w:t>패킷테스트</w:t>
+            </w:r>
+          </w:p>
+          <w:p>
+            <w:pPr>
+              <w:widowControl/>
+              <w:wordWrap/>
+              <w:autoSpaceDE/>
+              <w:autoSpaceDN/>
+              <w:rPr>
+                <w:sz w:val="16"/>
+                <w:szCs w:val="16"/>
+              </w:rPr>
+            </w:pPr>
+            <w:r>
+              <w:rPr>
+                <w:rFonts w:hint="eastAsia"/>
+                <w:color w:val="960000"/>
+                <w:sz w:val="16"/>
+                <w:szCs w:val="16"/>
+              </w:rPr>
+              <w:t>진행 보고</w:t>
+            </w:r>
+          </w:p>
+        </w:tc>
+        <w:tc>
+          <w:tcPr>
+            <w:tcW w:w="1701" w:type="dxa"/>
+          </w:tcPr>
+          <w:p>
+            <w:pPr>
+              <w:widowControl/>
+              <w:wordWrap/>
+              <w:autoSpaceDE/>
+              <w:autoSpaceDN/>
+              <w:rPr>
+                <w:sz w:val="16"/>
+                <w:szCs w:val="16"/>
+              </w:rPr>
+            </w:pPr>
+            <w:r>
+              <w:rPr>
+                <w:rFonts w:hint="eastAsia"/>
+                <w:sz w:val="16"/>
+                <w:szCs w:val="16"/>
+              </w:rPr>
+              <w:t>13</w:t>
+            </w:r>
+          </w:p>
+          <w:p>
+            <w:pPr>
+              <w:widowControl/>
+              <w:wordWrap/>
+              <w:autoSpaceDE/>
+              <w:autoSpaceDN/>
               <w:rPr>
                 <w:rFonts w:eastAsiaTheme="minorHAnsi"/>
                 <w:sz w:val="16"/>
                 <w:szCs w:val="16"/>
               </w:rPr>
-              <w:t xml:space="preserve">int </w:t>
-            </w:r>
-            <w:proofErr w:type="spellStart"/>
+            </w:pPr>
             <w:r>
               <w:rPr>
                 <w:rFonts w:eastAsiaTheme="minorHAnsi"/>
                 <w:sz w:val="16"/>
                 <w:szCs w:val="16"/>
               </w:rPr>
-              <w:t>target_id</w:t>
-            </w:r>
-            <w:proofErr w:type="spellEnd"/>
+              <w:t>send_ready_packet(target_id)</w:t>
+            </w:r>
+          </w:p>
+          <w:p>
+            <w:pPr>
+              <w:widowControl/>
+              <w:wordWrap/>
+              <w:autoSpaceDE/>
+              <w:autoSpaceDN/>
+              <w:rPr>
+                <w:sz w:val="16"/>
+                <w:szCs w:val="16"/>
+              </w:rPr>
+            </w:pPr>
             <w:r>
               <w:rPr>
                 <w:rFonts w:eastAsiaTheme="minorHAnsi"/>
                 <w:sz w:val="16"/>
                 <w:szCs w:val="16"/>
               </w:rPr>
-              <w:t>);</w:t>
-            </w:r>
-          </w:p>
-          <w:p>
-            <w:pPr>
-              <w:widowControl/>
-              <w:wordWrap/>
-              <w:autoSpaceDE/>
-              <w:autoSpaceDN/>
-              <w:rPr>
-                <w:sz w:val="16"/>
-                <w:szCs w:val="16"/>
-              </w:rPr>
-            </w:pPr>
-          </w:p>
-        </w:tc>
-        <w:tc>
-          <w:tcPr>
-            <w:tcW w:w="1701" w:type="dxa"/>
-          </w:tcPr>
-          <w:p>
-            <w:pPr>
-              <w:widowControl/>
-              <w:wordWrap/>
-              <w:autoSpaceDE/>
-              <w:autoSpaceDN/>
-              <w:rPr>
-                <w:sz w:val="16"/>
-                <w:szCs w:val="16"/>
-              </w:rPr>
-            </w:pPr>
-            <w:r>
-              <w:rPr>
-                <w:rFonts w:hint="eastAsia"/>
-                <w:sz w:val="16"/>
-                <w:szCs w:val="16"/>
-              </w:rPr>
-              <w:t>11</w:t>
-            </w:r>
-          </w:p>
-        </w:tc>
-        <w:tc>
-          <w:tcPr>
-            <w:tcW w:w="1701" w:type="dxa"/>
-          </w:tcPr>
-          <w:p>
-            <w:pPr>
-              <w:widowControl/>
-              <w:wordWrap/>
-              <w:autoSpaceDE/>
-              <w:autoSpaceDN/>
-              <w:rPr>
-                <w:color w:val="960000"/>
-                <w:sz w:val="16"/>
-                <w:szCs w:val="16"/>
-              </w:rPr>
-            </w:pPr>
-            <w:r>
-              <w:rPr>
-                <w:rFonts w:hint="eastAsia"/>
-                <w:sz w:val="16"/>
-                <w:szCs w:val="16"/>
-              </w:rPr>
-              <w:t>12</w:t>
-            </w:r>
-          </w:p>
-          <w:p>
-            <w:pPr>
-              <w:widowControl/>
-              <w:wordWrap/>
-              <w:autoSpaceDE/>
-              <w:autoSpaceDN/>
-              <w:rPr>
-                <w:color w:val="960000"/>
-                <w:sz w:val="16"/>
-                <w:szCs w:val="16"/>
-              </w:rPr>
-            </w:pPr>
-            <w:proofErr w:type="spellStart"/>
-            <w:r>
-              <w:rPr>
-                <w:rFonts w:hint="eastAsia"/>
-                <w:color w:val="960000"/>
-                <w:sz w:val="16"/>
-                <w:szCs w:val="16"/>
-              </w:rPr>
-              <w:t>패킷테스트</w:t>
-            </w:r>
-            <w:proofErr w:type="spellEnd"/>
-          </w:p>
-          <w:p>
-            <w:pPr>
-              <w:widowControl/>
-              <w:wordWrap/>
-              <w:autoSpaceDE/>
-              <w:autoSpaceDN/>
-              <w:rPr>
-                <w:sz w:val="16"/>
-                <w:szCs w:val="16"/>
-              </w:rPr>
-            </w:pPr>
-            <w:r>
-              <w:rPr>
-                <w:rFonts w:hint="eastAsia"/>
-                <w:color w:val="960000"/>
-                <w:sz w:val="16"/>
-                <w:szCs w:val="16"/>
-              </w:rPr>
-              <w:t>진행 보고</w:t>
-            </w:r>
-          </w:p>
-        </w:tc>
-        <w:tc>
-          <w:tcPr>
-            <w:tcW w:w="1701" w:type="dxa"/>
-          </w:tcPr>
-          <w:p>
-            <w:pPr>
-              <w:widowControl/>
-              <w:wordWrap/>
-              <w:autoSpaceDE/>
-              <w:autoSpaceDN/>
-              <w:rPr>
-                <w:sz w:val="16"/>
-                <w:szCs w:val="16"/>
-              </w:rPr>
-            </w:pPr>
-            <w:r>
-              <w:rPr>
-                <w:rFonts w:hint="eastAsia"/>
-                <w:sz w:val="16"/>
-                <w:szCs w:val="16"/>
-              </w:rPr>
-              <w:t>13</w:t>
-            </w:r>
-          </w:p>
-          <w:p>
-            <w:pPr>
-              <w:widowControl/>
-              <w:wordWrap/>
-              <w:autoSpaceDE/>
-              <w:autoSpaceDN/>
+              <w:t>S</w:t>
+            </w:r>
+            <w:r>
+              <w:rPr>
+                <w:rFonts w:eastAsiaTheme="minorHAnsi" w:hint="eastAsia"/>
+                <w:sz w:val="16"/>
+                <w:szCs w:val="16"/>
+              </w:rPr>
+              <w:t xml:space="preserve">erver </w:t>
+            </w:r>
+            <w:r>
               <w:rPr>
                 <w:rFonts w:eastAsiaTheme="minorHAnsi"/>
                 <w:sz w:val="16"/>
                 <w:szCs w:val="16"/>
               </w:rPr>
-            </w:pPr>
-            <w:proofErr w:type="spellStart"/>
-            <w:r>
-              <w:rPr>
-                <w:rFonts w:eastAsiaTheme="minorHAnsi"/>
-                <w:sz w:val="16"/>
-                <w:szCs w:val="16"/>
-              </w:rPr>
-              <w:t>send_ready_packet</w:t>
-            </w:r>
-            <w:proofErr w:type="spellEnd"/>
-            <w:r>
-              <w:rPr>
-                <w:rFonts w:eastAsiaTheme="minorHAnsi"/>
-                <w:sz w:val="16"/>
-                <w:szCs w:val="16"/>
-              </w:rPr>
-              <w:t>(</w:t>
-            </w:r>
-            <w:proofErr w:type="spellStart"/>
-            <w:r>
-              <w:rPr>
-                <w:rFonts w:eastAsiaTheme="minorHAnsi"/>
-                <w:sz w:val="16"/>
-                <w:szCs w:val="16"/>
-              </w:rPr>
-              <w:t>target_id</w:t>
-            </w:r>
-            <w:proofErr w:type="spellEnd"/>
-            <w:r>
-              <w:rPr>
-                <w:rFonts w:eastAsiaTheme="minorHAnsi"/>
-                <w:sz w:val="16"/>
-                <w:szCs w:val="16"/>
-              </w:rPr>
-              <w:t>)</w:t>
-            </w:r>
-          </w:p>
-          <w:p>
-            <w:pPr>
-              <w:widowControl/>
-              <w:wordWrap/>
-              <w:autoSpaceDE/>
-              <w:autoSpaceDN/>
-              <w:rPr>
-                <w:sz w:val="16"/>
-                <w:szCs w:val="16"/>
-              </w:rPr>
-            </w:pPr>
-            <w:r>
-              <w:rPr>
-                <w:rFonts w:eastAsiaTheme="minorHAnsi"/>
-                <w:sz w:val="16"/>
-                <w:szCs w:val="16"/>
-              </w:rPr>
-              <w:t>S</w:t>
+              <w:t>P</w:t>
             </w:r>
             <w:r>
               <w:rPr>
@@ -4706,33 +4237,7 @@
                 <w:sz w:val="16"/>
                 <w:szCs w:val="16"/>
               </w:rPr>
-              <w:t xml:space="preserve">erver </w:t>
-            </w:r>
-            <w:proofErr w:type="spellStart"/>
-            <w:r>
-              <w:rPr>
-                <w:rFonts w:eastAsiaTheme="minorHAnsi"/>
-                <w:sz w:val="16"/>
-                <w:szCs w:val="16"/>
-              </w:rPr>
-              <w:t>P</w:t>
-            </w:r>
-            <w:r>
-              <w:rPr>
-                <w:rFonts w:eastAsiaTheme="minorHAnsi" w:hint="eastAsia"/>
-                <w:sz w:val="16"/>
-                <w:szCs w:val="16"/>
-              </w:rPr>
-              <w:t>rocess_packet</w:t>
-            </w:r>
-            <w:proofErr w:type="spellEnd"/>
-            <w:r>
-              <w:rPr>
-                <w:rFonts w:eastAsiaTheme="minorHAnsi" w:hint="eastAsia"/>
-                <w:sz w:val="16"/>
-                <w:szCs w:val="16"/>
-              </w:rPr>
-              <w:t>() 업데이트</w:t>
+              <w:t>rocess_packet() 업데이트</w:t>
             </w:r>
           </w:p>
         </w:tc>
@@ -4995,7 +4500,6 @@
                 <w:szCs w:val="16"/>
               </w:rPr>
             </w:pPr>
-            <w:proofErr w:type="spellStart"/>
             <w:r>
               <w:rPr>
                 <w:rFonts w:hint="eastAsia"/>
@@ -5005,7 +4509,6 @@
               </w:rPr>
               <w:t>패킷테스트</w:t>
             </w:r>
-            <w:proofErr w:type="spellEnd"/>
           </w:p>
           <w:p>
             <w:pPr>
@@ -5080,7 +4583,6 @@
               </w:rPr>
               <w:t xml:space="preserve">erver </w:t>
             </w:r>
-            <w:proofErr w:type="spellStart"/>
             <w:r>
               <w:rPr>
                 <w:rFonts w:eastAsiaTheme="minorHAnsi"/>
@@ -5095,16 +4597,7 @@
                 <w:sz w:val="16"/>
                 <w:szCs w:val="16"/>
               </w:rPr>
-              <w:t>rocess_packet</w:t>
-            </w:r>
-            <w:proofErr w:type="spellEnd"/>
-            <w:r>
-              <w:rPr>
-                <w:rFonts w:eastAsiaTheme="minorHAnsi" w:hint="eastAsia"/>
-                <w:sz w:val="16"/>
-                <w:szCs w:val="16"/>
-              </w:rPr>
-              <w:t>() 업데이트</w:t>
+              <w:t>rocess_packet() 업데이트</w:t>
             </w:r>
           </w:p>
         </w:tc>
@@ -5319,7 +4812,6 @@
                 <w:szCs w:val="16"/>
               </w:rPr>
             </w:pPr>
-            <w:proofErr w:type="spellStart"/>
             <w:r>
               <w:rPr>
                 <w:rFonts w:hint="eastAsia"/>
@@ -5329,7 +4821,6 @@
               </w:rPr>
               <w:t>패킷테스트</w:t>
             </w:r>
-            <w:proofErr w:type="spellEnd"/>
           </w:p>
           <w:p>
             <w:pPr>
@@ -5404,7 +4895,6 @@
               </w:rPr>
               <w:t xml:space="preserve">erver </w:t>
             </w:r>
-            <w:proofErr w:type="spellStart"/>
             <w:r>
               <w:rPr>
                 <w:rFonts w:eastAsiaTheme="minorHAnsi"/>
@@ -5419,16 +4909,7 @@
                 <w:sz w:val="16"/>
                 <w:szCs w:val="16"/>
               </w:rPr>
-              <w:t>rocess_packet</w:t>
-            </w:r>
-            <w:proofErr w:type="spellEnd"/>
-            <w:r>
-              <w:rPr>
-                <w:rFonts w:eastAsiaTheme="minorHAnsi" w:hint="eastAsia"/>
-                <w:sz w:val="16"/>
-                <w:szCs w:val="16"/>
-              </w:rPr>
-              <w:t>() 업데이트</w:t>
+              <w:t>rocess_packet() 업데이트</w:t>
             </w:r>
           </w:p>
         </w:tc>
@@ -5628,7 +5109,6 @@
                 <w:szCs w:val="16"/>
               </w:rPr>
             </w:pPr>
-            <w:proofErr w:type="spellStart"/>
             <w:r>
               <w:rPr>
                 <w:rFonts w:hint="eastAsia"/>
@@ -5638,7 +5118,6 @@
               </w:rPr>
               <w:t>패킷테스트</w:t>
             </w:r>
-            <w:proofErr w:type="spellEnd"/>
           </w:p>
           <w:p>
             <w:pPr>
@@ -6154,14 +5633,12 @@
         <w:autoSpaceDE/>
         <w:autoSpaceDN/>
       </w:pPr>
-      <w:proofErr w:type="spellStart"/>
       <w:r>
         <w:rPr>
           <w:rFonts w:hint="eastAsia"/>
         </w:rPr>
         <w:t>유영빈</w:t>
       </w:r>
-      <w:proofErr w:type="spellEnd"/>
     </w:p>
     <w:tbl>
       <w:tblPr>
@@ -6605,7 +6082,6 @@
               </w:rPr>
               <w:t xml:space="preserve">client </w:t>
             </w:r>
-            <w:proofErr w:type="spellStart"/>
             <w:r>
               <w:rPr>
                 <w:rFonts w:eastAsiaTheme="minorHAnsi" w:hint="eastAsia"/>
@@ -6614,7 +6090,6 @@
               </w:rPr>
               <w:t>RecvThread</w:t>
             </w:r>
-            <w:proofErr w:type="spellEnd"/>
           </w:p>
           <w:p>
             <w:pPr>
@@ -6744,25 +6219,7 @@
                 <w:sz w:val="16"/>
                 <w:szCs w:val="16"/>
               </w:rPr>
-              <w:t xml:space="preserve">로그인/로비 화면 </w:t>
-            </w:r>
-            <w:proofErr w:type="spellStart"/>
-            <w:r>
-              <w:rPr>
-                <w:rFonts w:hint="eastAsia"/>
-                <w:sz w:val="16"/>
-                <w:szCs w:val="16"/>
-              </w:rPr>
-              <w:t>ui</w:t>
-            </w:r>
-            <w:proofErr w:type="spellEnd"/>
-            <w:r>
-              <w:rPr>
-                <w:rFonts w:hint="eastAsia"/>
-                <w:sz w:val="16"/>
-                <w:szCs w:val="16"/>
-              </w:rPr>
-              <w:t xml:space="preserve"> 구현</w:t>
+              <w:t>로그인/로비 화면 ui 구현</w:t>
             </w:r>
           </w:p>
         </w:tc>
@@ -6897,7 +6354,6 @@
                 <w:szCs w:val="16"/>
               </w:rPr>
             </w:pPr>
-            <w:proofErr w:type="spellStart"/>
             <w:r>
               <w:rPr>
                 <w:rFonts w:hint="eastAsia"/>
@@ -6907,7 +6363,6 @@
               </w:rPr>
               <w:t>패킷테스트</w:t>
             </w:r>
-            <w:proofErr w:type="spellEnd"/>
           </w:p>
           <w:p>
             <w:pPr>
@@ -7240,7 +6695,6 @@
                 <w:szCs w:val="16"/>
               </w:rPr>
             </w:pPr>
-            <w:proofErr w:type="spellStart"/>
             <w:r>
               <w:rPr>
                 <w:rFonts w:hint="eastAsia"/>
@@ -7250,7 +6704,6 @@
               </w:rPr>
               <w:t>패킷테스트</w:t>
             </w:r>
-            <w:proofErr w:type="spellEnd"/>
           </w:p>
           <w:p>
             <w:pPr>
@@ -7310,7 +6763,6 @@
                 <w:szCs w:val="16"/>
               </w:rPr>
             </w:pPr>
-            <w:proofErr w:type="spellStart"/>
             <w:proofErr w:type="gramStart"/>
             <w:r>
               <w:rPr>
@@ -7318,16 +6770,7 @@
                 <w:sz w:val="16"/>
                 <w:szCs w:val="16"/>
               </w:rPr>
-              <w:t>CollisionCheck</w:t>
-            </w:r>
-            <w:proofErr w:type="spellEnd"/>
-            <w:r>
-              <w:rPr>
-                <w:rFonts w:eastAsiaTheme="minorHAnsi"/>
-                <w:sz w:val="16"/>
-                <w:szCs w:val="16"/>
-              </w:rPr>
-              <w:t>(</w:t>
+              <w:t>CollisionCheck(</w:t>
             </w:r>
             <w:proofErr w:type="gramEnd"/>
             <w:r>
@@ -7476,25 +6919,7 @@
                 <w:sz w:val="16"/>
                 <w:szCs w:val="16"/>
               </w:rPr>
-              <w:t xml:space="preserve">대기실 화면 </w:t>
-            </w:r>
-            <w:proofErr w:type="spellStart"/>
-            <w:r>
-              <w:rPr>
-                <w:rFonts w:hint="eastAsia"/>
-                <w:sz w:val="16"/>
-                <w:szCs w:val="16"/>
-              </w:rPr>
-              <w:t>ui</w:t>
-            </w:r>
-            <w:proofErr w:type="spellEnd"/>
-            <w:r>
-              <w:rPr>
-                <w:rFonts w:hint="eastAsia"/>
-                <w:sz w:val="16"/>
-                <w:szCs w:val="16"/>
-              </w:rPr>
-              <w:t xml:space="preserve"> 구현</w:t>
+              <w:t>대기실 화면 ui 구현</w:t>
             </w:r>
           </w:p>
         </w:tc>
@@ -7533,7 +6958,6 @@
                 <w:szCs w:val="16"/>
               </w:rPr>
             </w:pPr>
-            <w:proofErr w:type="spellStart"/>
             <w:proofErr w:type="gramStart"/>
             <w:r>
               <w:rPr>
@@ -7541,202 +6965,181 @@
                 <w:sz w:val="16"/>
                 <w:szCs w:val="16"/>
               </w:rPr>
-              <w:t>WallCollisionCheck</w:t>
-            </w:r>
-            <w:proofErr w:type="spellEnd"/>
+              <w:t>WallCollisionCheck(</w:t>
+            </w:r>
+            <w:proofErr w:type="gramEnd"/>
             <w:r>
               <w:rPr>
                 <w:rFonts w:eastAsiaTheme="minorHAnsi"/>
                 <w:sz w:val="16"/>
                 <w:szCs w:val="16"/>
               </w:rPr>
-              <w:t>(</w:t>
-            </w:r>
-            <w:proofErr w:type="gramEnd"/>
-            <w:r>
+              <w:t>) </w:t>
+            </w:r>
+          </w:p>
+          <w:p>
+            <w:pPr>
+              <w:widowControl/>
+              <w:wordWrap/>
+              <w:autoSpaceDE/>
+              <w:autoSpaceDN/>
+              <w:rPr>
+                <w:sz w:val="16"/>
+                <w:szCs w:val="16"/>
+              </w:rPr>
+            </w:pPr>
+          </w:p>
+        </w:tc>
+        <w:tc>
+          <w:tcPr>
+            <w:tcW w:w="1701" w:type="dxa"/>
+          </w:tcPr>
+          <w:p>
+            <w:pPr>
+              <w:widowControl/>
+              <w:wordWrap/>
+              <w:autoSpaceDE/>
+              <w:autoSpaceDN/>
+              <w:rPr>
+                <w:sz w:val="16"/>
+                <w:szCs w:val="16"/>
+              </w:rPr>
+            </w:pPr>
+            <w:r>
+              <w:rPr>
+                <w:rFonts w:hint="eastAsia"/>
+                <w:sz w:val="16"/>
+                <w:szCs w:val="16"/>
+              </w:rPr>
+              <w:t>18</w:t>
+            </w:r>
+          </w:p>
+          <w:p>
+            <w:pPr>
+              <w:widowControl/>
+              <w:wordWrap/>
+              <w:autoSpaceDE/>
+              <w:autoSpaceDN/>
+              <w:rPr>
+                <w:sz w:val="16"/>
+                <w:szCs w:val="16"/>
+              </w:rPr>
+            </w:pPr>
+          </w:p>
+        </w:tc>
+        <w:tc>
+          <w:tcPr>
+            <w:tcW w:w="1701" w:type="dxa"/>
+          </w:tcPr>
+          <w:p>
+            <w:pPr>
+              <w:widowControl/>
+              <w:wordWrap/>
+              <w:autoSpaceDE/>
+              <w:autoSpaceDN/>
+              <w:rPr>
+                <w:color w:val="960000"/>
+                <w:sz w:val="16"/>
+                <w:szCs w:val="16"/>
+              </w:rPr>
+            </w:pPr>
+            <w:r>
+              <w:rPr>
+                <w:rFonts w:hint="eastAsia"/>
+                <w:sz w:val="16"/>
+                <w:szCs w:val="16"/>
+              </w:rPr>
+              <w:t>19</w:t>
+            </w:r>
+          </w:p>
+          <w:p>
+            <w:pPr>
+              <w:widowControl/>
+              <w:wordWrap/>
+              <w:autoSpaceDE/>
+              <w:autoSpaceDN/>
+              <w:rPr>
+                <w:color w:val="960000"/>
+                <w:sz w:val="16"/>
+                <w:szCs w:val="16"/>
+              </w:rPr>
+            </w:pPr>
+            <w:r>
+              <w:rPr>
+                <w:rFonts w:hint="eastAsia"/>
+                <w:color w:val="960000"/>
+                <w:sz w:val="16"/>
+                <w:szCs w:val="16"/>
+              </w:rPr>
+              <w:t>패킷테스트</w:t>
+            </w:r>
+          </w:p>
+          <w:p>
+            <w:pPr>
+              <w:widowControl/>
+              <w:wordWrap/>
+              <w:autoSpaceDE/>
+              <w:autoSpaceDN/>
+              <w:rPr>
+                <w:sz w:val="16"/>
+                <w:szCs w:val="16"/>
+              </w:rPr>
+            </w:pPr>
+            <w:r>
+              <w:rPr>
+                <w:rFonts w:hint="eastAsia"/>
+                <w:color w:val="960000"/>
+                <w:sz w:val="16"/>
+                <w:szCs w:val="16"/>
+              </w:rPr>
+              <w:t>진행 보고</w:t>
+            </w:r>
+          </w:p>
+        </w:tc>
+        <w:tc>
+          <w:tcPr>
+            <w:tcW w:w="1701" w:type="dxa"/>
+          </w:tcPr>
+          <w:p>
+            <w:pPr>
+              <w:widowControl/>
+              <w:wordWrap/>
+              <w:autoSpaceDE/>
+              <w:autoSpaceDN/>
+              <w:rPr>
+                <w:sz w:val="16"/>
+                <w:szCs w:val="16"/>
+              </w:rPr>
+            </w:pPr>
+            <w:r>
+              <w:rPr>
+                <w:rFonts w:hint="eastAsia"/>
+                <w:sz w:val="16"/>
+                <w:szCs w:val="16"/>
+              </w:rPr>
+              <w:t>20</w:t>
+            </w:r>
+          </w:p>
+          <w:p>
+            <w:pPr>
+              <w:widowControl/>
+              <w:wordWrap/>
+              <w:autoSpaceDE/>
+              <w:autoSpaceDN/>
               <w:rPr>
                 <w:rFonts w:eastAsiaTheme="minorHAnsi"/>
                 <w:sz w:val="16"/>
                 <w:szCs w:val="16"/>
               </w:rPr>
-              <w:t>) </w:t>
-            </w:r>
-          </w:p>
-          <w:p>
-            <w:pPr>
-              <w:widowControl/>
-              <w:wordWrap/>
-              <w:autoSpaceDE/>
-              <w:autoSpaceDN/>
-              <w:rPr>
-                <w:sz w:val="16"/>
-                <w:szCs w:val="16"/>
-              </w:rPr>
-            </w:pPr>
-          </w:p>
-        </w:tc>
-        <w:tc>
-          <w:tcPr>
-            <w:tcW w:w="1701" w:type="dxa"/>
-          </w:tcPr>
-          <w:p>
-            <w:pPr>
-              <w:widowControl/>
-              <w:wordWrap/>
-              <w:autoSpaceDE/>
-              <w:autoSpaceDN/>
-              <w:rPr>
-                <w:sz w:val="16"/>
-                <w:szCs w:val="16"/>
-              </w:rPr>
-            </w:pPr>
-            <w:r>
-              <w:rPr>
-                <w:rFonts w:hint="eastAsia"/>
-                <w:sz w:val="16"/>
-                <w:szCs w:val="16"/>
-              </w:rPr>
-              <w:t>18</w:t>
-            </w:r>
-          </w:p>
-          <w:p>
-            <w:pPr>
-              <w:widowControl/>
-              <w:wordWrap/>
-              <w:autoSpaceDE/>
-              <w:autoSpaceDN/>
-              <w:rPr>
-                <w:sz w:val="16"/>
-                <w:szCs w:val="16"/>
-              </w:rPr>
-            </w:pPr>
-          </w:p>
-        </w:tc>
-        <w:tc>
-          <w:tcPr>
-            <w:tcW w:w="1701" w:type="dxa"/>
-          </w:tcPr>
-          <w:p>
-            <w:pPr>
-              <w:widowControl/>
-              <w:wordWrap/>
-              <w:autoSpaceDE/>
-              <w:autoSpaceDN/>
-              <w:rPr>
-                <w:color w:val="960000"/>
-                <w:sz w:val="16"/>
-                <w:szCs w:val="16"/>
-              </w:rPr>
-            </w:pPr>
-            <w:r>
-              <w:rPr>
-                <w:rFonts w:hint="eastAsia"/>
-                <w:sz w:val="16"/>
-                <w:szCs w:val="16"/>
-              </w:rPr>
-              <w:t>19</w:t>
-            </w:r>
-          </w:p>
-          <w:p>
-            <w:pPr>
-              <w:widowControl/>
-              <w:wordWrap/>
-              <w:autoSpaceDE/>
-              <w:autoSpaceDN/>
-              <w:rPr>
-                <w:color w:val="960000"/>
-                <w:sz w:val="16"/>
-                <w:szCs w:val="16"/>
-              </w:rPr>
-            </w:pPr>
-            <w:proofErr w:type="spellStart"/>
-            <w:r>
-              <w:rPr>
-                <w:rFonts w:hint="eastAsia"/>
-                <w:color w:val="960000"/>
-                <w:sz w:val="16"/>
-                <w:szCs w:val="16"/>
-              </w:rPr>
-              <w:t>패킷테스트</w:t>
-            </w:r>
-            <w:proofErr w:type="spellEnd"/>
-          </w:p>
-          <w:p>
-            <w:pPr>
-              <w:widowControl/>
-              <w:wordWrap/>
-              <w:autoSpaceDE/>
-              <w:autoSpaceDN/>
-              <w:rPr>
-                <w:sz w:val="16"/>
-                <w:szCs w:val="16"/>
-              </w:rPr>
-            </w:pPr>
-            <w:r>
-              <w:rPr>
-                <w:rFonts w:hint="eastAsia"/>
-                <w:color w:val="960000"/>
-                <w:sz w:val="16"/>
-                <w:szCs w:val="16"/>
-              </w:rPr>
-              <w:t>진행 보고</w:t>
-            </w:r>
-          </w:p>
-        </w:tc>
-        <w:tc>
-          <w:tcPr>
-            <w:tcW w:w="1701" w:type="dxa"/>
-          </w:tcPr>
-          <w:p>
-            <w:pPr>
-              <w:widowControl/>
-              <w:wordWrap/>
-              <w:autoSpaceDE/>
-              <w:autoSpaceDN/>
-              <w:rPr>
-                <w:sz w:val="16"/>
-                <w:szCs w:val="16"/>
-              </w:rPr>
-            </w:pPr>
-            <w:r>
-              <w:rPr>
-                <w:rFonts w:hint="eastAsia"/>
-                <w:sz w:val="16"/>
-                <w:szCs w:val="16"/>
-              </w:rPr>
-              <w:t>20</w:t>
-            </w:r>
-          </w:p>
-          <w:p>
-            <w:pPr>
-              <w:widowControl/>
-              <w:wordWrap/>
-              <w:autoSpaceDE/>
-              <w:autoSpaceDN/>
+            </w:pPr>
+            <w:proofErr w:type="gramStart"/>
+            <w:r>
               <w:rPr>
                 <w:rFonts w:eastAsiaTheme="minorHAnsi"/>
                 <w:sz w:val="16"/>
                 <w:szCs w:val="16"/>
               </w:rPr>
-            </w:pPr>
-            <w:proofErr w:type="spellStart"/>
-            <w:proofErr w:type="gramStart"/>
-            <w:r>
-              <w:rPr>
-                <w:rFonts w:eastAsiaTheme="minorHAnsi"/>
-                <w:sz w:val="16"/>
-                <w:szCs w:val="16"/>
-              </w:rPr>
-              <w:t>PlayerCollisionCheck</w:t>
-            </w:r>
-            <w:proofErr w:type="spellEnd"/>
-            <w:r>
-              <w:rPr>
-                <w:rFonts w:eastAsiaTheme="minorHAnsi"/>
-                <w:sz w:val="16"/>
-                <w:szCs w:val="16"/>
-              </w:rPr>
-              <w:t>(</w:t>
+              <w:t>PlayerCollisionCheck(</w:t>
             </w:r>
             <w:proofErr w:type="gramEnd"/>
             <w:r>
@@ -7989,7 +7392,6 @@
                 <w:szCs w:val="16"/>
               </w:rPr>
             </w:pPr>
-            <w:proofErr w:type="spellStart"/>
             <w:r>
               <w:rPr>
                 <w:rFonts w:hint="eastAsia"/>
@@ -7999,7 +7401,6 @@
               </w:rPr>
               <w:t>패킷테스트</w:t>
             </w:r>
-            <w:proofErr w:type="spellEnd"/>
           </w:p>
           <w:p>
             <w:pPr>
@@ -8282,7 +7683,6 @@
                 <w:szCs w:val="16"/>
               </w:rPr>
             </w:pPr>
-            <w:proofErr w:type="spellStart"/>
             <w:r>
               <w:rPr>
                 <w:rFonts w:hint="eastAsia"/>
@@ -8292,7 +7692,6 @@
               </w:rPr>
               <w:t>패킷테스트</w:t>
             </w:r>
-            <w:proofErr w:type="spellEnd"/>
           </w:p>
           <w:p>
             <w:pPr>
@@ -9343,7 +8742,6 @@
                 <w:szCs w:val="16"/>
               </w:rPr>
             </w:pPr>
-            <w:proofErr w:type="spellStart"/>
             <w:r>
               <w:rPr>
                 <w:rFonts w:hint="eastAsia"/>
@@ -9354,7 +8752,6 @@
               </w:rPr>
               <w:t>NetworkMgr</w:t>
             </w:r>
-            <w:proofErr w:type="spellEnd"/>
           </w:p>
           <w:p>
             <w:pPr>
@@ -9379,7 +8776,6 @@
               </w:rPr>
               <w:t>::</w:t>
             </w:r>
-            <w:proofErr w:type="spellStart"/>
             <w:proofErr w:type="gramEnd"/>
             <w:r>
               <w:rPr>
@@ -9389,9 +8785,8 @@
                 <w:sz w:val="16"/>
                 <w:szCs w:val="16"/>
               </w:rPr>
-              <w:t>SendPacket</w:t>
-            </w:r>
-            <w:proofErr w:type="spellEnd"/>
+              <w:t>SendPacket()</w:t>
+            </w:r>
             <w:r>
               <w:rPr>
                 <w:rFonts w:hint="eastAsia"/>
@@ -9400,43 +8795,31 @@
                 <w:sz w:val="16"/>
                 <w:szCs w:val="16"/>
               </w:rPr>
-              <w:t>()</w:t>
-            </w:r>
-            <w:r>
-              <w:rPr>
-                <w:rFonts w:hint="eastAsia"/>
+              <w:t>,</w:t>
+            </w:r>
+          </w:p>
+          <w:p>
+            <w:pPr>
+              <w:widowControl/>
+              <w:wordWrap/>
+              <w:autoSpaceDE/>
+              <w:rPr>
                 <w:b/>
                 <w:bCs/>
                 <w:sz w:val="16"/>
                 <w:szCs w:val="16"/>
               </w:rPr>
-              <w:t>,</w:t>
-            </w:r>
-          </w:p>
-          <w:p>
-            <w:pPr>
-              <w:widowControl/>
-              <w:wordWrap/>
-              <w:autoSpaceDE/>
-              <w:rPr>
+            </w:pPr>
+            <w:r>
+              <w:rPr>
+                <w:rFonts w:hint="eastAsia"/>
                 <w:b/>
                 <w:bCs/>
                 <w:sz w:val="16"/>
                 <w:szCs w:val="16"/>
               </w:rPr>
-            </w:pPr>
-            <w:proofErr w:type="spellStart"/>
-            <w:r>
-              <w:rPr>
-                <w:rFonts w:hint="eastAsia"/>
-                <w:b/>
-                <w:bCs/>
-                <w:sz w:val="16"/>
-                <w:szCs w:val="16"/>
-              </w:rPr>
               <w:t>NetworkMgr</w:t>
             </w:r>
-            <w:proofErr w:type="spellEnd"/>
           </w:p>
           <w:p>
             <w:pPr>
@@ -9636,29 +9019,7 @@
                 <w:sz w:val="16"/>
                 <w:szCs w:val="16"/>
               </w:rPr>
-              <w:t xml:space="preserve"> </w:t>
-            </w:r>
-            <w:proofErr w:type="spellStart"/>
-            <w:r>
-              <w:rPr>
-                <w:rFonts w:hint="eastAsia"/>
-                <w:b/>
-                <w:bCs/>
-                <w:sz w:val="16"/>
-                <w:szCs w:val="16"/>
-              </w:rPr>
-              <w:t>RecvThread</w:t>
-            </w:r>
-            <w:proofErr w:type="spellEnd"/>
-            <w:r>
-              <w:rPr>
-                <w:rFonts w:hint="eastAsia"/>
-                <w:b/>
-                <w:bCs/>
-                <w:sz w:val="16"/>
-                <w:szCs w:val="16"/>
-              </w:rPr>
-              <w:t>()</w:t>
+              <w:t xml:space="preserve"> RecvThread()</w:t>
             </w:r>
           </w:p>
           <w:p>
@@ -9756,7 +9117,6 @@
                 <w:szCs w:val="16"/>
               </w:rPr>
             </w:pPr>
-            <w:proofErr w:type="spellStart"/>
             <w:proofErr w:type="gramStart"/>
             <w:r>
               <w:rPr>
@@ -9764,56 +9124,37 @@
                 <w:sz w:val="16"/>
                 <w:szCs w:val="16"/>
               </w:rPr>
-              <w:t>RecvThread</w:t>
-            </w:r>
-            <w:proofErr w:type="spellEnd"/>
+              <w:t>RecvThread(</w:t>
+            </w:r>
+            <w:proofErr w:type="gramEnd"/>
             <w:r>
               <w:rPr>
                 <w:rFonts w:asciiTheme="majorEastAsia" w:eastAsiaTheme="majorEastAsia" w:hAnsiTheme="majorEastAsia" w:hint="eastAsia"/>
                 <w:sz w:val="16"/>
                 <w:szCs w:val="16"/>
               </w:rPr>
-              <w:t>(</w:t>
-            </w:r>
-            <w:proofErr w:type="gramEnd"/>
+              <w:t xml:space="preserve">), </w:t>
+            </w:r>
+          </w:p>
+          <w:p>
+            <w:pPr>
+              <w:widowControl/>
+              <w:wordWrap/>
+              <w:autoSpaceDE/>
+              <w:rPr>
+                <w:rFonts w:asciiTheme="majorEastAsia" w:eastAsiaTheme="majorEastAsia" w:hAnsiTheme="majorEastAsia"/>
+                <w:sz w:val="16"/>
+                <w:szCs w:val="16"/>
+              </w:rPr>
+            </w:pPr>
+            <w:proofErr w:type="gramStart"/>
             <w:r>
               <w:rPr>
                 <w:rFonts w:asciiTheme="majorEastAsia" w:eastAsiaTheme="majorEastAsia" w:hAnsiTheme="majorEastAsia" w:hint="eastAsia"/>
                 <w:sz w:val="16"/>
                 <w:szCs w:val="16"/>
               </w:rPr>
-              <w:t xml:space="preserve">), </w:t>
-            </w:r>
-          </w:p>
-          <w:p>
-            <w:pPr>
-              <w:widowControl/>
-              <w:wordWrap/>
-              <w:autoSpaceDE/>
-              <w:rPr>
-                <w:rFonts w:asciiTheme="majorEastAsia" w:eastAsiaTheme="majorEastAsia" w:hAnsiTheme="majorEastAsia"/>
-                <w:sz w:val="16"/>
-                <w:szCs w:val="16"/>
-              </w:rPr>
-            </w:pPr>
-            <w:proofErr w:type="spellStart"/>
-            <w:proofErr w:type="gramStart"/>
-            <w:r>
-              <w:rPr>
-                <w:rFonts w:asciiTheme="majorEastAsia" w:eastAsiaTheme="majorEastAsia" w:hAnsiTheme="majorEastAsia" w:hint="eastAsia"/>
-                <w:sz w:val="16"/>
-                <w:szCs w:val="16"/>
-              </w:rPr>
-              <w:t>Processpacket</w:t>
-            </w:r>
-            <w:proofErr w:type="spellEnd"/>
-            <w:r>
-              <w:rPr>
-                <w:rFonts w:asciiTheme="majorEastAsia" w:eastAsiaTheme="majorEastAsia" w:hAnsiTheme="majorEastAsia" w:hint="eastAsia"/>
-                <w:sz w:val="16"/>
-                <w:szCs w:val="16"/>
-              </w:rPr>
-              <w:t>(</w:t>
+              <w:t>Processpacket(</w:t>
             </w:r>
             <w:proofErr w:type="gramEnd"/>
             <w:r>
@@ -9930,7 +9271,6 @@
                 <w:szCs w:val="16"/>
               </w:rPr>
             </w:pPr>
-            <w:proofErr w:type="spellStart"/>
             <w:r>
               <w:rPr>
                 <w:rFonts w:hint="eastAsia"/>
@@ -9940,7 +9280,6 @@
               </w:rPr>
               <w:t>패킷테스트</w:t>
             </w:r>
-            <w:proofErr w:type="spellEnd"/>
           </w:p>
           <w:p>
             <w:pPr>
@@ -10004,7 +9343,6 @@
                 <w:szCs w:val="16"/>
               </w:rPr>
             </w:pPr>
-            <w:proofErr w:type="spellStart"/>
             <w:r>
               <w:rPr>
                 <w:rFonts w:hint="eastAsia"/>
@@ -10013,7 +9351,6 @@
               </w:rPr>
               <w:t>send_playerInfo</w:t>
             </w:r>
-            <w:proofErr w:type="spellEnd"/>
           </w:p>
           <w:p>
             <w:pPr>
@@ -10143,7 +9480,6 @@
                 <w:szCs w:val="16"/>
               </w:rPr>
             </w:pPr>
-            <w:proofErr w:type="spellStart"/>
             <w:r>
               <w:rPr>
                 <w:rFonts w:hint="eastAsia"/>
@@ -10152,7 +9488,6 @@
               </w:rPr>
               <w:t>UpdatePosition</w:t>
             </w:r>
-            <w:proofErr w:type="spellEnd"/>
           </w:p>
           <w:p>
             <w:pPr>
@@ -10292,7 +9627,6 @@
                 <w:szCs w:val="16"/>
               </w:rPr>
             </w:pPr>
-            <w:proofErr w:type="spellStart"/>
             <w:r>
               <w:rPr>
                 <w:rFonts w:asciiTheme="majorEastAsia" w:eastAsiaTheme="majorEastAsia" w:hAnsiTheme="majorEastAsia" w:hint="eastAsia"/>
@@ -10301,7 +9635,6 @@
               </w:rPr>
               <w:t>Processpacket</w:t>
             </w:r>
-            <w:proofErr w:type="spellEnd"/>
           </w:p>
           <w:p>
             <w:pPr>
@@ -10371,7 +9704,6 @@
               </w:rPr>
               <w:t xml:space="preserve"> </w:t>
             </w:r>
-            <w:proofErr w:type="spellStart"/>
             <w:r>
               <w:rPr>
                 <w:rFonts w:hint="eastAsia"/>
@@ -10380,34 +9712,24 @@
               </w:rPr>
               <w:t>send_Game</w:t>
             </w:r>
-            <w:proofErr w:type="spellEnd"/>
-          </w:p>
-          <w:p>
-            <w:pPr>
-              <w:widowControl/>
-              <w:wordWrap/>
-              <w:autoSpaceDE/>
-              <w:rPr>
-                <w:sz w:val="16"/>
-                <w:szCs w:val="16"/>
-              </w:rPr>
-            </w:pPr>
-            <w:r>
-              <w:rPr>
-                <w:rFonts w:hint="eastAsia"/>
-                <w:sz w:val="16"/>
-                <w:szCs w:val="16"/>
-              </w:rPr>
-              <w:t>_</w:t>
-            </w:r>
-            <w:proofErr w:type="spellStart"/>
-            <w:r>
-              <w:rPr>
-                <w:rFonts w:hint="eastAsia"/>
-                <w:sz w:val="16"/>
-                <w:szCs w:val="16"/>
-              </w:rPr>
-              <w:t>Start_</w:t>
+          </w:p>
+          <w:p>
+            <w:pPr>
+              <w:widowControl/>
+              <w:wordWrap/>
+              <w:autoSpaceDE/>
+              <w:rPr>
+                <w:sz w:val="16"/>
+                <w:szCs w:val="16"/>
+              </w:rPr>
+            </w:pPr>
+            <w:r>
+              <w:rPr>
+                <w:rFonts w:hint="eastAsia"/>
+                <w:sz w:val="16"/>
+                <w:szCs w:val="16"/>
+              </w:rPr>
+              <w:t>_Start_</w:t>
             </w:r>
             <w:proofErr w:type="gramStart"/>
             <w:r>
@@ -10416,16 +9738,7 @@
                 <w:sz w:val="16"/>
                 <w:szCs w:val="16"/>
               </w:rPr>
-              <w:t>Packet</w:t>
-            </w:r>
-            <w:proofErr w:type="spellEnd"/>
-            <w:r>
-              <w:rPr>
-                <w:rFonts w:hint="eastAsia"/>
-                <w:sz w:val="16"/>
-                <w:szCs w:val="16"/>
-              </w:rPr>
-              <w:t>(</w:t>
+              <w:t>Packet(</w:t>
             </w:r>
             <w:proofErr w:type="gramEnd"/>
             <w:r>
@@ -10543,7 +9856,6 @@
                 <w:szCs w:val="16"/>
               </w:rPr>
             </w:pPr>
-            <w:proofErr w:type="spellStart"/>
             <w:r>
               <w:rPr>
                 <w:rFonts w:hint="eastAsia"/>
@@ -10553,7 +9865,6 @@
               </w:rPr>
               <w:t>패킷테스트</w:t>
             </w:r>
-            <w:proofErr w:type="spellEnd"/>
           </w:p>
           <w:p>
             <w:pPr>
@@ -10674,7 +9985,6 @@
                 <w:szCs w:val="16"/>
               </w:rPr>
             </w:pPr>
-            <w:proofErr w:type="spellStart"/>
             <w:r>
               <w:rPr>
                 <w:rFonts w:hint="eastAsia"/>
@@ -10683,7 +9993,6 @@
               </w:rPr>
               <w:t>send_move</w:t>
             </w:r>
-            <w:proofErr w:type="spellEnd"/>
           </w:p>
           <w:p>
             <w:pPr>
@@ -10861,7 +10170,6 @@
                 <w:szCs w:val="16"/>
               </w:rPr>
             </w:pPr>
-            <w:proofErr w:type="spellStart"/>
             <w:r>
               <w:rPr>
                 <w:rFonts w:asciiTheme="majorEastAsia" w:eastAsiaTheme="majorEastAsia" w:hAnsiTheme="majorEastAsia" w:hint="eastAsia"/>
@@ -10870,7 +10178,6 @@
               </w:rPr>
               <w:t>Processpacket</w:t>
             </w:r>
-            <w:proofErr w:type="spellEnd"/>
           </w:p>
           <w:p>
             <w:pPr>
@@ -11055,7 +10362,6 @@
                 <w:szCs w:val="16"/>
               </w:rPr>
             </w:pPr>
-            <w:proofErr w:type="spellStart"/>
             <w:r>
               <w:rPr>
                 <w:rFonts w:hint="eastAsia"/>
@@ -11065,7 +10371,6 @@
               </w:rPr>
               <w:t>패킷테스트</w:t>
             </w:r>
-            <w:proofErr w:type="spellEnd"/>
           </w:p>
           <w:p>
             <w:pPr>
@@ -11189,7 +10494,6 @@
                 <w:szCs w:val="16"/>
               </w:rPr>
             </w:pPr>
-            <w:proofErr w:type="spellStart"/>
             <w:r>
               <w:rPr>
                 <w:rFonts w:hint="eastAsia"/>
@@ -11205,16 +10509,7 @@
                 <w:sz w:val="16"/>
                 <w:szCs w:val="16"/>
               </w:rPr>
-              <w:t>packet</w:t>
-            </w:r>
-            <w:proofErr w:type="spellEnd"/>
-            <w:r>
-              <w:rPr>
-                <w:rFonts w:hint="eastAsia"/>
-                <w:sz w:val="16"/>
-                <w:szCs w:val="16"/>
-              </w:rPr>
-              <w:t>(</w:t>
+              <w:t>packet(</w:t>
             </w:r>
             <w:proofErr w:type="gramEnd"/>
             <w:r>
@@ -11343,7 +10638,6 @@
                 <w:szCs w:val="16"/>
               </w:rPr>
             </w:pPr>
-            <w:proofErr w:type="spellStart"/>
             <w:r>
               <w:rPr>
                 <w:rFonts w:asciiTheme="majorEastAsia" w:eastAsiaTheme="majorEastAsia" w:hAnsiTheme="majorEastAsia" w:hint="eastAsia"/>
@@ -11352,7 +10646,6 @@
               </w:rPr>
               <w:t>Processpacket</w:t>
             </w:r>
-            <w:proofErr w:type="spellEnd"/>
           </w:p>
           <w:p>
             <w:pPr>
@@ -11413,7 +10706,6 @@
                 <w:szCs w:val="16"/>
               </w:rPr>
             </w:pPr>
-            <w:proofErr w:type="spellStart"/>
             <w:r>
               <w:rPr>
                 <w:rFonts w:hint="eastAsia"/>
@@ -11422,7 +10714,6 @@
               </w:rPr>
               <w:t>send_rank</w:t>
             </w:r>
-            <w:proofErr w:type="spellEnd"/>
           </w:p>
           <w:p>
             <w:pPr>
@@ -11531,7 +10822,6 @@
                 <w:szCs w:val="16"/>
               </w:rPr>
             </w:pPr>
-            <w:proofErr w:type="spellStart"/>
             <w:r>
               <w:rPr>
                 <w:rFonts w:hint="eastAsia"/>
@@ -11541,7 +10831,6 @@
               </w:rPr>
               <w:t>패킷테스트</w:t>
             </w:r>
-            <w:proofErr w:type="spellEnd"/>
           </w:p>
           <w:p>
             <w:pPr>
@@ -11604,7 +10893,6 @@
                 <w:szCs w:val="16"/>
               </w:rPr>
             </w:pPr>
-            <w:proofErr w:type="spellStart"/>
             <w:r>
               <w:rPr>
                 <w:rFonts w:hint="eastAsia"/>
@@ -11613,34 +10901,24 @@
               </w:rPr>
               <w:t>send_login</w:t>
             </w:r>
-            <w:proofErr w:type="spellEnd"/>
-          </w:p>
-          <w:p>
-            <w:pPr>
-              <w:widowControl/>
-              <w:wordWrap/>
-              <w:autoSpaceDE/>
-              <w:rPr>
-                <w:sz w:val="16"/>
-                <w:szCs w:val="16"/>
-              </w:rPr>
-            </w:pPr>
-            <w:r>
-              <w:rPr>
-                <w:rFonts w:hint="eastAsia"/>
-                <w:sz w:val="16"/>
-                <w:szCs w:val="16"/>
-              </w:rPr>
-              <w:t>_</w:t>
-            </w:r>
-            <w:proofErr w:type="spellStart"/>
-            <w:r>
-              <w:rPr>
-                <w:rFonts w:hint="eastAsia"/>
-                <w:sz w:val="16"/>
-                <w:szCs w:val="16"/>
-              </w:rPr>
-              <w:t>fail_</w:t>
+          </w:p>
+          <w:p>
+            <w:pPr>
+              <w:widowControl/>
+              <w:wordWrap/>
+              <w:autoSpaceDE/>
+              <w:rPr>
+                <w:sz w:val="16"/>
+                <w:szCs w:val="16"/>
+              </w:rPr>
+            </w:pPr>
+            <w:r>
+              <w:rPr>
+                <w:rFonts w:hint="eastAsia"/>
+                <w:sz w:val="16"/>
+                <w:szCs w:val="16"/>
+              </w:rPr>
+              <w:t>_fail_</w:t>
             </w:r>
             <w:proofErr w:type="gramStart"/>
             <w:r>
@@ -11649,16 +10927,7 @@
                 <w:sz w:val="16"/>
                 <w:szCs w:val="16"/>
               </w:rPr>
-              <w:t>packet</w:t>
-            </w:r>
-            <w:proofErr w:type="spellEnd"/>
-            <w:r>
-              <w:rPr>
-                <w:rFonts w:hint="eastAsia"/>
-                <w:sz w:val="16"/>
-                <w:szCs w:val="16"/>
-              </w:rPr>
-              <w:t>(</w:t>
+              <w:t>packet(</w:t>
             </w:r>
             <w:proofErr w:type="gramEnd"/>
             <w:r>
@@ -11918,7 +11187,6 @@
                 <w:szCs w:val="16"/>
               </w:rPr>
             </w:pPr>
-            <w:proofErr w:type="spellStart"/>
             <w:r>
               <w:rPr>
                 <w:rFonts w:hint="eastAsia"/>
@@ -11928,7 +11196,6 @@
               </w:rPr>
               <w:t>패킷테스트</w:t>
             </w:r>
-            <w:proofErr w:type="spellEnd"/>
           </w:p>
           <w:p>
             <w:pPr>
@@ -16022,7 +15289,7 @@
     <w:unhideWhenUsed/>
     <w:rsid w:val="002815C6"/>
     <w:rPr>
-      <w:rFonts w:ascii="GulimChe" w:eastAsia="GulimChe" w:hAnsi="GulimChe" w:cs="GulimChe"/>
+      <w:rFonts w:ascii="굴림체" w:eastAsia="굴림체" w:hAnsi="굴림체" w:cs="굴림체"/>
       <w:sz w:val="24"/>
       <w:szCs w:val="24"/>
     </w:rPr>

</xml_diff>

<commit_message>
docx: 진척 관리 update
</commit_message>
<xml_diff>
--- a/진척 관리.docx
+++ b/진척 관리.docx
@@ -1,6 +1,6 @@
 
 <file path=word/document.xml><?xml version="1.0" encoding="utf-8"?>
-<w:document xmlns:wpc="http://schemas.microsoft.com/office/word/2010/wordprocessingCanvas" xmlns:cx="http://schemas.microsoft.com/office/drawing/2014/chartex" xmlns:cx1="http://schemas.microsoft.com/office/drawing/2015/9/8/chartex" xmlns:cx2="http://schemas.microsoft.com/office/drawing/2015/10/21/chartex" xmlns:cx3="http://schemas.microsoft.com/office/drawing/2016/5/9/chartex" xmlns:cx4="http://schemas.microsoft.com/office/drawing/2016/5/10/chartex" xmlns:cx5="http://schemas.microsoft.com/office/drawing/2016/5/11/chartex" xmlns:cx6="http://schemas.microsoft.com/office/drawing/2016/5/12/chartex" xmlns:cx7="http://schemas.microsoft.com/office/drawing/2016/5/13/chartex" xmlns:cx8="http://schemas.microsoft.com/office/drawing/2016/5/14/chartex" xmlns:mc="http://schemas.openxmlformats.org/markup-compatibility/2006" xmlns:aink="http://schemas.microsoft.com/office/drawing/2016/ink" xmlns:am3d="http://schemas.microsoft.com/office/drawing/2017/model3d" xmlns:o="urn:schemas-microsoft-com:office:office" xmlns:oel="http://schemas.microsoft.com/office/2019/extlst" xmlns:r="http://schemas.openxmlformats.org/officeDocument/2006/relationships" xmlns:m="http://schemas.openxmlformats.org/officeDocument/2006/math" xmlns:v="urn:schemas-microsoft-com:vml" xmlns:wp14="http://schemas.microsoft.com/office/word/2010/wordprocessingDrawing" xmlns:wp="http://schemas.openxmlformats.org/drawingml/2006/wordprocessingDrawing" xmlns:w10="urn:schemas-microsoft-com:office:word" xmlns:w="http://schemas.openxmlformats.org/wordprocessingml/2006/main" xmlns:w14="http://schemas.microsoft.com/office/word/2010/wordml" xmlns:w15="http://schemas.microsoft.com/office/word/2012/wordml" xmlns:w16cex="http://schemas.microsoft.com/office/word/2018/wordml/cex" xmlns:w16cid="http://schemas.microsoft.com/office/word/2016/wordml/cid" xmlns:w16="http://schemas.microsoft.com/office/word/2018/wordml" xmlns:w16du="http://schemas.microsoft.com/office/word/2023/wordml/word16du" xmlns:w16sdtdh="http://schemas.microsoft.com/office/word/2020/wordml/sdtdatahash" xmlns:w16sdtfl="http://schemas.microsoft.com/office/word/2024/wordml/sdtformatlock" xmlns:w16se="http://schemas.microsoft.com/office/word/2015/wordml/symex" xmlns:wpg="http://schemas.microsoft.com/office/word/2010/wordprocessingGroup" xmlns:wpi="http://schemas.microsoft.com/office/word/2010/wordprocessingInk" xmlns:wne="http://schemas.microsoft.com/office/word/2006/wordml" xmlns:wps="http://schemas.microsoft.com/office/word/2010/wordprocessingShape" mc:Ignorable="w14 w15 w16se w16cid w16 w16cex w16sdtdh w16sdtfl w16du wp14">
+<w:document xmlns:wpc="http://schemas.microsoft.com/office/word/2010/wordprocessingCanvas" xmlns:cx="http://schemas.microsoft.com/office/drawing/2014/chartex" xmlns:cx1="http://schemas.microsoft.com/office/drawing/2015/9/8/chartex" xmlns:cx2="http://schemas.microsoft.com/office/drawing/2015/10/21/chartex" xmlns:cx3="http://schemas.microsoft.com/office/drawing/2016/5/9/chartex" xmlns:cx4="http://schemas.microsoft.com/office/drawing/2016/5/10/chartex" xmlns:cx5="http://schemas.microsoft.com/office/drawing/2016/5/11/chartex" xmlns:cx6="http://schemas.microsoft.com/office/drawing/2016/5/12/chartex" xmlns:cx7="http://schemas.microsoft.com/office/drawing/2016/5/13/chartex" xmlns:cx8="http://schemas.microsoft.com/office/drawing/2016/5/14/chartex" xmlns:mc="http://schemas.openxmlformats.org/markup-compatibility/2006" xmlns:aink="http://schemas.microsoft.com/office/drawing/2016/ink" xmlns:am3d="http://schemas.microsoft.com/office/drawing/2017/model3d" xmlns:o="urn:schemas-microsoft-com:office:office" xmlns:oel="http://schemas.microsoft.com/office/2019/extlst" xmlns:r="http://schemas.openxmlformats.org/officeDocument/2006/relationships" xmlns:m="http://schemas.openxmlformats.org/officeDocument/2006/math" xmlns:v="urn:schemas-microsoft-com:vml" xmlns:wp14="http://schemas.microsoft.com/office/word/2010/wordprocessingDrawing" xmlns:wp="http://schemas.openxmlformats.org/drawingml/2006/wordprocessingDrawing" xmlns:w10="urn:schemas-microsoft-com:office:word" xmlns:w="http://schemas.openxmlformats.org/wordprocessingml/2006/main" xmlns:w14="http://schemas.microsoft.com/office/word/2010/wordml" xmlns:w15="http://schemas.microsoft.com/office/word/2012/wordml" xmlns:w16cex="http://schemas.microsoft.com/office/word/2018/wordml/cex" xmlns:w16cid="http://schemas.microsoft.com/office/word/2016/wordml/cid" xmlns:w16="http://schemas.microsoft.com/office/word/2018/wordml" xmlns:w16sdtdh="http://schemas.microsoft.com/office/word/2020/wordml/sdtdatahash" xmlns:w16se="http://schemas.microsoft.com/office/word/2015/wordml/symex" xmlns:wpg="http://schemas.microsoft.com/office/word/2010/wordprocessingGroup" xmlns:wpi="http://schemas.microsoft.com/office/word/2010/wordprocessingInk" xmlns:wne="http://schemas.microsoft.com/office/word/2006/wordml" xmlns:wps="http://schemas.microsoft.com/office/word/2010/wordprocessingShape" mc:Ignorable="w14 w15 w16se w16cid w16 w16cex w16sdtdh wp14">
   <w:body>
     <w:p>
       <w:pPr>
@@ -545,6 +545,8 @@
               <w:autoSpaceDE/>
               <w:autoSpaceDN/>
               <w:rPr>
+                <w:b/>
+                <w:bCs/>
                 <w:sz w:val="20"/>
                 <w:szCs w:val="20"/>
               </w:rPr>
@@ -553,6 +555,8 @@
             <w:r>
               <w:rPr>
                 <w:rFonts w:hint="eastAsia"/>
+                <w:b/>
+                <w:bCs/>
                 <w:sz w:val="20"/>
                 <w:szCs w:val="20"/>
               </w:rPr>
@@ -562,34 +566,22 @@
             <w:proofErr w:type="gramEnd"/>
             <w:r>
               <w:rPr>
-                <w:sz w:val="20"/>
-                <w:szCs w:val="20"/>
-              </w:rPr>
-              <w:t>recv_</w:t>
-            </w:r>
-            <w:proofErr w:type="gramStart"/>
-            <w:r>
-              <w:rPr>
-                <w:sz w:val="20"/>
-                <w:szCs w:val="20"/>
-              </w:rPr>
-              <w:t>packet</w:t>
+                <w:b/>
+                <w:bCs/>
+                <w:sz w:val="20"/>
+                <w:szCs w:val="20"/>
+              </w:rPr>
+              <w:t>recv_packet</w:t>
             </w:r>
             <w:proofErr w:type="spellEnd"/>
             <w:r>
               <w:rPr>
-                <w:sz w:val="20"/>
-                <w:szCs w:val="20"/>
-              </w:rPr>
-              <w:t>(</w:t>
-            </w:r>
-            <w:proofErr w:type="gramEnd"/>
-            <w:r>
-              <w:rPr>
-                <w:sz w:val="20"/>
-                <w:szCs w:val="20"/>
-              </w:rPr>
-              <w:t>);</w:t>
+                <w:b/>
+                <w:bCs/>
+                <w:sz w:val="20"/>
+                <w:szCs w:val="20"/>
+              </w:rPr>
+              <w:t>();</w:t>
             </w:r>
           </w:p>
         </w:tc>
@@ -671,6 +663,8 @@
               <w:autoSpaceDE/>
               <w:autoSpaceDN/>
               <w:rPr>
+                <w:b/>
+                <w:bCs/>
                 <w:sz w:val="20"/>
                 <w:szCs w:val="20"/>
               </w:rPr>
@@ -679,6 +673,8 @@
             <w:r>
               <w:rPr>
                 <w:rFonts w:hint="eastAsia"/>
+                <w:b/>
+                <w:bCs/>
                 <w:sz w:val="20"/>
                 <w:szCs w:val="20"/>
               </w:rPr>
@@ -689,6 +685,8 @@
             <w:r>
               <w:rPr>
                 <w:rFonts w:hint="eastAsia"/>
+                <w:b/>
+                <w:bCs/>
                 <w:sz w:val="20"/>
                 <w:szCs w:val="20"/>
               </w:rPr>
@@ -696,34 +694,22 @@
             </w:r>
             <w:r>
               <w:rPr>
-                <w:sz w:val="20"/>
-                <w:szCs w:val="20"/>
-              </w:rPr>
-              <w:t>_</w:t>
-            </w:r>
-            <w:proofErr w:type="gramStart"/>
-            <w:r>
-              <w:rPr>
-                <w:sz w:val="20"/>
-                <w:szCs w:val="20"/>
-              </w:rPr>
-              <w:t>packet</w:t>
+                <w:b/>
+                <w:bCs/>
+                <w:sz w:val="20"/>
+                <w:szCs w:val="20"/>
+              </w:rPr>
+              <w:t>_packet</w:t>
             </w:r>
             <w:proofErr w:type="spellEnd"/>
             <w:r>
               <w:rPr>
-                <w:sz w:val="20"/>
-                <w:szCs w:val="20"/>
-              </w:rPr>
-              <w:t>(</w:t>
-            </w:r>
-            <w:proofErr w:type="gramEnd"/>
-            <w:r>
-              <w:rPr>
-                <w:sz w:val="20"/>
-                <w:szCs w:val="20"/>
-              </w:rPr>
-              <w:t>);</w:t>
+                <w:b/>
+                <w:bCs/>
+                <w:sz w:val="20"/>
+                <w:szCs w:val="20"/>
+              </w:rPr>
+              <w:t>();</w:t>
             </w:r>
           </w:p>
         </w:tc>
@@ -846,9 +832,17 @@
                 <w:sz w:val="20"/>
                 <w:szCs w:val="20"/>
               </w:rPr>
-              <w:t>();</w:t>
+              <w:t>(</w:t>
             </w:r>
             <w:proofErr w:type="gramEnd"/>
+            <w:r>
+              <w:rPr>
+                <w:rFonts w:eastAsiaTheme="minorHAnsi"/>
+                <w:sz w:val="20"/>
+                <w:szCs w:val="20"/>
+              </w:rPr>
+              <w:t>);</w:t>
+            </w:r>
           </w:p>
           <w:p>
             <w:pPr>
@@ -1048,7 +1042,6 @@
               <w:t>target_id</w:t>
             </w:r>
             <w:proofErr w:type="spellEnd"/>
-            <w:proofErr w:type="gramStart"/>
             <w:r>
               <w:rPr>
                 <w:rFonts w:eastAsiaTheme="minorHAnsi"/>
@@ -1057,7 +1050,6 @@
               </w:rPr>
               <w:t>);</w:t>
             </w:r>
-            <w:proofErr w:type="gramEnd"/>
           </w:p>
           <w:p>
             <w:pPr>
@@ -1098,23 +1090,13 @@
               <w:t>(</w:t>
             </w:r>
             <w:proofErr w:type="spellStart"/>
-            <w:proofErr w:type="gramStart"/>
             <w:r>
               <w:rPr>
                 <w:rFonts w:eastAsiaTheme="minorHAnsi"/>
                 <w:sz w:val="20"/>
                 <w:szCs w:val="20"/>
               </w:rPr>
-              <w:t>target</w:t>
-            </w:r>
-            <w:proofErr w:type="gramEnd"/>
-            <w:r>
-              <w:rPr>
-                <w:rFonts w:eastAsiaTheme="minorHAnsi"/>
-                <w:sz w:val="20"/>
-                <w:szCs w:val="20"/>
-              </w:rPr>
-              <w:t>_id</w:t>
+              <w:t>target_id</w:t>
             </w:r>
             <w:proofErr w:type="spellEnd"/>
             <w:r>
@@ -2628,7 +2610,7 @@
                 <w:sz w:val="20"/>
                 <w:szCs w:val="20"/>
               </w:rPr>
-              <w:t>::Init(</w:t>
+              <w:t>::</w:t>
             </w:r>
             <w:proofErr w:type="gramEnd"/>
             <w:r>
@@ -2636,7 +2618,7 @@
                 <w:sz w:val="20"/>
                 <w:szCs w:val="20"/>
               </w:rPr>
-              <w:t>)</w:t>
+              <w:t>Init()</w:t>
             </w:r>
           </w:p>
           <w:p>
@@ -2668,6 +2650,7 @@
               <w:t>::</w:t>
             </w:r>
             <w:proofErr w:type="spellStart"/>
+            <w:proofErr w:type="gramEnd"/>
             <w:r>
               <w:rPr>
                 <w:sz w:val="20"/>
@@ -2681,15 +2664,7 @@
                 <w:sz w:val="20"/>
                 <w:szCs w:val="20"/>
               </w:rPr>
-              <w:t>(</w:t>
-            </w:r>
-            <w:proofErr w:type="gramEnd"/>
-            <w:r>
-              <w:rPr>
-                <w:sz w:val="20"/>
-                <w:szCs w:val="20"/>
-              </w:rPr>
-              <w:t>)</w:t>
+              <w:t>()</w:t>
             </w:r>
           </w:p>
         </w:tc>
@@ -4047,9 +4022,9 @@
                 <w:sz w:val="14"/>
                 <w:szCs w:val="14"/>
               </w:rPr>
-              <w:t>recv_</w:t>
-            </w:r>
-            <w:proofErr w:type="gramStart"/>
+              <w:t>recv_packet</w:t>
+            </w:r>
+            <w:proofErr w:type="spellEnd"/>
             <w:r>
               <w:rPr>
                 <w:b/>
@@ -4057,34 +4032,35 @@
                 <w:sz w:val="14"/>
                 <w:szCs w:val="14"/>
               </w:rPr>
-              <w:t>packet</w:t>
-            </w:r>
-            <w:proofErr w:type="spellEnd"/>
-            <w:r>
+              <w:t>();</w:t>
+            </w:r>
+          </w:p>
+          <w:p>
+            <w:pPr>
+              <w:widowControl/>
+              <w:wordWrap/>
+              <w:autoSpaceDE/>
+              <w:autoSpaceDN/>
               <w:rPr>
                 <w:b/>
                 <w:bCs/>
                 <w:sz w:val="14"/>
                 <w:szCs w:val="14"/>
               </w:rPr>
-              <w:t>();</w:t>
-            </w:r>
-            <w:proofErr w:type="gramEnd"/>
-          </w:p>
-          <w:p>
-            <w:pPr>
-              <w:widowControl/>
-              <w:wordWrap/>
-              <w:autoSpaceDE/>
-              <w:autoSpaceDN/>
-              <w:rPr>
+            </w:pPr>
+            <w:proofErr w:type="gramStart"/>
+            <w:r>
+              <w:rPr>
+                <w:rFonts w:hint="eastAsia"/>
                 <w:b/>
                 <w:bCs/>
                 <w:sz w:val="14"/>
                 <w:szCs w:val="14"/>
               </w:rPr>
-            </w:pPr>
-            <w:proofErr w:type="gramStart"/>
+              <w:t>Player::</w:t>
+            </w:r>
+            <w:proofErr w:type="spellStart"/>
+            <w:proofErr w:type="gramEnd"/>
             <w:r>
               <w:rPr>
                 <w:rFonts w:hint="eastAsia"/>
@@ -4093,20 +4069,18 @@
                 <w:sz w:val="14"/>
                 <w:szCs w:val="14"/>
               </w:rPr>
-              <w:t>Player::</w:t>
-            </w:r>
-            <w:proofErr w:type="spellStart"/>
-            <w:proofErr w:type="gramEnd"/>
-            <w:r>
-              <w:rPr>
-                <w:rFonts w:hint="eastAsia"/>
+              <w:t>send</w:t>
+            </w:r>
+            <w:r>
+              <w:rPr>
                 <w:b/>
                 <w:bCs/>
                 <w:sz w:val="14"/>
                 <w:szCs w:val="14"/>
               </w:rPr>
-              <w:t>send</w:t>
-            </w:r>
+              <w:t>_packet</w:t>
+            </w:r>
+            <w:proofErr w:type="spellEnd"/>
             <w:r>
               <w:rPr>
                 <w:b/>
@@ -4114,74 +4088,53 @@
                 <w:sz w:val="14"/>
                 <w:szCs w:val="14"/>
               </w:rPr>
-              <w:t>_</w:t>
-            </w:r>
-            <w:proofErr w:type="gramStart"/>
-            <w:r>
+              <w:t>();</w:t>
+            </w:r>
+          </w:p>
+          <w:p>
+            <w:pPr>
+              <w:widowControl/>
+              <w:wordWrap/>
+              <w:autoSpaceDE/>
+              <w:autoSpaceDN/>
               <w:rPr>
                 <w:b/>
                 <w:bCs/>
                 <w:sz w:val="14"/>
                 <w:szCs w:val="14"/>
               </w:rPr>
-              <w:t>packet</w:t>
-            </w:r>
-            <w:proofErr w:type="spellEnd"/>
-            <w:r>
-              <w:rPr>
+            </w:pPr>
+            <w:proofErr w:type="gramStart"/>
+            <w:r>
+              <w:rPr>
+                <w:rFonts w:hint="eastAsia"/>
                 <w:b/>
                 <w:bCs/>
                 <w:sz w:val="14"/>
                 <w:szCs w:val="14"/>
               </w:rPr>
-              <w:t>();</w:t>
+              <w:t>Player::</w:t>
             </w:r>
             <w:proofErr w:type="gramEnd"/>
-          </w:p>
-          <w:p>
-            <w:pPr>
-              <w:widowControl/>
-              <w:wordWrap/>
-              <w:autoSpaceDE/>
-              <w:autoSpaceDN/>
-              <w:rPr>
+            <w:r>
+              <w:rPr>
+                <w:rFonts w:hint="eastAsia"/>
                 <w:b/>
                 <w:bCs/>
                 <w:sz w:val="14"/>
                 <w:szCs w:val="14"/>
               </w:rPr>
-            </w:pPr>
-            <w:proofErr w:type="gramStart"/>
-            <w:r>
-              <w:rPr>
-                <w:rFonts w:hint="eastAsia"/>
+              <w:t>disconnect</w:t>
+            </w:r>
+            <w:r>
+              <w:rPr>
                 <w:b/>
                 <w:bCs/>
                 <w:sz w:val="14"/>
                 <w:szCs w:val="14"/>
               </w:rPr>
-              <w:t>Player::</w:t>
-            </w:r>
-            <w:r>
-              <w:rPr>
-                <w:rFonts w:hint="eastAsia"/>
-                <w:b/>
-                <w:bCs/>
-                <w:sz w:val="14"/>
-                <w:szCs w:val="14"/>
-              </w:rPr>
-              <w:t>disconnect</w:t>
-            </w:r>
-            <w:r>
-              <w:rPr>
-                <w:b/>
-                <w:bCs/>
-                <w:sz w:val="14"/>
-                <w:szCs w:val="14"/>
-              </w:rPr>
               <w:t>();</w:t>
             </w:r>
-            <w:proofErr w:type="gramEnd"/>
           </w:p>
           <w:p>
             <w:pPr>
@@ -4227,9 +4180,9 @@
                 <w:sz w:val="14"/>
                 <w:szCs w:val="14"/>
               </w:rPr>
-              <w:t>process_</w:t>
-            </w:r>
-            <w:proofErr w:type="gramStart"/>
+              <w:t>process_packet</w:t>
+            </w:r>
+            <w:proofErr w:type="spellEnd"/>
             <w:r>
               <w:rPr>
                 <w:rFonts w:eastAsiaTheme="minorHAnsi" w:hint="eastAsia"/>
@@ -4238,215 +4191,249 @@
                 <w:sz w:val="14"/>
                 <w:szCs w:val="14"/>
               </w:rPr>
-              <w:t>packet</w:t>
+              <w:t>()</w:t>
+            </w:r>
+          </w:p>
+        </w:tc>
+        <w:tc>
+          <w:tcPr>
+            <w:tcW w:w="1701" w:type="dxa"/>
+          </w:tcPr>
+          <w:p>
+            <w:pPr>
+              <w:widowControl/>
+              <w:wordWrap/>
+              <w:autoSpaceDE/>
+              <w:autoSpaceDN/>
+              <w:rPr>
+                <w:sz w:val="16"/>
+                <w:szCs w:val="16"/>
+              </w:rPr>
+            </w:pPr>
+            <w:r>
+              <w:rPr>
+                <w:rFonts w:hint="eastAsia"/>
+                <w:sz w:val="16"/>
+                <w:szCs w:val="16"/>
+              </w:rPr>
+              <w:t>4</w:t>
+            </w:r>
+          </w:p>
+          <w:p>
+            <w:pPr>
+              <w:widowControl/>
+              <w:wordWrap/>
+              <w:autoSpaceDE/>
+              <w:autoSpaceDN/>
+              <w:rPr>
+                <w:sz w:val="16"/>
+                <w:szCs w:val="16"/>
+              </w:rPr>
+            </w:pPr>
+          </w:p>
+        </w:tc>
+        <w:tc>
+          <w:tcPr>
+            <w:tcW w:w="1701" w:type="dxa"/>
+          </w:tcPr>
+          <w:p>
+            <w:pPr>
+              <w:widowControl/>
+              <w:wordWrap/>
+              <w:autoSpaceDE/>
+              <w:autoSpaceDN/>
+              <w:rPr>
+                <w:color w:val="960000"/>
+                <w:sz w:val="16"/>
+                <w:szCs w:val="16"/>
+              </w:rPr>
+            </w:pPr>
+            <w:r>
+              <w:rPr>
+                <w:rFonts w:hint="eastAsia"/>
+                <w:sz w:val="16"/>
+                <w:szCs w:val="16"/>
+              </w:rPr>
+              <w:t>5</w:t>
+            </w:r>
+          </w:p>
+          <w:p>
+            <w:pPr>
+              <w:widowControl/>
+              <w:wordWrap/>
+              <w:autoSpaceDE/>
+              <w:autoSpaceDN/>
+              <w:rPr>
+                <w:color w:val="960000"/>
+                <w:sz w:val="16"/>
+                <w:szCs w:val="16"/>
+              </w:rPr>
+            </w:pPr>
+            <w:proofErr w:type="spellStart"/>
+            <w:r>
+              <w:rPr>
+                <w:rFonts w:hint="eastAsia"/>
+                <w:color w:val="960000"/>
+                <w:sz w:val="16"/>
+                <w:szCs w:val="16"/>
+              </w:rPr>
+              <w:t>패킷테스트</w:t>
             </w:r>
             <w:proofErr w:type="spellEnd"/>
-            <w:r>
-              <w:rPr>
-                <w:rFonts w:eastAsiaTheme="minorHAnsi" w:hint="eastAsia"/>
+          </w:p>
+          <w:p>
+            <w:pPr>
+              <w:widowControl/>
+              <w:wordWrap/>
+              <w:autoSpaceDE/>
+              <w:autoSpaceDN/>
+              <w:rPr>
+                <w:color w:val="960000"/>
+                <w:sz w:val="16"/>
+                <w:szCs w:val="16"/>
+              </w:rPr>
+            </w:pPr>
+            <w:r>
+              <w:rPr>
+                <w:rFonts w:hint="eastAsia"/>
+                <w:color w:val="960000"/>
+                <w:sz w:val="16"/>
+                <w:szCs w:val="16"/>
+              </w:rPr>
+              <w:t>진행 보고</w:t>
+            </w:r>
+          </w:p>
+        </w:tc>
+        <w:tc>
+          <w:tcPr>
+            <w:tcW w:w="1701" w:type="dxa"/>
+          </w:tcPr>
+          <w:p>
+            <w:pPr>
+              <w:widowControl/>
+              <w:wordWrap/>
+              <w:autoSpaceDE/>
+              <w:autoSpaceDN/>
+              <w:rPr>
+                <w:sz w:val="16"/>
+                <w:szCs w:val="16"/>
+              </w:rPr>
+            </w:pPr>
+            <w:r>
+              <w:rPr>
+                <w:rFonts w:hint="eastAsia"/>
+                <w:sz w:val="16"/>
+                <w:szCs w:val="16"/>
+              </w:rPr>
+              <w:t>6</w:t>
+            </w:r>
+          </w:p>
+          <w:p>
+            <w:pPr>
+              <w:widowControl/>
+              <w:wordWrap/>
+              <w:autoSpaceDE/>
+              <w:autoSpaceDN/>
+              <w:rPr>
                 <w:b/>
                 <w:bCs/>
-                <w:sz w:val="14"/>
-                <w:szCs w:val="14"/>
-              </w:rPr>
-              <w:t>(</w:t>
-            </w:r>
-            <w:proofErr w:type="gramEnd"/>
-            <w:r>
-              <w:rPr>
-                <w:rFonts w:eastAsiaTheme="minorHAnsi" w:hint="eastAsia"/>
+                <w:sz w:val="16"/>
+                <w:szCs w:val="16"/>
+              </w:rPr>
+            </w:pPr>
+          </w:p>
+        </w:tc>
+        <w:tc>
+          <w:tcPr>
+            <w:tcW w:w="1701" w:type="dxa"/>
+          </w:tcPr>
+          <w:p>
+            <w:pPr>
+              <w:widowControl/>
+              <w:wordWrap/>
+              <w:autoSpaceDE/>
+              <w:autoSpaceDN/>
+              <w:rPr>
+                <w:sz w:val="16"/>
+                <w:szCs w:val="16"/>
+              </w:rPr>
+            </w:pPr>
+            <w:r>
+              <w:rPr>
+                <w:rFonts w:hint="eastAsia"/>
+                <w:sz w:val="16"/>
+                <w:szCs w:val="16"/>
+              </w:rPr>
+              <w:t>7</w:t>
+            </w:r>
+          </w:p>
+          <w:p>
+            <w:pPr>
+              <w:widowControl/>
+              <w:wordWrap/>
+              <w:autoSpaceDE/>
+              <w:autoSpaceDN/>
+              <w:rPr>
+                <w:rFonts w:hint="eastAsia"/>
                 <w:b/>
                 <w:bCs/>
-                <w:sz w:val="14"/>
-                <w:szCs w:val="14"/>
-              </w:rPr>
-              <w:t>)</w:t>
-            </w:r>
-          </w:p>
-        </w:tc>
-        <w:tc>
-          <w:tcPr>
-            <w:tcW w:w="1701" w:type="dxa"/>
-          </w:tcPr>
-          <w:p>
-            <w:pPr>
-              <w:widowControl/>
-              <w:wordWrap/>
-              <w:autoSpaceDE/>
-              <w:autoSpaceDN/>
-              <w:rPr>
-                <w:sz w:val="16"/>
-                <w:szCs w:val="16"/>
-              </w:rPr>
-            </w:pPr>
-            <w:r>
-              <w:rPr>
-                <w:rFonts w:hint="eastAsia"/>
-                <w:sz w:val="16"/>
-                <w:szCs w:val="16"/>
-              </w:rPr>
-              <w:t>4</w:t>
-            </w:r>
-          </w:p>
-          <w:p>
-            <w:pPr>
-              <w:widowControl/>
-              <w:wordWrap/>
-              <w:autoSpaceDE/>
-              <w:autoSpaceDN/>
-              <w:rPr>
-                <w:sz w:val="16"/>
-                <w:szCs w:val="16"/>
-              </w:rPr>
-            </w:pPr>
-          </w:p>
-        </w:tc>
-        <w:tc>
-          <w:tcPr>
-            <w:tcW w:w="1701" w:type="dxa"/>
-          </w:tcPr>
-          <w:p>
-            <w:pPr>
-              <w:widowControl/>
-              <w:wordWrap/>
-              <w:autoSpaceDE/>
-              <w:autoSpaceDN/>
-              <w:rPr>
-                <w:color w:val="960000"/>
-                <w:sz w:val="16"/>
-                <w:szCs w:val="16"/>
-              </w:rPr>
-            </w:pPr>
-            <w:r>
-              <w:rPr>
-                <w:rFonts w:hint="eastAsia"/>
-                <w:sz w:val="16"/>
-                <w:szCs w:val="16"/>
-              </w:rPr>
-              <w:t>5</w:t>
-            </w:r>
-          </w:p>
-          <w:p>
-            <w:pPr>
-              <w:widowControl/>
-              <w:wordWrap/>
-              <w:autoSpaceDE/>
-              <w:autoSpaceDN/>
-              <w:rPr>
-                <w:color w:val="960000"/>
-                <w:sz w:val="16"/>
-                <w:szCs w:val="16"/>
-              </w:rPr>
-            </w:pPr>
-            <w:proofErr w:type="spellStart"/>
-            <w:r>
-              <w:rPr>
-                <w:rFonts w:hint="eastAsia"/>
-                <w:color w:val="960000"/>
-                <w:sz w:val="16"/>
-                <w:szCs w:val="16"/>
-              </w:rPr>
-              <w:t>패킷테스트</w:t>
-            </w:r>
-            <w:proofErr w:type="spellEnd"/>
-          </w:p>
-          <w:p>
-            <w:pPr>
-              <w:widowControl/>
-              <w:wordWrap/>
-              <w:autoSpaceDE/>
-              <w:autoSpaceDN/>
-              <w:rPr>
-                <w:color w:val="960000"/>
-                <w:sz w:val="16"/>
-                <w:szCs w:val="16"/>
-              </w:rPr>
-            </w:pPr>
-            <w:r>
-              <w:rPr>
-                <w:rFonts w:hint="eastAsia"/>
-                <w:color w:val="960000"/>
-                <w:sz w:val="16"/>
-                <w:szCs w:val="16"/>
-              </w:rPr>
-              <w:t>진행 보고</w:t>
-            </w:r>
-          </w:p>
-        </w:tc>
-        <w:tc>
-          <w:tcPr>
-            <w:tcW w:w="1701" w:type="dxa"/>
-          </w:tcPr>
-          <w:p>
-            <w:pPr>
-              <w:widowControl/>
-              <w:wordWrap/>
-              <w:autoSpaceDE/>
-              <w:autoSpaceDN/>
-              <w:rPr>
-                <w:sz w:val="16"/>
-                <w:szCs w:val="16"/>
-              </w:rPr>
-            </w:pPr>
-            <w:r>
-              <w:rPr>
-                <w:rFonts w:hint="eastAsia"/>
-                <w:sz w:val="16"/>
-                <w:szCs w:val="16"/>
-              </w:rPr>
-              <w:t>6</w:t>
-            </w:r>
-          </w:p>
-          <w:p>
-            <w:pPr>
-              <w:widowControl/>
-              <w:wordWrap/>
-              <w:autoSpaceDE/>
-              <w:autoSpaceDN/>
+                <w:sz w:val="16"/>
+                <w:szCs w:val="16"/>
+              </w:rPr>
+            </w:pPr>
+            <w:r>
               <w:rPr>
                 <w:b/>
                 <w:bCs/>
                 <w:sz w:val="16"/>
                 <w:szCs w:val="16"/>
               </w:rPr>
-            </w:pPr>
-          </w:p>
-        </w:tc>
-        <w:tc>
-          <w:tcPr>
-            <w:tcW w:w="1701" w:type="dxa"/>
-          </w:tcPr>
-          <w:p>
-            <w:pPr>
-              <w:widowControl/>
-              <w:wordWrap/>
-              <w:autoSpaceDE/>
-              <w:autoSpaceDN/>
-              <w:rPr>
-                <w:sz w:val="16"/>
-                <w:szCs w:val="16"/>
-              </w:rPr>
-            </w:pPr>
-            <w:r>
-              <w:rPr>
-                <w:rFonts w:hint="eastAsia"/>
-                <w:sz w:val="16"/>
-                <w:szCs w:val="16"/>
-              </w:rPr>
-              <w:t>7</w:t>
-            </w:r>
-          </w:p>
-          <w:p>
-            <w:pPr>
-              <w:widowControl/>
-              <w:wordWrap/>
-              <w:autoSpaceDE/>
-              <w:autoSpaceDN/>
-              <w:rPr>
-                <w:sz w:val="16"/>
-                <w:szCs w:val="16"/>
-              </w:rPr>
-            </w:pPr>
+              <w:t>C</w:t>
+            </w:r>
+            <w:r>
+              <w:rPr>
+                <w:rFonts w:hint="eastAsia"/>
+                <w:b/>
+                <w:bCs/>
+                <w:sz w:val="16"/>
+                <w:szCs w:val="16"/>
+              </w:rPr>
+              <w:t xml:space="preserve">lient </w:t>
+            </w:r>
+            <w:proofErr w:type="spellStart"/>
+            <w:proofErr w:type="gramStart"/>
+            <w:r>
+              <w:rPr>
+                <w:rFonts w:hint="eastAsia"/>
+                <w:b/>
+                <w:bCs/>
+                <w:sz w:val="16"/>
+                <w:szCs w:val="16"/>
+              </w:rPr>
+              <w:t>sendEnterRoomPacket</w:t>
+            </w:r>
+            <w:proofErr w:type="spellEnd"/>
+            <w:r>
+              <w:rPr>
+                <w:rFonts w:hint="eastAsia"/>
+                <w:b/>
+                <w:bCs/>
+                <w:sz w:val="16"/>
+                <w:szCs w:val="16"/>
+              </w:rPr>
+              <w:t>(</w:t>
+            </w:r>
+            <w:proofErr w:type="gramEnd"/>
+            <w:r>
+              <w:rPr>
+                <w:rFonts w:hint="eastAsia"/>
+                <w:b/>
+                <w:bCs/>
+                <w:sz w:val="16"/>
+                <w:szCs w:val="16"/>
+              </w:rPr>
+              <w:t>)</w:t>
+            </w:r>
           </w:p>
         </w:tc>
         <w:tc>
@@ -4629,7 +4616,6 @@
               <w:t>target_id</w:t>
             </w:r>
             <w:proofErr w:type="spellEnd"/>
-            <w:proofErr w:type="gramStart"/>
             <w:r>
               <w:rPr>
                 <w:rFonts w:eastAsiaTheme="minorHAnsi"/>
@@ -4638,7 +4624,6 @@
               </w:rPr>
               <w:t>);</w:t>
             </w:r>
-            <w:proofErr w:type="gramEnd"/>
           </w:p>
           <w:p>
             <w:pPr>
@@ -6310,13 +6295,13 @@
         <w:tblLook w:val="04A0" w:firstRow="1" w:lastRow="0" w:firstColumn="1" w:lastColumn="0" w:noHBand="0" w:noVBand="1"/>
       </w:tblPr>
       <w:tblGrid>
-        <w:gridCol w:w="1703"/>
-        <w:gridCol w:w="1759"/>
-        <w:gridCol w:w="1703"/>
-        <w:gridCol w:w="1703"/>
-        <w:gridCol w:w="1800"/>
-        <w:gridCol w:w="1703"/>
-        <w:gridCol w:w="545"/>
+        <w:gridCol w:w="1706"/>
+        <w:gridCol w:w="1739"/>
+        <w:gridCol w:w="1707"/>
+        <w:gridCol w:w="1707"/>
+        <w:gridCol w:w="1804"/>
+        <w:gridCol w:w="1707"/>
+        <w:gridCol w:w="546"/>
       </w:tblGrid>
       <w:tr>
         <w:trPr>
@@ -9577,6 +9562,7 @@
               <w:t>::</w:t>
             </w:r>
             <w:proofErr w:type="spellStart"/>
+            <w:proofErr w:type="gramEnd"/>
             <w:r>
               <w:rPr>
                 <w:rFonts w:hint="eastAsia"/>
@@ -9596,9 +9582,8 @@
                 <w:sz w:val="16"/>
                 <w:szCs w:val="16"/>
               </w:rPr>
-              <w:t>(</w:t>
-            </w:r>
-            <w:proofErr w:type="gramEnd"/>
+              <w:t>()</w:t>
+            </w:r>
             <w:r>
               <w:rPr>
                 <w:rFonts w:hint="eastAsia"/>
@@ -9607,32 +9592,45 @@
                 <w:sz w:val="16"/>
                 <w:szCs w:val="16"/>
               </w:rPr>
-              <w:t>)</w:t>
-            </w:r>
-            <w:r>
-              <w:rPr>
-                <w:rFonts w:hint="eastAsia"/>
+              <w:t>,</w:t>
+            </w:r>
+          </w:p>
+          <w:p>
+            <w:pPr>
+              <w:widowControl/>
+              <w:wordWrap/>
+              <w:autoSpaceDE/>
+              <w:rPr>
                 <w:b/>
                 <w:bCs/>
                 <w:sz w:val="16"/>
                 <w:szCs w:val="16"/>
               </w:rPr>
-              <w:t>,</w:t>
-            </w:r>
-          </w:p>
-          <w:p>
-            <w:pPr>
-              <w:widowControl/>
-              <w:wordWrap/>
-              <w:autoSpaceDE/>
-              <w:rPr>
+            </w:pPr>
+            <w:proofErr w:type="spellStart"/>
+            <w:r>
+              <w:rPr>
+                <w:rFonts w:hint="eastAsia"/>
                 <w:b/>
                 <w:bCs/>
                 <w:sz w:val="16"/>
                 <w:szCs w:val="16"/>
               </w:rPr>
-            </w:pPr>
-            <w:proofErr w:type="spellStart"/>
+              <w:t>NetworkMgr</w:t>
+            </w:r>
+            <w:proofErr w:type="spellEnd"/>
+          </w:p>
+          <w:p>
+            <w:pPr>
+              <w:widowControl/>
+              <w:wordWrap/>
+              <w:autoSpaceDE/>
+              <w:rPr>
+                <w:sz w:val="16"/>
+                <w:szCs w:val="16"/>
+              </w:rPr>
+            </w:pPr>
+            <w:proofErr w:type="gramStart"/>
             <w:r>
               <w:rPr>
                 <w:rFonts w:hint="eastAsia"/>
@@ -9641,21 +9639,9 @@
                 <w:sz w:val="16"/>
                 <w:szCs w:val="16"/>
               </w:rPr>
-              <w:t>NetworkMgr</w:t>
-            </w:r>
-            <w:proofErr w:type="spellEnd"/>
-          </w:p>
-          <w:p>
-            <w:pPr>
-              <w:widowControl/>
-              <w:wordWrap/>
-              <w:autoSpaceDE/>
-              <w:rPr>
-                <w:sz w:val="16"/>
-                <w:szCs w:val="16"/>
-              </w:rPr>
-            </w:pPr>
-            <w:proofErr w:type="gramStart"/>
+              <w:t>::</w:t>
+            </w:r>
+            <w:proofErr w:type="gramEnd"/>
             <w:r>
               <w:rPr>
                 <w:rFonts w:hint="eastAsia"/>
@@ -9664,18 +9650,7 @@
                 <w:sz w:val="16"/>
                 <w:szCs w:val="16"/>
               </w:rPr>
-              <w:t>::Init(</w:t>
-            </w:r>
-            <w:proofErr w:type="gramEnd"/>
-            <w:r>
-              <w:rPr>
-                <w:rFonts w:hint="eastAsia"/>
-                <w:b/>
-                <w:bCs/>
-                <w:sz w:val="16"/>
-                <w:szCs w:val="16"/>
-              </w:rPr>
-              <w:t>)</w:t>
+              <w:t>Init()</w:t>
             </w:r>
           </w:p>
         </w:tc>
@@ -10337,17 +10312,7 @@
                 <w:sz w:val="16"/>
                 <w:szCs w:val="16"/>
               </w:rPr>
-              <w:t>스레드 구현</w:t>
-            </w:r>
-            <w:r>
-              <w:rPr>
-                <w:rFonts w:hint="eastAsia"/>
-                <w:b/>
-                <w:bCs/>
-                <w:sz w:val="16"/>
-                <w:szCs w:val="16"/>
-              </w:rPr>
-              <w:t>,</w:t>
+              <w:t>스레드 구현,</w:t>
             </w:r>
           </w:p>
           <w:p>
@@ -10405,7 +10370,6 @@
               <w:wordWrap/>
               <w:autoSpaceDE/>
               <w:rPr>
-                <w:rFonts w:hint="eastAsia"/>
                 <w:sz w:val="16"/>
                 <w:szCs w:val="16"/>
               </w:rPr>
@@ -11937,9 +11901,17 @@
                 <w:sz w:val="16"/>
                 <w:szCs w:val="16"/>
               </w:rPr>
-              <w:t>();</w:t>
+              <w:t>(</w:t>
             </w:r>
             <w:proofErr w:type="gramEnd"/>
+            <w:r>
+              <w:rPr>
+                <w:rFonts w:hint="eastAsia"/>
+                <w:sz w:val="16"/>
+                <w:szCs w:val="16"/>
+              </w:rPr>
+              <w:t>);</w:t>
+            </w:r>
           </w:p>
           <w:p>
             <w:pPr>
@@ -12761,7 +12733,7 @@
 </file>
 
 <file path=word/endnotes.xml><?xml version="1.0" encoding="utf-8"?>
-<w:endnotes xmlns:wpc="http://schemas.microsoft.com/office/word/2010/wordprocessingCanvas" xmlns:cx="http://schemas.microsoft.com/office/drawing/2014/chartex" xmlns:cx1="http://schemas.microsoft.com/office/drawing/2015/9/8/chartex" xmlns:cx2="http://schemas.microsoft.com/office/drawing/2015/10/21/chartex" xmlns:cx3="http://schemas.microsoft.com/office/drawing/2016/5/9/chartex" xmlns:cx4="http://schemas.microsoft.com/office/drawing/2016/5/10/chartex" xmlns:cx5="http://schemas.microsoft.com/office/drawing/2016/5/11/chartex" xmlns:cx6="http://schemas.microsoft.com/office/drawing/2016/5/12/chartex" xmlns:cx7="http://schemas.microsoft.com/office/drawing/2016/5/13/chartex" xmlns:cx8="http://schemas.microsoft.com/office/drawing/2016/5/14/chartex" xmlns:mc="http://schemas.openxmlformats.org/markup-compatibility/2006" xmlns:aink="http://schemas.microsoft.com/office/drawing/2016/ink" xmlns:am3d="http://schemas.microsoft.com/office/drawing/2017/model3d" xmlns:o="urn:schemas-microsoft-com:office:office" xmlns:oel="http://schemas.microsoft.com/office/2019/extlst" xmlns:r="http://schemas.openxmlformats.org/officeDocument/2006/relationships" xmlns:m="http://schemas.openxmlformats.org/officeDocument/2006/math" xmlns:v="urn:schemas-microsoft-com:vml" xmlns:wp14="http://schemas.microsoft.com/office/word/2010/wordprocessingDrawing" xmlns:wp="http://schemas.openxmlformats.org/drawingml/2006/wordprocessingDrawing" xmlns:w10="urn:schemas-microsoft-com:office:word" xmlns:w="http://schemas.openxmlformats.org/wordprocessingml/2006/main" xmlns:w14="http://schemas.microsoft.com/office/word/2010/wordml" xmlns:w15="http://schemas.microsoft.com/office/word/2012/wordml" xmlns:w16cex="http://schemas.microsoft.com/office/word/2018/wordml/cex" xmlns:w16cid="http://schemas.microsoft.com/office/word/2016/wordml/cid" xmlns:w16="http://schemas.microsoft.com/office/word/2018/wordml" xmlns:w16du="http://schemas.microsoft.com/office/word/2023/wordml/word16du" xmlns:w16sdtdh="http://schemas.microsoft.com/office/word/2020/wordml/sdtdatahash" xmlns:w16sdtfl="http://schemas.microsoft.com/office/word/2024/wordml/sdtformatlock" xmlns:w16se="http://schemas.microsoft.com/office/word/2015/wordml/symex" xmlns:wpg="http://schemas.microsoft.com/office/word/2010/wordprocessingGroup" xmlns:wpi="http://schemas.microsoft.com/office/word/2010/wordprocessingInk" xmlns:wne="http://schemas.microsoft.com/office/word/2006/wordml" xmlns:wps="http://schemas.microsoft.com/office/word/2010/wordprocessingShape" mc:Ignorable="w14 w15 w16se w16cid w16 w16cex w16sdtdh w16sdtfl w16du wp14">
+<w:endnotes xmlns:wpc="http://schemas.microsoft.com/office/word/2010/wordprocessingCanvas" xmlns:cx="http://schemas.microsoft.com/office/drawing/2014/chartex" xmlns:cx1="http://schemas.microsoft.com/office/drawing/2015/9/8/chartex" xmlns:cx2="http://schemas.microsoft.com/office/drawing/2015/10/21/chartex" xmlns:cx3="http://schemas.microsoft.com/office/drawing/2016/5/9/chartex" xmlns:cx4="http://schemas.microsoft.com/office/drawing/2016/5/10/chartex" xmlns:cx5="http://schemas.microsoft.com/office/drawing/2016/5/11/chartex" xmlns:cx6="http://schemas.microsoft.com/office/drawing/2016/5/12/chartex" xmlns:cx7="http://schemas.microsoft.com/office/drawing/2016/5/13/chartex" xmlns:cx8="http://schemas.microsoft.com/office/drawing/2016/5/14/chartex" xmlns:mc="http://schemas.openxmlformats.org/markup-compatibility/2006" xmlns:aink="http://schemas.microsoft.com/office/drawing/2016/ink" xmlns:am3d="http://schemas.microsoft.com/office/drawing/2017/model3d" xmlns:o="urn:schemas-microsoft-com:office:office" xmlns:oel="http://schemas.microsoft.com/office/2019/extlst" xmlns:r="http://schemas.openxmlformats.org/officeDocument/2006/relationships" xmlns:m="http://schemas.openxmlformats.org/officeDocument/2006/math" xmlns:v="urn:schemas-microsoft-com:vml" xmlns:wp14="http://schemas.microsoft.com/office/word/2010/wordprocessingDrawing" xmlns:wp="http://schemas.openxmlformats.org/drawingml/2006/wordprocessingDrawing" xmlns:w10="urn:schemas-microsoft-com:office:word" xmlns:w="http://schemas.openxmlformats.org/wordprocessingml/2006/main" xmlns:w14="http://schemas.microsoft.com/office/word/2010/wordml" xmlns:w15="http://schemas.microsoft.com/office/word/2012/wordml" xmlns:w16cex="http://schemas.microsoft.com/office/word/2018/wordml/cex" xmlns:w16cid="http://schemas.microsoft.com/office/word/2016/wordml/cid" xmlns:w16="http://schemas.microsoft.com/office/word/2018/wordml" xmlns:w16sdtdh="http://schemas.microsoft.com/office/word/2020/wordml/sdtdatahash" xmlns:w16se="http://schemas.microsoft.com/office/word/2015/wordml/symex" xmlns:wpg="http://schemas.microsoft.com/office/word/2010/wordprocessingGroup" xmlns:wpi="http://schemas.microsoft.com/office/word/2010/wordprocessingInk" xmlns:wne="http://schemas.microsoft.com/office/word/2006/wordml" xmlns:wps="http://schemas.microsoft.com/office/word/2010/wordprocessingShape" mc:Ignorable="w14 w15 w16se w16cid w16 w16cex w16sdtdh wp14">
   <w:endnote w:type="separator" w:id="-1">
     <w:p>
       <w:pPr>
@@ -12786,7 +12758,7 @@
 </file>
 
 <file path=word/footer1.xml><?xml version="1.0" encoding="utf-8"?>
-<w:ftr xmlns:wpc="http://schemas.microsoft.com/office/word/2010/wordprocessingCanvas" xmlns:cx="http://schemas.microsoft.com/office/drawing/2014/chartex" xmlns:cx1="http://schemas.microsoft.com/office/drawing/2015/9/8/chartex" xmlns:cx2="http://schemas.microsoft.com/office/drawing/2015/10/21/chartex" xmlns:cx3="http://schemas.microsoft.com/office/drawing/2016/5/9/chartex" xmlns:cx4="http://schemas.microsoft.com/office/drawing/2016/5/10/chartex" xmlns:cx5="http://schemas.microsoft.com/office/drawing/2016/5/11/chartex" xmlns:cx6="http://schemas.microsoft.com/office/drawing/2016/5/12/chartex" xmlns:cx7="http://schemas.microsoft.com/office/drawing/2016/5/13/chartex" xmlns:cx8="http://schemas.microsoft.com/office/drawing/2016/5/14/chartex" xmlns:mc="http://schemas.openxmlformats.org/markup-compatibility/2006" xmlns:aink="http://schemas.microsoft.com/office/drawing/2016/ink" xmlns:am3d="http://schemas.microsoft.com/office/drawing/2017/model3d" xmlns:o="urn:schemas-microsoft-com:office:office" xmlns:oel="http://schemas.microsoft.com/office/2019/extlst" xmlns:r="http://schemas.openxmlformats.org/officeDocument/2006/relationships" xmlns:m="http://schemas.openxmlformats.org/officeDocument/2006/math" xmlns:v="urn:schemas-microsoft-com:vml" xmlns:wp14="http://schemas.microsoft.com/office/word/2010/wordprocessingDrawing" xmlns:wp="http://schemas.openxmlformats.org/drawingml/2006/wordprocessingDrawing" xmlns:w10="urn:schemas-microsoft-com:office:word" xmlns:w="http://schemas.openxmlformats.org/wordprocessingml/2006/main" xmlns:w14="http://schemas.microsoft.com/office/word/2010/wordml" xmlns:w15="http://schemas.microsoft.com/office/word/2012/wordml" xmlns:w16cex="http://schemas.microsoft.com/office/word/2018/wordml/cex" xmlns:w16cid="http://schemas.microsoft.com/office/word/2016/wordml/cid" xmlns:w16="http://schemas.microsoft.com/office/word/2018/wordml" xmlns:w16du="http://schemas.microsoft.com/office/word/2023/wordml/word16du" xmlns:w16sdtdh="http://schemas.microsoft.com/office/word/2020/wordml/sdtdatahash" xmlns:w16sdtfl="http://schemas.microsoft.com/office/word/2024/wordml/sdtformatlock" xmlns:w16se="http://schemas.microsoft.com/office/word/2015/wordml/symex" xmlns:wpg="http://schemas.microsoft.com/office/word/2010/wordprocessingGroup" xmlns:wpi="http://schemas.microsoft.com/office/word/2010/wordprocessingInk" xmlns:wne="http://schemas.microsoft.com/office/word/2006/wordml" xmlns:wps="http://schemas.microsoft.com/office/word/2010/wordprocessingShape" mc:Ignorable="w14 w15 w16se w16cid w16 w16cex w16sdtdh w16sdtfl w16du wp14">
+<w:ftr xmlns:wpc="http://schemas.microsoft.com/office/word/2010/wordprocessingCanvas" xmlns:cx="http://schemas.microsoft.com/office/drawing/2014/chartex" xmlns:cx1="http://schemas.microsoft.com/office/drawing/2015/9/8/chartex" xmlns:cx2="http://schemas.microsoft.com/office/drawing/2015/10/21/chartex" xmlns:cx3="http://schemas.microsoft.com/office/drawing/2016/5/9/chartex" xmlns:cx4="http://schemas.microsoft.com/office/drawing/2016/5/10/chartex" xmlns:cx5="http://schemas.microsoft.com/office/drawing/2016/5/11/chartex" xmlns:cx6="http://schemas.microsoft.com/office/drawing/2016/5/12/chartex" xmlns:cx7="http://schemas.microsoft.com/office/drawing/2016/5/13/chartex" xmlns:cx8="http://schemas.microsoft.com/office/drawing/2016/5/14/chartex" xmlns:mc="http://schemas.openxmlformats.org/markup-compatibility/2006" xmlns:aink="http://schemas.microsoft.com/office/drawing/2016/ink" xmlns:am3d="http://schemas.microsoft.com/office/drawing/2017/model3d" xmlns:o="urn:schemas-microsoft-com:office:office" xmlns:oel="http://schemas.microsoft.com/office/2019/extlst" xmlns:r="http://schemas.openxmlformats.org/officeDocument/2006/relationships" xmlns:m="http://schemas.openxmlformats.org/officeDocument/2006/math" xmlns:v="urn:schemas-microsoft-com:vml" xmlns:wp14="http://schemas.microsoft.com/office/word/2010/wordprocessingDrawing" xmlns:wp="http://schemas.openxmlformats.org/drawingml/2006/wordprocessingDrawing" xmlns:w10="urn:schemas-microsoft-com:office:word" xmlns:w="http://schemas.openxmlformats.org/wordprocessingml/2006/main" xmlns:w14="http://schemas.microsoft.com/office/word/2010/wordml" xmlns:w15="http://schemas.microsoft.com/office/word/2012/wordml" xmlns:w16cex="http://schemas.microsoft.com/office/word/2018/wordml/cex" xmlns:w16cid="http://schemas.microsoft.com/office/word/2016/wordml/cid" xmlns:w16="http://schemas.microsoft.com/office/word/2018/wordml" xmlns:w16sdtdh="http://schemas.microsoft.com/office/word/2020/wordml/sdtdatahash" xmlns:w16se="http://schemas.microsoft.com/office/word/2015/wordml/symex" xmlns:wpg="http://schemas.microsoft.com/office/word/2010/wordprocessingGroup" xmlns:wpi="http://schemas.microsoft.com/office/word/2010/wordprocessingInk" xmlns:wne="http://schemas.microsoft.com/office/word/2006/wordml" xmlns:wps="http://schemas.microsoft.com/office/word/2010/wordprocessingShape" mc:Ignorable="w14 w15 w16se w16cid w16 w16cex w16sdtdh wp14">
   <w:sdt>
     <w:sdtPr>
       <w:id w:val="1471174885"/>
@@ -12831,7 +12803,7 @@
 </file>
 
 <file path=word/footnotes.xml><?xml version="1.0" encoding="utf-8"?>
-<w:footnotes xmlns:wpc="http://schemas.microsoft.com/office/word/2010/wordprocessingCanvas" xmlns:cx="http://schemas.microsoft.com/office/drawing/2014/chartex" xmlns:cx1="http://schemas.microsoft.com/office/drawing/2015/9/8/chartex" xmlns:cx2="http://schemas.microsoft.com/office/drawing/2015/10/21/chartex" xmlns:cx3="http://schemas.microsoft.com/office/drawing/2016/5/9/chartex" xmlns:cx4="http://schemas.microsoft.com/office/drawing/2016/5/10/chartex" xmlns:cx5="http://schemas.microsoft.com/office/drawing/2016/5/11/chartex" xmlns:cx6="http://schemas.microsoft.com/office/drawing/2016/5/12/chartex" xmlns:cx7="http://schemas.microsoft.com/office/drawing/2016/5/13/chartex" xmlns:cx8="http://schemas.microsoft.com/office/drawing/2016/5/14/chartex" xmlns:mc="http://schemas.openxmlformats.org/markup-compatibility/2006" xmlns:aink="http://schemas.microsoft.com/office/drawing/2016/ink" xmlns:am3d="http://schemas.microsoft.com/office/drawing/2017/model3d" xmlns:o="urn:schemas-microsoft-com:office:office" xmlns:oel="http://schemas.microsoft.com/office/2019/extlst" xmlns:r="http://schemas.openxmlformats.org/officeDocument/2006/relationships" xmlns:m="http://schemas.openxmlformats.org/officeDocument/2006/math" xmlns:v="urn:schemas-microsoft-com:vml" xmlns:wp14="http://schemas.microsoft.com/office/word/2010/wordprocessingDrawing" xmlns:wp="http://schemas.openxmlformats.org/drawingml/2006/wordprocessingDrawing" xmlns:w10="urn:schemas-microsoft-com:office:word" xmlns:w="http://schemas.openxmlformats.org/wordprocessingml/2006/main" xmlns:w14="http://schemas.microsoft.com/office/word/2010/wordml" xmlns:w15="http://schemas.microsoft.com/office/word/2012/wordml" xmlns:w16cex="http://schemas.microsoft.com/office/word/2018/wordml/cex" xmlns:w16cid="http://schemas.microsoft.com/office/word/2016/wordml/cid" xmlns:w16="http://schemas.microsoft.com/office/word/2018/wordml" xmlns:w16du="http://schemas.microsoft.com/office/word/2023/wordml/word16du" xmlns:w16sdtdh="http://schemas.microsoft.com/office/word/2020/wordml/sdtdatahash" xmlns:w16sdtfl="http://schemas.microsoft.com/office/word/2024/wordml/sdtformatlock" xmlns:w16se="http://schemas.microsoft.com/office/word/2015/wordml/symex" xmlns:wpg="http://schemas.microsoft.com/office/word/2010/wordprocessingGroup" xmlns:wpi="http://schemas.microsoft.com/office/word/2010/wordprocessingInk" xmlns:wne="http://schemas.microsoft.com/office/word/2006/wordml" xmlns:wps="http://schemas.microsoft.com/office/word/2010/wordprocessingShape" mc:Ignorable="w14 w15 w16se w16cid w16 w16cex w16sdtdh w16sdtfl w16du wp14">
+<w:footnotes xmlns:wpc="http://schemas.microsoft.com/office/word/2010/wordprocessingCanvas" xmlns:cx="http://schemas.microsoft.com/office/drawing/2014/chartex" xmlns:cx1="http://schemas.microsoft.com/office/drawing/2015/9/8/chartex" xmlns:cx2="http://schemas.microsoft.com/office/drawing/2015/10/21/chartex" xmlns:cx3="http://schemas.microsoft.com/office/drawing/2016/5/9/chartex" xmlns:cx4="http://schemas.microsoft.com/office/drawing/2016/5/10/chartex" xmlns:cx5="http://schemas.microsoft.com/office/drawing/2016/5/11/chartex" xmlns:cx6="http://schemas.microsoft.com/office/drawing/2016/5/12/chartex" xmlns:cx7="http://schemas.microsoft.com/office/drawing/2016/5/13/chartex" xmlns:cx8="http://schemas.microsoft.com/office/drawing/2016/5/14/chartex" xmlns:mc="http://schemas.openxmlformats.org/markup-compatibility/2006" xmlns:aink="http://schemas.microsoft.com/office/drawing/2016/ink" xmlns:am3d="http://schemas.microsoft.com/office/drawing/2017/model3d" xmlns:o="urn:schemas-microsoft-com:office:office" xmlns:oel="http://schemas.microsoft.com/office/2019/extlst" xmlns:r="http://schemas.openxmlformats.org/officeDocument/2006/relationships" xmlns:m="http://schemas.openxmlformats.org/officeDocument/2006/math" xmlns:v="urn:schemas-microsoft-com:vml" xmlns:wp14="http://schemas.microsoft.com/office/word/2010/wordprocessingDrawing" xmlns:wp="http://schemas.openxmlformats.org/drawingml/2006/wordprocessingDrawing" xmlns:w10="urn:schemas-microsoft-com:office:word" xmlns:w="http://schemas.openxmlformats.org/wordprocessingml/2006/main" xmlns:w14="http://schemas.microsoft.com/office/word/2010/wordml" xmlns:w15="http://schemas.microsoft.com/office/word/2012/wordml" xmlns:w16cex="http://schemas.microsoft.com/office/word/2018/wordml/cex" xmlns:w16cid="http://schemas.microsoft.com/office/word/2016/wordml/cid" xmlns:w16="http://schemas.microsoft.com/office/word/2018/wordml" xmlns:w16sdtdh="http://schemas.microsoft.com/office/word/2020/wordml/sdtdatahash" xmlns:w16se="http://schemas.microsoft.com/office/word/2015/wordml/symex" xmlns:wpg="http://schemas.microsoft.com/office/word/2010/wordprocessingGroup" xmlns:wpi="http://schemas.microsoft.com/office/word/2010/wordprocessingInk" xmlns:wne="http://schemas.microsoft.com/office/word/2006/wordml" xmlns:wps="http://schemas.microsoft.com/office/word/2010/wordprocessingShape" mc:Ignorable="w14 w15 w16se w16cid w16 w16cex w16sdtdh wp14">
   <w:footnote w:type="separator" w:id="-1">
     <w:p>
       <w:pPr>
@@ -12856,7 +12828,7 @@
 </file>
 
 <file path=word/numbering.xml><?xml version="1.0" encoding="utf-8"?>
-<w:numbering xmlns:wpc="http://schemas.microsoft.com/office/word/2010/wordprocessingCanvas" xmlns:cx="http://schemas.microsoft.com/office/drawing/2014/chartex" xmlns:cx1="http://schemas.microsoft.com/office/drawing/2015/9/8/chartex" xmlns:cx2="http://schemas.microsoft.com/office/drawing/2015/10/21/chartex" xmlns:cx3="http://schemas.microsoft.com/office/drawing/2016/5/9/chartex" xmlns:cx4="http://schemas.microsoft.com/office/drawing/2016/5/10/chartex" xmlns:cx5="http://schemas.microsoft.com/office/drawing/2016/5/11/chartex" xmlns:cx6="http://schemas.microsoft.com/office/drawing/2016/5/12/chartex" xmlns:cx7="http://schemas.microsoft.com/office/drawing/2016/5/13/chartex" xmlns:cx8="http://schemas.microsoft.com/office/drawing/2016/5/14/chartex" xmlns:mc="http://schemas.openxmlformats.org/markup-compatibility/2006" xmlns:aink="http://schemas.microsoft.com/office/drawing/2016/ink" xmlns:am3d="http://schemas.microsoft.com/office/drawing/2017/model3d" xmlns:o="urn:schemas-microsoft-com:office:office" xmlns:oel="http://schemas.microsoft.com/office/2019/extlst" xmlns:r="http://schemas.openxmlformats.org/officeDocument/2006/relationships" xmlns:m="http://schemas.openxmlformats.org/officeDocument/2006/math" xmlns:v="urn:schemas-microsoft-com:vml" xmlns:wp14="http://schemas.microsoft.com/office/word/2010/wordprocessingDrawing" xmlns:wp="http://schemas.openxmlformats.org/drawingml/2006/wordprocessingDrawing" xmlns:w10="urn:schemas-microsoft-com:office:word" xmlns:w="http://schemas.openxmlformats.org/wordprocessingml/2006/main" xmlns:w14="http://schemas.microsoft.com/office/word/2010/wordml" xmlns:w15="http://schemas.microsoft.com/office/word/2012/wordml" xmlns:w16cex="http://schemas.microsoft.com/office/word/2018/wordml/cex" xmlns:w16cid="http://schemas.microsoft.com/office/word/2016/wordml/cid" xmlns:w16="http://schemas.microsoft.com/office/word/2018/wordml" xmlns:w16du="http://schemas.microsoft.com/office/word/2023/wordml/word16du" xmlns:w16sdtdh="http://schemas.microsoft.com/office/word/2020/wordml/sdtdatahash" xmlns:w16sdtfl="http://schemas.microsoft.com/office/word/2024/wordml/sdtformatlock" xmlns:w16se="http://schemas.microsoft.com/office/word/2015/wordml/symex" xmlns:wpg="http://schemas.microsoft.com/office/word/2010/wordprocessingGroup" xmlns:wpi="http://schemas.microsoft.com/office/word/2010/wordprocessingInk" xmlns:wne="http://schemas.microsoft.com/office/word/2006/wordml" xmlns:wps="http://schemas.microsoft.com/office/word/2010/wordprocessingShape" mc:Ignorable="w14 w15 w16se w16cid w16 w16cex w16sdtdh w16sdtfl w16du wp14">
+<w:numbering xmlns:wpc="http://schemas.microsoft.com/office/word/2010/wordprocessingCanvas" xmlns:cx="http://schemas.microsoft.com/office/drawing/2014/chartex" xmlns:cx1="http://schemas.microsoft.com/office/drawing/2015/9/8/chartex" xmlns:cx2="http://schemas.microsoft.com/office/drawing/2015/10/21/chartex" xmlns:cx3="http://schemas.microsoft.com/office/drawing/2016/5/9/chartex" xmlns:cx4="http://schemas.microsoft.com/office/drawing/2016/5/10/chartex" xmlns:cx5="http://schemas.microsoft.com/office/drawing/2016/5/11/chartex" xmlns:cx6="http://schemas.microsoft.com/office/drawing/2016/5/12/chartex" xmlns:cx7="http://schemas.microsoft.com/office/drawing/2016/5/13/chartex" xmlns:cx8="http://schemas.microsoft.com/office/drawing/2016/5/14/chartex" xmlns:mc="http://schemas.openxmlformats.org/markup-compatibility/2006" xmlns:aink="http://schemas.microsoft.com/office/drawing/2016/ink" xmlns:am3d="http://schemas.microsoft.com/office/drawing/2017/model3d" xmlns:o="urn:schemas-microsoft-com:office:office" xmlns:oel="http://schemas.microsoft.com/office/2019/extlst" xmlns:r="http://schemas.openxmlformats.org/officeDocument/2006/relationships" xmlns:m="http://schemas.openxmlformats.org/officeDocument/2006/math" xmlns:v="urn:schemas-microsoft-com:vml" xmlns:wp14="http://schemas.microsoft.com/office/word/2010/wordprocessingDrawing" xmlns:wp="http://schemas.openxmlformats.org/drawingml/2006/wordprocessingDrawing" xmlns:w10="urn:schemas-microsoft-com:office:word" xmlns:w="http://schemas.openxmlformats.org/wordprocessingml/2006/main" xmlns:w14="http://schemas.microsoft.com/office/word/2010/wordml" xmlns:w15="http://schemas.microsoft.com/office/word/2012/wordml" xmlns:w16cex="http://schemas.microsoft.com/office/word/2018/wordml/cex" xmlns:w16cid="http://schemas.microsoft.com/office/word/2016/wordml/cid" xmlns:w16="http://schemas.microsoft.com/office/word/2018/wordml" xmlns:w16sdtdh="http://schemas.microsoft.com/office/word/2020/wordml/sdtdatahash" xmlns:w16se="http://schemas.microsoft.com/office/word/2015/wordml/symex" xmlns:wpg="http://schemas.microsoft.com/office/word/2010/wordprocessingGroup" xmlns:wpi="http://schemas.microsoft.com/office/word/2010/wordprocessingInk" xmlns:wne="http://schemas.microsoft.com/office/word/2006/wordml" xmlns:wps="http://schemas.microsoft.com/office/word/2010/wordprocessingShape" mc:Ignorable="w14 w15 w16se w16cid w16 w16cex w16sdtdh wp14">
   <w:abstractNum w:abstractNumId="0" w15:restartNumberingAfterBreak="0">
     <w:nsid w:val="05E96921"/>
     <w:multiLevelType w:val="hybridMultilevel"/>
@@ -15197,7 +15169,7 @@
 </file>
 
 <file path=word/styles.xml><?xml version="1.0" encoding="utf-8"?>
-<w:styles xmlns:mc="http://schemas.openxmlformats.org/markup-compatibility/2006" xmlns:r="http://schemas.openxmlformats.org/officeDocument/2006/relationships" xmlns:w="http://schemas.openxmlformats.org/wordprocessingml/2006/main" xmlns:w14="http://schemas.microsoft.com/office/word/2010/wordml" xmlns:w15="http://schemas.microsoft.com/office/word/2012/wordml" xmlns:w16cex="http://schemas.microsoft.com/office/word/2018/wordml/cex" xmlns:w16cid="http://schemas.microsoft.com/office/word/2016/wordml/cid" xmlns:w16="http://schemas.microsoft.com/office/word/2018/wordml" xmlns:w16du="http://schemas.microsoft.com/office/word/2023/wordml/word16du" xmlns:w16sdtdh="http://schemas.microsoft.com/office/word/2020/wordml/sdtdatahash" xmlns:w16sdtfl="http://schemas.microsoft.com/office/word/2024/wordml/sdtformatlock" xmlns:w16se="http://schemas.microsoft.com/office/word/2015/wordml/symex" mc:Ignorable="w14 w15 w16se w16cid w16 w16cex w16sdtdh w16sdtfl w16du">
+<w:styles xmlns:mc="http://schemas.openxmlformats.org/markup-compatibility/2006" xmlns:r="http://schemas.openxmlformats.org/officeDocument/2006/relationships" xmlns:w="http://schemas.openxmlformats.org/wordprocessingml/2006/main" xmlns:w14="http://schemas.microsoft.com/office/word/2010/wordml" xmlns:w15="http://schemas.microsoft.com/office/word/2012/wordml" xmlns:w16cex="http://schemas.microsoft.com/office/word/2018/wordml/cex" xmlns:w16cid="http://schemas.microsoft.com/office/word/2016/wordml/cid" xmlns:w16="http://schemas.microsoft.com/office/word/2018/wordml" xmlns:w16sdtdh="http://schemas.microsoft.com/office/word/2020/wordml/sdtdatahash" xmlns:w16se="http://schemas.microsoft.com/office/word/2015/wordml/symex" mc:Ignorable="w14 w15 w16se w16cid w16 w16cex w16sdtdh">
   <w:docDefaults>
     <w:rPrDefault>
       <w:rPr>

</xml_diff>

<commit_message>
update : 진척관리 #6
</commit_message>
<xml_diff>
--- a/진척 관리.docx
+++ b/진척 관리.docx
@@ -2068,7 +2068,6 @@
                 <w:szCs w:val="20"/>
               </w:rPr>
             </w:pPr>
-            <w:proofErr w:type="spellStart"/>
             <w:r>
               <w:rPr>
                 <w:rFonts w:hint="eastAsia"/>
@@ -2077,7 +2076,6 @@
               </w:rPr>
               <w:t>유영빈</w:t>
             </w:r>
-            <w:proofErr w:type="spellEnd"/>
           </w:p>
         </w:tc>
       </w:tr>
@@ -2199,7 +2197,6 @@
                 <w:szCs w:val="20"/>
               </w:rPr>
             </w:pPr>
-            <w:proofErr w:type="spellStart"/>
             <w:r>
               <w:rPr>
                 <w:rFonts w:hint="eastAsia"/>
@@ -2208,7 +2205,6 @@
               </w:rPr>
               <w:t>유영빈</w:t>
             </w:r>
-            <w:proofErr w:type="spellEnd"/>
           </w:p>
         </w:tc>
       </w:tr>
@@ -2550,23 +2546,13 @@
                 <w:szCs w:val="20"/>
               </w:rPr>
             </w:pPr>
-            <w:proofErr w:type="spellStart"/>
-            <w:r>
-              <w:rPr>
-                <w:rFonts w:hint="eastAsia"/>
-                <w:sz w:val="20"/>
-                <w:szCs w:val="20"/>
-              </w:rPr>
-              <w:t>유영빈</w:t>
-            </w:r>
-            <w:proofErr w:type="spellEnd"/>
-            <w:r>
-              <w:rPr>
-                <w:rFonts w:hint="eastAsia"/>
-                <w:sz w:val="20"/>
-                <w:szCs w:val="20"/>
-              </w:rPr>
-              <w:t>, 양현서</w:t>
+            <w:r>
+              <w:rPr>
+                <w:rFonts w:hint="eastAsia"/>
+                <w:sz w:val="20"/>
+                <w:szCs w:val="20"/>
+              </w:rPr>
+              <w:t>유영빈, 양현서</w:t>
             </w:r>
           </w:p>
         </w:tc>
@@ -2887,7 +2873,6 @@
                 <w:szCs w:val="20"/>
               </w:rPr>
             </w:pPr>
-            <w:proofErr w:type="spellStart"/>
             <w:r>
               <w:rPr>
                 <w:rFonts w:hint="eastAsia"/>
@@ -2896,7 +2881,6 @@
               </w:rPr>
               <w:t>유영빈</w:t>
             </w:r>
-            <w:proofErr w:type="spellEnd"/>
           </w:p>
         </w:tc>
       </w:tr>
@@ -2981,7 +2965,6 @@
                 <w:szCs w:val="20"/>
               </w:rPr>
             </w:pPr>
-            <w:proofErr w:type="spellStart"/>
             <w:r>
               <w:rPr>
                 <w:rFonts w:hint="eastAsia"/>
@@ -2990,7 +2973,6 @@
               </w:rPr>
               <w:t>유영빈</w:t>
             </w:r>
-            <w:proofErr w:type="spellEnd"/>
           </w:p>
         </w:tc>
       </w:tr>
@@ -3115,18 +3097,8 @@
                 <w:sz w:val="20"/>
                 <w:szCs w:val="20"/>
               </w:rPr>
-              <w:t xml:space="preserve">양현서, </w:t>
-            </w:r>
-            <w:proofErr w:type="spellStart"/>
-            <w:r>
-              <w:rPr>
-                <w:rFonts w:hint="eastAsia"/>
-                <w:sz w:val="20"/>
-                <w:szCs w:val="20"/>
-              </w:rPr>
-              <w:t>유영빈</w:t>
-            </w:r>
-            <w:proofErr w:type="spellEnd"/>
+              <w:t>양현서, 유영빈</w:t>
+            </w:r>
           </w:p>
         </w:tc>
       </w:tr>
@@ -6314,14 +6286,12 @@
         <w:autoSpaceDE/>
         <w:autoSpaceDN/>
       </w:pPr>
-      <w:proofErr w:type="spellStart"/>
       <w:r>
         <w:rPr>
           <w:rFonts w:hint="eastAsia"/>
         </w:rPr>
         <w:t>유영빈</w:t>
       </w:r>
-      <w:proofErr w:type="spellEnd"/>
     </w:p>
     <w:tbl>
       <w:tblPr>
@@ -6331,12 +6301,12 @@
         <w:tblLook w:val="04A0" w:firstRow="1" w:lastRow="0" w:firstColumn="1" w:lastColumn="0" w:noHBand="0" w:noVBand="1"/>
       </w:tblPr>
       <w:tblGrid>
-        <w:gridCol w:w="1477"/>
+        <w:gridCol w:w="1400"/>
         <w:gridCol w:w="1757"/>
-        <w:gridCol w:w="1338"/>
-        <w:gridCol w:w="1453"/>
+        <w:gridCol w:w="1571"/>
+        <w:gridCol w:w="1370"/>
         <w:gridCol w:w="2863"/>
-        <w:gridCol w:w="1484"/>
+        <w:gridCol w:w="1411"/>
         <w:gridCol w:w="544"/>
       </w:tblGrid>
       <w:tr>
@@ -7859,13 +7829,15 @@
               <w:autoSpaceDE/>
               <w:autoSpaceDN/>
               <w:rPr>
-                <w:sz w:val="16"/>
-                <w:szCs w:val="16"/>
-              </w:rPr>
-            </w:pPr>
-            <w:r>
-              <w:rPr>
-                <w:rFonts w:hint="eastAsia"/>
+                <w:strike/>
+                <w:sz w:val="16"/>
+                <w:szCs w:val="16"/>
+              </w:rPr>
+            </w:pPr>
+            <w:r>
+              <w:rPr>
+                <w:rFonts w:hint="eastAsia"/>
+                <w:strike/>
                 <w:sz w:val="16"/>
                 <w:szCs w:val="16"/>
               </w:rPr>
@@ -7875,6 +7847,7 @@
             <w:r>
               <w:rPr>
                 <w:rFonts w:hint="eastAsia"/>
+                <w:strike/>
                 <w:sz w:val="16"/>
                 <w:szCs w:val="16"/>
               </w:rPr>
@@ -7884,6 +7857,7 @@
             <w:r>
               <w:rPr>
                 <w:rFonts w:hint="eastAsia"/>
+                <w:strike/>
                 <w:sz w:val="16"/>
                 <w:szCs w:val="16"/>
               </w:rPr>
@@ -7922,6 +7896,7 @@
               <w:autoSpaceDE/>
               <w:autoSpaceDN/>
               <w:rPr>
+                <w:strike/>
                 <w:sz w:val="16"/>
                 <w:szCs w:val="16"/>
               </w:rPr>
@@ -7931,6 +7906,7 @@
             <w:r>
               <w:rPr>
                 <w:rFonts w:eastAsiaTheme="minorHAnsi"/>
+                <w:strike/>
                 <w:sz w:val="16"/>
                 <w:szCs w:val="16"/>
               </w:rPr>
@@ -7940,6 +7916,7 @@
             <w:r>
               <w:rPr>
                 <w:rFonts w:eastAsiaTheme="minorHAnsi"/>
+                <w:strike/>
                 <w:sz w:val="16"/>
                 <w:szCs w:val="16"/>
               </w:rPr>
@@ -7949,6 +7926,7 @@
             <w:r>
               <w:rPr>
                 <w:rFonts w:eastAsiaTheme="minorHAnsi"/>
+                <w:strike/>
                 <w:sz w:val="16"/>
                 <w:szCs w:val="16"/>
               </w:rPr>
@@ -7999,10 +7977,193 @@
               <w:autoSpaceDE/>
               <w:autoSpaceDN/>
               <w:rPr>
-                <w:sz w:val="16"/>
-                <w:szCs w:val="16"/>
-              </w:rPr>
-            </w:pPr>
+                <w:rFonts w:eastAsiaTheme="minorHAnsi" w:hint="eastAsia"/>
+                <w:b/>
+                <w:bCs/>
+                <w:sz w:val="16"/>
+                <w:szCs w:val="16"/>
+              </w:rPr>
+            </w:pPr>
+            <w:proofErr w:type="spellStart"/>
+            <w:r>
+              <w:rPr>
+                <w:rFonts w:eastAsiaTheme="minorHAnsi"/>
+                <w:b/>
+                <w:bCs/>
+                <w:sz w:val="16"/>
+                <w:szCs w:val="16"/>
+              </w:rPr>
+              <w:t>CollisionCheck</w:t>
+            </w:r>
+            <w:proofErr w:type="spellEnd"/>
+            <w:r>
+              <w:rPr>
+                <w:rFonts w:eastAsiaTheme="minorHAnsi" w:hint="eastAsia"/>
+                <w:b/>
+                <w:bCs/>
+                <w:sz w:val="16"/>
+                <w:szCs w:val="16"/>
+              </w:rPr>
+              <w:t>()</w:t>
+            </w:r>
+            <w:r>
+              <w:rPr>
+                <w:rFonts w:eastAsiaTheme="minorHAnsi" w:hint="eastAsia"/>
+                <w:b/>
+                <w:bCs/>
+                <w:sz w:val="16"/>
+                <w:szCs w:val="16"/>
+              </w:rPr>
+              <w:t xml:space="preserve"> </w:t>
+            </w:r>
+            <w:r>
+              <w:rPr>
+                <w:rFonts w:eastAsiaTheme="minorHAnsi"/>
+                <w:b/>
+                <w:bCs/>
+                <w:sz w:val="16"/>
+                <w:szCs w:val="16"/>
+              </w:rPr>
+              <w:br/>
+            </w:r>
+            <w:r>
+              <w:rPr>
+                <w:rFonts w:eastAsiaTheme="minorHAnsi" w:hint="eastAsia"/>
+                <w:b/>
+                <w:bCs/>
+                <w:sz w:val="16"/>
+                <w:szCs w:val="16"/>
+              </w:rPr>
+              <w:t xml:space="preserve">(일단 </w:t>
+            </w:r>
+            <w:proofErr w:type="spellStart"/>
+            <w:r>
+              <w:rPr>
+                <w:rFonts w:eastAsiaTheme="minorHAnsi" w:hint="eastAsia"/>
+                <w:b/>
+                <w:bCs/>
+                <w:sz w:val="16"/>
+                <w:szCs w:val="16"/>
+              </w:rPr>
+              <w:t>못움직이도록</w:t>
+            </w:r>
+            <w:proofErr w:type="spellEnd"/>
+            <w:r>
+              <w:rPr>
+                <w:rFonts w:eastAsiaTheme="minorHAnsi" w:hint="eastAsia"/>
+                <w:b/>
+                <w:bCs/>
+                <w:sz w:val="16"/>
+                <w:szCs w:val="16"/>
+              </w:rPr>
+              <w:t xml:space="preserve"> </w:t>
+            </w:r>
+            <w:proofErr w:type="spellStart"/>
+            <w:r>
+              <w:rPr>
+                <w:rFonts w:eastAsiaTheme="minorHAnsi" w:hint="eastAsia"/>
+                <w:b/>
+                <w:bCs/>
+                <w:sz w:val="16"/>
+                <w:szCs w:val="16"/>
+              </w:rPr>
+              <w:t>만듬</w:t>
+            </w:r>
+            <w:proofErr w:type="spellEnd"/>
+            <w:r>
+              <w:rPr>
+                <w:rFonts w:eastAsiaTheme="minorHAnsi" w:hint="eastAsia"/>
+                <w:b/>
+                <w:bCs/>
+                <w:sz w:val="16"/>
+                <w:szCs w:val="16"/>
+              </w:rPr>
+              <w:t>)</w:t>
+            </w:r>
+          </w:p>
+          <w:p>
+            <w:pPr>
+              <w:widowControl/>
+              <w:wordWrap/>
+              <w:autoSpaceDE/>
+              <w:autoSpaceDN/>
+              <w:rPr>
+                <w:rFonts w:eastAsiaTheme="minorHAnsi"/>
+                <w:b/>
+                <w:bCs/>
+                <w:sz w:val="16"/>
+                <w:szCs w:val="16"/>
+              </w:rPr>
+            </w:pPr>
+          </w:p>
+          <w:p>
+            <w:pPr>
+              <w:widowControl/>
+              <w:wordWrap/>
+              <w:autoSpaceDE/>
+              <w:autoSpaceDN/>
+              <w:rPr>
+                <w:rFonts w:eastAsiaTheme="minorHAnsi" w:hint="eastAsia"/>
+                <w:b/>
+                <w:bCs/>
+                <w:sz w:val="16"/>
+                <w:szCs w:val="16"/>
+              </w:rPr>
+            </w:pPr>
+            <w:r>
+              <w:rPr>
+                <w:rFonts w:eastAsiaTheme="minorHAnsi" w:hint="eastAsia"/>
+                <w:b/>
+                <w:bCs/>
+                <w:sz w:val="16"/>
+                <w:szCs w:val="16"/>
+              </w:rPr>
+              <w:t xml:space="preserve">서버에서 </w:t>
+            </w:r>
+            <w:proofErr w:type="spellStart"/>
+            <w:r>
+              <w:rPr>
+                <w:rFonts w:eastAsiaTheme="minorHAnsi" w:hint="eastAsia"/>
+                <w:b/>
+                <w:bCs/>
+                <w:sz w:val="16"/>
+                <w:szCs w:val="16"/>
+              </w:rPr>
+              <w:t>xyz</w:t>
+            </w:r>
+            <w:proofErr w:type="spellEnd"/>
+            <w:r>
+              <w:rPr>
+                <w:rFonts w:eastAsiaTheme="minorHAnsi" w:hint="eastAsia"/>
+                <w:b/>
+                <w:bCs/>
+                <w:sz w:val="16"/>
+                <w:szCs w:val="16"/>
+              </w:rPr>
+              <w:t xml:space="preserve">를 사용해서 움직임 처리하고, </w:t>
+            </w:r>
+            <w:proofErr w:type="spellStart"/>
+            <w:r>
+              <w:rPr>
+                <w:rFonts w:eastAsiaTheme="minorHAnsi" w:hint="eastAsia"/>
+                <w:b/>
+                <w:bCs/>
+                <w:sz w:val="16"/>
+                <w:szCs w:val="16"/>
+              </w:rPr>
+              <w:t>클라에</w:t>
+            </w:r>
+            <w:proofErr w:type="spellEnd"/>
+            <w:r>
+              <w:rPr>
+                <w:rFonts w:eastAsiaTheme="minorHAnsi" w:hint="eastAsia"/>
+                <w:b/>
+                <w:bCs/>
+                <w:sz w:val="16"/>
+                <w:szCs w:val="16"/>
+              </w:rPr>
+              <w:t xml:space="preserve"> 전송해서 렌더링하도록 코드 수정</w:t>
+            </w:r>
           </w:p>
         </w:tc>
         <w:tc>
@@ -9161,6 +9322,7 @@
         <w:autoSpaceDN/>
       </w:pPr>
       <w:r>
+        <w:lastRenderedPageBreak/>
         <w:br w:type="page"/>
       </w:r>
     </w:p>
@@ -11277,17 +11439,7 @@
                 <w:sz w:val="16"/>
                 <w:szCs w:val="16"/>
               </w:rPr>
-              <w:t>구현</w:t>
-            </w:r>
-            <w:r>
-              <w:rPr>
-                <w:rFonts w:hint="eastAsia"/>
-                <w:b/>
-                <w:bCs/>
-                <w:sz w:val="16"/>
-                <w:szCs w:val="16"/>
-              </w:rPr>
-              <w:t>시작.</w:t>
+              <w:t>구현시작.</w:t>
             </w:r>
           </w:p>
           <w:p>
@@ -11331,7 +11483,6 @@
               <w:wordWrap/>
               <w:autoSpaceDE/>
               <w:rPr>
-                <w:rFonts w:hint="eastAsia"/>
                 <w:b/>
                 <w:bCs/>
                 <w:sz w:val="16"/>
@@ -11577,7 +11728,6 @@
               <w:wordWrap/>
               <w:autoSpaceDE/>
               <w:rPr>
-                <w:rFonts w:hint="eastAsia"/>
                 <w:sz w:val="16"/>
                 <w:szCs w:val="16"/>
               </w:rPr>

</xml_diff>